<commit_message>
worked on signing in
tried to get google oauth sign in and guest browsing working but having some issues
</commit_message>
<xml_diff>
--- a/COMP3000 Final Document.docx
+++ b/COMP3000 Final Document.docx
@@ -1374,25 +1374,7 @@
                 <w:iCs/>
                 <w:noProof/>
               </w:rPr>
-              <w:t>Use C</w:t>
-            </w:r>
-            <w:r>
-              <w:rPr>
-                <w:rStyle w:val="Hyperlink"/>
-                <w:i/>
-                <w:iCs/>
-                <w:noProof/>
-              </w:rPr>
-              <w:t>a</w:t>
-            </w:r>
-            <w:r>
-              <w:rPr>
-                <w:rStyle w:val="Hyperlink"/>
-                <w:i/>
-                <w:iCs/>
-                <w:noProof/>
-              </w:rPr>
-              <w:t>ses</w:t>
+              <w:t>Use Cases</w:t>
             </w:r>
             <w:r>
               <w:rPr>
@@ -2011,11 +1993,9 @@
       <w:r>
         <w:t xml:space="preserve"> This will be a central place that users can navigate to which will store data to determine how secure their browsing habits have been. It will include things like how many times they have overridden blocks, how many times they have attempted to visit blocked sites etc. The dashboard will also be the location of where they can customise the browser, and where they will see how many experience </w:t>
       </w:r>
-      <w:proofErr w:type="gramStart"/>
       <w:r>
         <w:t>points</w:t>
       </w:r>
-      <w:proofErr w:type="gramEnd"/>
       <w:r>
         <w:t xml:space="preserve"> they have and what level they are. Lastly, this will be where the quizzes and potential games are stored to allow them to gain bonus points for learning about safe browsing</w:t>
       </w:r>
@@ -2886,15 +2866,7 @@
         <w:t xml:space="preserve">At minimum, I want to have all elements of this taskbar implemented and able to perform their tasks. As a stretch task, </w:t>
       </w:r>
       <w:r>
-        <w:t xml:space="preserve">I want to aim to have all elements of the taskbar be customisable for each user, such as changing the colour, font and size of the taskbar, as well as repositioning each element of the taskbar. The design of the buttons </w:t>
-      </w:r>
-      <w:proofErr w:type="gramStart"/>
-      <w:r>
-        <w:t>are</w:t>
-      </w:r>
-      <w:proofErr w:type="gramEnd"/>
-      <w:r>
-        <w:t xml:space="preserve"> open to change in the final implementation.</w:t>
+        <w:t>I want to aim to have all elements of the taskbar be customisable for each user, such as changing the colour, font and size of the taskbar, as well as repositioning each element of the taskbar. The design of the buttons are open to change in the final implementation.</w:t>
       </w:r>
     </w:p>
     <w:p/>
@@ -3179,6 +3151,18 @@
       </w:r>
       <w:bookmarkEnd w:id="17"/>
     </w:p>
+    <w:p>
+      <w:pPr>
+        <w:pStyle w:val="ListParagraph"/>
+        <w:numPr>
+          <w:ilvl w:val="0"/>
+          <w:numId w:val="1"/>
+        </w:numPr>
+      </w:pPr>
+      <w:r>
+        <w:t>User wants to sign into an account</w:t>
+      </w:r>
+    </w:p>
     <w:p/>
     <w:p>
       <w:pPr>
@@ -3579,6 +3563,7 @@
         </w:numPr>
       </w:pPr>
       <w:r>
+        <w:lastRenderedPageBreak/>
         <w:t>Quiz questions + answers (daily / weekly)</w:t>
       </w:r>
     </w:p>
@@ -3591,10 +3576,161 @@
         </w:numPr>
       </w:pPr>
       <w:r>
-        <w:lastRenderedPageBreak/>
         <w:t>Challenges</w:t>
       </w:r>
       <w:bookmarkEnd w:id="20"/>
+    </w:p>
+    <w:p/>
+    <w:p>
+      <w:pPr>
+        <w:pStyle w:val="Heading1"/>
+        <w:jc w:val="center"/>
+        <w:rPr>
+          <w:b/>
+          <w:bCs/>
+          <w:i/>
+          <w:iCs/>
+          <w:sz w:val="32"/>
+          <w:szCs w:val="32"/>
+        </w:rPr>
+      </w:pPr>
+      <w:r>
+        <w:rPr>
+          <w:b/>
+          <w:bCs/>
+          <w:i/>
+          <w:iCs/>
+          <w:sz w:val="32"/>
+          <w:szCs w:val="32"/>
+        </w:rPr>
+        <w:t>Parental Controls</w:t>
+      </w:r>
+    </w:p>
+    <w:p>
+      <w:pPr>
+        <w:pStyle w:val="ListParagraph"/>
+        <w:numPr>
+          <w:ilvl w:val="0"/>
+          <w:numId w:val="1"/>
+        </w:numPr>
+      </w:pPr>
+      <w:r>
+        <w:t>Considered allowing user to input date of birth on first sign in then asking for another user sign in (parent) if under 13</w:t>
+      </w:r>
+    </w:p>
+    <w:p>
+      <w:pPr>
+        <w:pStyle w:val="ListParagraph"/>
+        <w:numPr>
+          <w:ilvl w:val="2"/>
+          <w:numId w:val="1"/>
+        </w:numPr>
+      </w:pPr>
+      <w:r>
+        <w:t>Child could lie about their date of birth to not need a parent login</w:t>
+      </w:r>
+    </w:p>
+    <w:p>
+      <w:pPr>
+        <w:pStyle w:val="ListParagraph"/>
+        <w:numPr>
+          <w:ilvl w:val="2"/>
+          <w:numId w:val="1"/>
+        </w:numPr>
+      </w:pPr>
+      <w:r>
+        <w:t>Child could sign in with a separate google account they own to act as a parent without an actual parent signing in</w:t>
+      </w:r>
+    </w:p>
+    <w:p>
+      <w:pPr>
+        <w:pStyle w:val="ListParagraph"/>
+        <w:numPr>
+          <w:ilvl w:val="2"/>
+          <w:numId w:val="1"/>
+        </w:numPr>
+      </w:pPr>
+      <w:r>
+        <w:t>Requires linking 2 google accounts sign in states which makes problems in firebase</w:t>
+      </w:r>
+    </w:p>
+    <w:p>
+      <w:pPr>
+        <w:pStyle w:val="ListParagraph"/>
+        <w:numPr>
+          <w:ilvl w:val="0"/>
+          <w:numId w:val="1"/>
+        </w:numPr>
+      </w:pPr>
+      <w:r>
+        <w:t>Workaround is to add a button in the settings menu to ‘add a pin’ which is then asked for whenever a setting that affects security needs to be changed</w:t>
+      </w:r>
+    </w:p>
+    <w:p>
+      <w:pPr>
+        <w:pStyle w:val="ListParagraph"/>
+        <w:numPr>
+          <w:ilvl w:val="2"/>
+          <w:numId w:val="1"/>
+        </w:numPr>
+      </w:pPr>
+      <w:r>
+        <w:t>I.e. user tries to change the ability to allow HTTP – this asks for a pin if one is set up (ignores if no pin is set)</w:t>
+      </w:r>
+    </w:p>
+    <w:p>
+      <w:pPr>
+        <w:pStyle w:val="ListParagraph"/>
+        <w:numPr>
+          <w:ilvl w:val="2"/>
+          <w:numId w:val="1"/>
+        </w:numPr>
+      </w:pPr>
+      <w:r>
+        <w:t>Since main use will be parents setting up for their kids having it as part of the setup process ensures that a pin will be set</w:t>
+      </w:r>
+    </w:p>
+    <w:p>
+      <w:pPr>
+        <w:pStyle w:val="ListParagraph"/>
+        <w:numPr>
+          <w:ilvl w:val="0"/>
+          <w:numId w:val="1"/>
+        </w:numPr>
+      </w:pPr>
+      <w:r>
+        <w:t xml:space="preserve"> Require pin to be 6-digit and is only set when forced if signed into an account and user actively enables pin on start up</w:t>
+      </w:r>
+    </w:p>
+    <w:p>
+      <w:pPr>
+        <w:pStyle w:val="ListParagraph"/>
+        <w:numPr>
+          <w:ilvl w:val="0"/>
+          <w:numId w:val="1"/>
+        </w:numPr>
+      </w:pPr>
+      <w:r>
+        <w:t>Use firebase persistence mode to make sure the child cannot simply close the browser to bypass pin</w:t>
+      </w:r>
+    </w:p>
+    <w:p/>
+    <w:p>
+      <w:r>
+        <w:t>First Start Up</w:t>
+      </w:r>
+    </w:p>
+    <w:p>
+      <w:pPr>
+        <w:pStyle w:val="ListParagraph"/>
+        <w:numPr>
+          <w:ilvl w:val="0"/>
+          <w:numId w:val="1"/>
+        </w:numPr>
+      </w:pPr>
+      <w:r>
+        <w:t>When first starting the browser, it should ask the user to sign into a google account, or browse as guest – this allows private browsing</w:t>
+      </w:r>
     </w:p>
     <w:sectPr>
       <w:pgSz w:w="11906" w:h="16838"/>

</xml_diff>

<commit_message>
TLS validation and doc changes
urls are now checked for a valid tls certificate, where if they don't have one this instantly blocks access to the website. 10 use cases have also been created in the documentation
</commit_message>
<xml_diff>
--- a/COMP3000 Final Document.docx
+++ b/COMP3000 Final Document.docx
@@ -1,6 +1,6 @@
 
 <file path=word/document.xml><?xml version="1.0" encoding="utf-8"?>
-<w:document xmlns:wpc="http://schemas.microsoft.com/office/word/2010/wordprocessingCanvas" xmlns:cx="http://schemas.microsoft.com/office/drawing/2014/chartex" xmlns:cx1="http://schemas.microsoft.com/office/drawing/2015/9/8/chartex" xmlns:cx2="http://schemas.microsoft.com/office/drawing/2015/10/21/chartex" xmlns:cx3="http://schemas.microsoft.com/office/drawing/2016/5/9/chartex" xmlns:cx4="http://schemas.microsoft.com/office/drawing/2016/5/10/chartex" xmlns:cx5="http://schemas.microsoft.com/office/drawing/2016/5/11/chartex" xmlns:cx6="http://schemas.microsoft.com/office/drawing/2016/5/12/chartex" xmlns:cx7="http://schemas.microsoft.com/office/drawing/2016/5/13/chartex" xmlns:cx8="http://schemas.microsoft.com/office/drawing/2016/5/14/chartex" xmlns:mc="http://schemas.openxmlformats.org/markup-compatibility/2006" xmlns:aink="http://schemas.microsoft.com/office/drawing/2016/ink" xmlns:am3d="http://schemas.microsoft.com/office/drawing/2017/model3d" xmlns:o="urn:schemas-microsoft-com:office:office" xmlns:r="http://schemas.openxmlformats.org/officeDocument/2006/relationships" xmlns:m="http://schemas.openxmlformats.org/officeDocument/2006/math" xmlns:v="urn:schemas-microsoft-com:vml" xmlns:wp14="http://schemas.microsoft.com/office/word/2010/wordprocessingDrawing" xmlns:wp="http://schemas.openxmlformats.org/drawingml/2006/wordprocessingDrawing" xmlns:w10="urn:schemas-microsoft-com:office:word" xmlns:w="http://schemas.openxmlformats.org/wordprocessingml/2006/main" xmlns:w14="http://schemas.microsoft.com/office/word/2010/wordml" xmlns:w15="http://schemas.microsoft.com/office/word/2012/wordml" xmlns:w16cid="http://schemas.microsoft.com/office/word/2016/wordml/cid" xmlns:w16se="http://schemas.microsoft.com/office/word/2015/wordml/symex" xmlns:wpg="http://schemas.microsoft.com/office/word/2010/wordprocessingGroup" xmlns:wpi="http://schemas.microsoft.com/office/word/2010/wordprocessingInk" xmlns:wne="http://schemas.microsoft.com/office/word/2006/wordml" xmlns:wps="http://schemas.microsoft.com/office/word/2010/wordprocessingShape" mc:Ignorable="w14 w15 w16se w16cid wp14">
+<w:document xmlns:wpc="http://schemas.microsoft.com/office/word/2010/wordprocessingCanvas" xmlns:cx="http://schemas.microsoft.com/office/drawing/2014/chartex" xmlns:cx1="http://schemas.microsoft.com/office/drawing/2015/9/8/chartex" xmlns:cx2="http://schemas.microsoft.com/office/drawing/2015/10/21/chartex" xmlns:cx3="http://schemas.microsoft.com/office/drawing/2016/5/9/chartex" xmlns:cx4="http://schemas.microsoft.com/office/drawing/2016/5/10/chartex" xmlns:cx5="http://schemas.microsoft.com/office/drawing/2016/5/11/chartex" xmlns:cx6="http://schemas.microsoft.com/office/drawing/2016/5/12/chartex" xmlns:cx7="http://schemas.microsoft.com/office/drawing/2016/5/13/chartex" xmlns:cx8="http://schemas.microsoft.com/office/drawing/2016/5/14/chartex" xmlns:mc="http://schemas.openxmlformats.org/markup-compatibility/2006" xmlns:aink="http://schemas.microsoft.com/office/drawing/2016/ink" xmlns:am3d="http://schemas.microsoft.com/office/drawing/2017/model3d" xmlns:o="urn:schemas-microsoft-com:office:office" xmlns:oel="http://schemas.microsoft.com/office/2019/extlst" xmlns:r="http://schemas.openxmlformats.org/officeDocument/2006/relationships" xmlns:m="http://schemas.openxmlformats.org/officeDocument/2006/math" xmlns:v="urn:schemas-microsoft-com:vml" xmlns:wp14="http://schemas.microsoft.com/office/word/2010/wordprocessingDrawing" xmlns:wp="http://schemas.openxmlformats.org/drawingml/2006/wordprocessingDrawing" xmlns:w10="urn:schemas-microsoft-com:office:word" xmlns:w="http://schemas.openxmlformats.org/wordprocessingml/2006/main" xmlns:w14="http://schemas.microsoft.com/office/word/2010/wordml" xmlns:w15="http://schemas.microsoft.com/office/word/2012/wordml" xmlns:w16cex="http://schemas.microsoft.com/office/word/2018/wordml/cex" xmlns:w16cid="http://schemas.microsoft.com/office/word/2016/wordml/cid" xmlns:w16="http://schemas.microsoft.com/office/word/2018/wordml" xmlns:w16du="http://schemas.microsoft.com/office/word/2023/wordml/word16du" xmlns:w16sdtdh="http://schemas.microsoft.com/office/word/2020/wordml/sdtdatahash" xmlns:w16sdtfl="http://schemas.microsoft.com/office/word/2024/wordml/sdtformatlock" xmlns:w16se="http://schemas.microsoft.com/office/word/2015/wordml/symex" xmlns:wpg="http://schemas.microsoft.com/office/word/2010/wordprocessingGroup" xmlns:wpi="http://schemas.microsoft.com/office/word/2010/wordprocessingInk" xmlns:wne="http://schemas.microsoft.com/office/word/2006/wordml" xmlns:wps="http://schemas.microsoft.com/office/word/2010/wordprocessingShape" mc:Ignorable="w14 w15 w16se w16cid w16 w16cex w16sdtdh w16sdtfl w16du wp14">
   <w:body>
     <w:p>
       <w:pPr>
@@ -86,7 +86,7 @@
             </w:rPr>
             <w:fldChar w:fldCharType="separate"/>
           </w:r>
-          <w:hyperlink w:anchor="_Toc222737329" w:history="1">
+          <w:hyperlink w:anchor="_Toc224672335" w:history="1">
             <w:r>
               <w:rPr>
                 <w:rStyle w:val="Hyperlink"/>
@@ -113,7 +113,7 @@
                 <w:noProof/>
                 <w:webHidden/>
               </w:rPr>
-              <w:instrText xml:space="preserve"> PAGEREF _Toc222737329 \h </w:instrText>
+              <w:instrText xml:space="preserve"> PAGEREF _Toc224672335 \h </w:instrText>
             </w:r>
             <w:r>
               <w:rPr>
@@ -160,7 +160,7 @@
               <w:lang w:eastAsia="en-GB"/>
             </w:rPr>
           </w:pPr>
-          <w:hyperlink w:anchor="_Toc222737330" w:history="1">
+          <w:hyperlink w:anchor="_Toc224672336" w:history="1">
             <w:r>
               <w:rPr>
                 <w:rStyle w:val="Hyperlink"/>
@@ -187,7 +187,7 @@
                 <w:noProof/>
                 <w:webHidden/>
               </w:rPr>
-              <w:instrText xml:space="preserve"> PAGEREF _Toc222737330 \h </w:instrText>
+              <w:instrText xml:space="preserve"> PAGEREF _Toc224672336 \h </w:instrText>
             </w:r>
             <w:r>
               <w:rPr>
@@ -234,7 +234,7 @@
               <w:lang w:eastAsia="en-GB"/>
             </w:rPr>
           </w:pPr>
-          <w:hyperlink w:anchor="_Toc222737331" w:history="1">
+          <w:hyperlink w:anchor="_Toc224672337" w:history="1">
             <w:r>
               <w:rPr>
                 <w:rStyle w:val="Hyperlink"/>
@@ -261,7 +261,7 @@
                 <w:noProof/>
                 <w:webHidden/>
               </w:rPr>
-              <w:instrText xml:space="preserve"> PAGEREF _Toc222737331 \h </w:instrText>
+              <w:instrText xml:space="preserve"> PAGEREF _Toc224672337 \h </w:instrText>
             </w:r>
             <w:r>
               <w:rPr>
@@ -308,7 +308,7 @@
               <w:lang w:eastAsia="en-GB"/>
             </w:rPr>
           </w:pPr>
-          <w:hyperlink w:anchor="_Toc222737332" w:history="1">
+          <w:hyperlink w:anchor="_Toc224672338" w:history="1">
             <w:r>
               <w:rPr>
                 <w:rStyle w:val="Hyperlink"/>
@@ -335,7 +335,7 @@
                 <w:noProof/>
                 <w:webHidden/>
               </w:rPr>
-              <w:instrText xml:space="preserve"> PAGEREF _Toc222737332 \h </w:instrText>
+              <w:instrText xml:space="preserve"> PAGEREF _Toc224672338 \h </w:instrText>
             </w:r>
             <w:r>
               <w:rPr>
@@ -382,7 +382,7 @@
               <w:lang w:eastAsia="en-GB"/>
             </w:rPr>
           </w:pPr>
-          <w:hyperlink w:anchor="_Toc222737333" w:history="1">
+          <w:hyperlink w:anchor="_Toc224672339" w:history="1">
             <w:r>
               <w:rPr>
                 <w:rStyle w:val="Hyperlink"/>
@@ -409,7 +409,7 @@
                 <w:noProof/>
                 <w:webHidden/>
               </w:rPr>
-              <w:instrText xml:space="preserve"> PAGEREF _Toc222737333 \h </w:instrText>
+              <w:instrText xml:space="preserve"> PAGEREF _Toc224672339 \h </w:instrText>
             </w:r>
             <w:r>
               <w:rPr>
@@ -456,7 +456,7 @@
               <w:lang w:eastAsia="en-GB"/>
             </w:rPr>
           </w:pPr>
-          <w:hyperlink w:anchor="_Toc222737334" w:history="1">
+          <w:hyperlink w:anchor="_Toc224672340" w:history="1">
             <w:r>
               <w:rPr>
                 <w:rStyle w:val="Hyperlink"/>
@@ -483,7 +483,7 @@
                 <w:noProof/>
                 <w:webHidden/>
               </w:rPr>
-              <w:instrText xml:space="preserve"> PAGEREF _Toc222737334 \h </w:instrText>
+              <w:instrText xml:space="preserve"> PAGEREF _Toc224672340 \h </w:instrText>
             </w:r>
             <w:r>
               <w:rPr>
@@ -530,7 +530,7 @@
               <w:lang w:eastAsia="en-GB"/>
             </w:rPr>
           </w:pPr>
-          <w:hyperlink w:anchor="_Toc222737335" w:history="1">
+          <w:hyperlink w:anchor="_Toc224672341" w:history="1">
             <w:r>
               <w:rPr>
                 <w:rStyle w:val="Hyperlink"/>
@@ -559,7 +559,7 @@
                 <w:noProof/>
                 <w:webHidden/>
               </w:rPr>
-              <w:instrText xml:space="preserve"> PAGEREF _Toc222737335 \h </w:instrText>
+              <w:instrText xml:space="preserve"> PAGEREF _Toc224672341 \h </w:instrText>
             </w:r>
             <w:r>
               <w:rPr>
@@ -604,7 +604,7 @@
               <w:lang w:eastAsia="en-GB"/>
             </w:rPr>
           </w:pPr>
-          <w:hyperlink w:anchor="_Toc222737336" w:history="1">
+          <w:hyperlink w:anchor="_Toc224672342" w:history="1">
             <w:r>
               <w:rPr>
                 <w:rStyle w:val="Hyperlink"/>
@@ -635,7 +635,7 @@
                 <w:noProof/>
                 <w:webHidden/>
               </w:rPr>
-              <w:instrText xml:space="preserve"> PAGEREF _Toc222737336 \h </w:instrText>
+              <w:instrText xml:space="preserve"> PAGEREF _Toc224672342 \h </w:instrText>
             </w:r>
             <w:r>
               <w:rPr>
@@ -680,7 +680,7 @@
               <w:lang w:eastAsia="en-GB"/>
             </w:rPr>
           </w:pPr>
-          <w:hyperlink w:anchor="_Toc222737337" w:history="1">
+          <w:hyperlink w:anchor="_Toc224672343" w:history="1">
             <w:r>
               <w:rPr>
                 <w:rStyle w:val="Hyperlink"/>
@@ -711,7 +711,7 @@
                 <w:noProof/>
                 <w:webHidden/>
               </w:rPr>
-              <w:instrText xml:space="preserve"> PAGEREF _Toc222737337 \h </w:instrText>
+              <w:instrText xml:space="preserve"> PAGEREF _Toc224672343 \h </w:instrText>
             </w:r>
             <w:r>
               <w:rPr>
@@ -756,7 +756,7 @@
               <w:lang w:eastAsia="en-GB"/>
             </w:rPr>
           </w:pPr>
-          <w:hyperlink w:anchor="_Toc222737338" w:history="1">
+          <w:hyperlink w:anchor="_Toc224672344" w:history="1">
             <w:r>
               <w:rPr>
                 <w:rStyle w:val="Hyperlink"/>
@@ -787,7 +787,7 @@
                 <w:noProof/>
                 <w:webHidden/>
               </w:rPr>
-              <w:instrText xml:space="preserve"> PAGEREF _Toc222737338 \h </w:instrText>
+              <w:instrText xml:space="preserve"> PAGEREF _Toc224672344 \h </w:instrText>
             </w:r>
             <w:r>
               <w:rPr>
@@ -832,7 +832,7 @@
               <w:lang w:eastAsia="en-GB"/>
             </w:rPr>
           </w:pPr>
-          <w:hyperlink w:anchor="_Toc222737339" w:history="1">
+          <w:hyperlink w:anchor="_Toc224672345" w:history="1">
             <w:r>
               <w:rPr>
                 <w:rStyle w:val="Hyperlink"/>
@@ -863,7 +863,7 @@
                 <w:noProof/>
                 <w:webHidden/>
               </w:rPr>
-              <w:instrText xml:space="preserve"> PAGEREF _Toc222737339 \h </w:instrText>
+              <w:instrText xml:space="preserve"> PAGEREF _Toc224672345 \h </w:instrText>
             </w:r>
             <w:r>
               <w:rPr>
@@ -910,7 +910,7 @@
               <w:lang w:eastAsia="en-GB"/>
             </w:rPr>
           </w:pPr>
-          <w:hyperlink w:anchor="_Toc222737340" w:history="1">
+          <w:hyperlink w:anchor="_Toc224672346" w:history="1">
             <w:r>
               <w:rPr>
                 <w:rStyle w:val="Hyperlink"/>
@@ -939,7 +939,7 @@
                 <w:noProof/>
                 <w:webHidden/>
               </w:rPr>
-              <w:instrText xml:space="preserve"> PAGEREF _Toc222737340 \h </w:instrText>
+              <w:instrText xml:space="preserve"> PAGEREF _Toc224672346 \h </w:instrText>
             </w:r>
             <w:r>
               <w:rPr>
@@ -986,7 +986,7 @@
               <w:lang w:eastAsia="en-GB"/>
             </w:rPr>
           </w:pPr>
-          <w:hyperlink w:anchor="_Toc222737341" w:history="1">
+          <w:hyperlink w:anchor="_Toc224672347" w:history="1">
             <w:r>
               <w:rPr>
                 <w:rStyle w:val="Hyperlink"/>
@@ -1015,7 +1015,7 @@
                 <w:noProof/>
                 <w:webHidden/>
               </w:rPr>
-              <w:instrText xml:space="preserve"> PAGEREF _Toc222737341 \h </w:instrText>
+              <w:instrText xml:space="preserve"> PAGEREF _Toc224672347 \h </w:instrText>
             </w:r>
             <w:r>
               <w:rPr>
@@ -1060,7 +1060,7 @@
               <w:lang w:eastAsia="en-GB"/>
             </w:rPr>
           </w:pPr>
-          <w:hyperlink w:anchor="_Toc222737342" w:history="1">
+          <w:hyperlink w:anchor="_Toc224672348" w:history="1">
             <w:r>
               <w:rPr>
                 <w:rStyle w:val="Hyperlink"/>
@@ -1091,7 +1091,7 @@
                 <w:noProof/>
                 <w:webHidden/>
               </w:rPr>
-              <w:instrText xml:space="preserve"> PAGEREF _Toc222737342 \h </w:instrText>
+              <w:instrText xml:space="preserve"> PAGEREF _Toc224672348 \h </w:instrText>
             </w:r>
             <w:r>
               <w:rPr>
@@ -1136,7 +1136,7 @@
               <w:lang w:eastAsia="en-GB"/>
             </w:rPr>
           </w:pPr>
-          <w:hyperlink w:anchor="_Toc222737343" w:history="1">
+          <w:hyperlink w:anchor="_Toc224672349" w:history="1">
             <w:r>
               <w:rPr>
                 <w:rStyle w:val="Hyperlink"/>
@@ -1167,7 +1167,7 @@
                 <w:noProof/>
                 <w:webHidden/>
               </w:rPr>
-              <w:instrText xml:space="preserve"> PAGEREF _Toc222737343 \h </w:instrText>
+              <w:instrText xml:space="preserve"> PAGEREF _Toc224672349 \h </w:instrText>
             </w:r>
             <w:r>
               <w:rPr>
@@ -1212,7 +1212,7 @@
               <w:lang w:eastAsia="en-GB"/>
             </w:rPr>
           </w:pPr>
-          <w:hyperlink w:anchor="_Toc222737344" w:history="1">
+          <w:hyperlink w:anchor="_Toc224672350" w:history="1">
             <w:r>
               <w:rPr>
                 <w:rStyle w:val="Hyperlink"/>
@@ -1243,7 +1243,7 @@
                 <w:noProof/>
                 <w:webHidden/>
               </w:rPr>
-              <w:instrText xml:space="preserve"> PAGEREF _Toc222737344 \h </w:instrText>
+              <w:instrText xml:space="preserve"> PAGEREF _Toc224672350 \h </w:instrText>
             </w:r>
             <w:r>
               <w:rPr>
@@ -1288,7 +1288,7 @@
               <w:lang w:eastAsia="en-GB"/>
             </w:rPr>
           </w:pPr>
-          <w:hyperlink w:anchor="_Toc222737345" w:history="1">
+          <w:hyperlink w:anchor="_Toc224672351" w:history="1">
             <w:r>
               <w:rPr>
                 <w:rStyle w:val="Hyperlink"/>
@@ -1319,7 +1319,7 @@
                 <w:noProof/>
                 <w:webHidden/>
               </w:rPr>
-              <w:instrText xml:space="preserve"> PAGEREF _Toc222737345 \h </w:instrText>
+              <w:instrText xml:space="preserve"> PAGEREF _Toc224672351 \h </w:instrText>
             </w:r>
             <w:r>
               <w:rPr>
@@ -1366,7 +1366,7 @@
               <w:lang w:eastAsia="en-GB"/>
             </w:rPr>
           </w:pPr>
-          <w:hyperlink w:anchor="_Toc222737346" w:history="1">
+          <w:hyperlink w:anchor="_Toc224672352" w:history="1">
             <w:r>
               <w:rPr>
                 <w:rStyle w:val="Hyperlink"/>
@@ -1395,7 +1395,7 @@
                 <w:noProof/>
                 <w:webHidden/>
               </w:rPr>
-              <w:instrText xml:space="preserve"> PAGEREF _Toc222737346 \h </w:instrText>
+              <w:instrText xml:space="preserve"> PAGEREF _Toc224672352 \h </w:instrText>
             </w:r>
             <w:r>
               <w:rPr>
@@ -1442,7 +1442,7 @@
               <w:lang w:eastAsia="en-GB"/>
             </w:rPr>
           </w:pPr>
-          <w:hyperlink w:anchor="_Toc222737347" w:history="1">
+          <w:hyperlink w:anchor="_Toc224672353" w:history="1">
             <w:r>
               <w:rPr>
                 <w:rStyle w:val="Hyperlink"/>
@@ -1469,7 +1469,7 @@
                 <w:noProof/>
                 <w:webHidden/>
               </w:rPr>
-              <w:instrText xml:space="preserve"> PAGEREF _Toc222737347 \h </w:instrText>
+              <w:instrText xml:space="preserve"> PAGEREF _Toc224672353 \h </w:instrText>
             </w:r>
             <w:r>
               <w:rPr>
@@ -1489,7 +1489,7 @@
                 <w:noProof/>
                 <w:webHidden/>
               </w:rPr>
-              <w:t>10</w:t>
+              <w:t>12</w:t>
             </w:r>
             <w:r>
               <w:rPr>
@@ -1516,7 +1516,7 @@
               <w:lang w:eastAsia="en-GB"/>
             </w:rPr>
           </w:pPr>
-          <w:hyperlink w:anchor="_Toc222737348" w:history="1">
+          <w:hyperlink w:anchor="_Toc224672354" w:history="1">
             <w:r>
               <w:rPr>
                 <w:rStyle w:val="Hyperlink"/>
@@ -1543,7 +1543,7 @@
                 <w:noProof/>
                 <w:webHidden/>
               </w:rPr>
-              <w:instrText xml:space="preserve"> PAGEREF _Toc222737348 \h </w:instrText>
+              <w:instrText xml:space="preserve"> PAGEREF _Toc224672354 \h </w:instrText>
             </w:r>
             <w:r>
               <w:rPr>
@@ -1563,7 +1563,81 @@
                 <w:noProof/>
                 <w:webHidden/>
               </w:rPr>
-              <w:t>10</w:t>
+              <w:t>12</w:t>
+            </w:r>
+            <w:r>
+              <w:rPr>
+                <w:noProof/>
+                <w:webHidden/>
+              </w:rPr>
+              <w:fldChar w:fldCharType="end"/>
+            </w:r>
+          </w:hyperlink>
+        </w:p>
+        <w:p>
+          <w:pPr>
+            <w:pStyle w:val="TOC1"/>
+            <w:tabs>
+              <w:tab w:val="right" w:leader="dot" w:pos="9016"/>
+            </w:tabs>
+            <w:rPr>
+              <w:rFonts w:eastAsiaTheme="minorEastAsia"/>
+              <w:b w:val="0"/>
+              <w:bCs w:val="0"/>
+              <w:i w:val="0"/>
+              <w:iCs w:val="0"/>
+              <w:noProof/>
+              <w:lang w:eastAsia="en-GB"/>
+            </w:rPr>
+          </w:pPr>
+          <w:hyperlink w:anchor="_Toc224672355" w:history="1">
+            <w:r>
+              <w:rPr>
+                <w:rStyle w:val="Hyperlink"/>
+                <w:noProof/>
+              </w:rPr>
+              <w:t>Parental Controls</w:t>
+            </w:r>
+            <w:r>
+              <w:rPr>
+                <w:noProof/>
+                <w:webHidden/>
+              </w:rPr>
+              <w:tab/>
+            </w:r>
+            <w:r>
+              <w:rPr>
+                <w:noProof/>
+                <w:webHidden/>
+              </w:rPr>
+              <w:fldChar w:fldCharType="begin"/>
+            </w:r>
+            <w:r>
+              <w:rPr>
+                <w:noProof/>
+                <w:webHidden/>
+              </w:rPr>
+              <w:instrText xml:space="preserve"> PAGEREF _Toc224672355 \h </w:instrText>
+            </w:r>
+            <w:r>
+              <w:rPr>
+                <w:noProof/>
+                <w:webHidden/>
+              </w:rPr>
+            </w:r>
+            <w:r>
+              <w:rPr>
+                <w:noProof/>
+                <w:webHidden/>
+              </w:rPr>
+              <w:fldChar w:fldCharType="separate"/>
+            </w:r>
+            <w:r>
+              <w:rPr>
+                <w:noProof/>
+                <w:webHidden/>
+              </w:rPr>
+              <w:t>13</w:t>
             </w:r>
             <w:r>
               <w:rPr>
@@ -1637,13 +1711,6 @@
     </w:p>
     <w:p>
       <w:pPr>
-        <w:rPr>
-          <w:bCs/>
-        </w:rPr>
-      </w:pPr>
-    </w:p>
-    <w:p>
-      <w:pPr>
         <w:pStyle w:val="Heading1"/>
         <w:jc w:val="center"/>
         <w:rPr>
@@ -1655,7 +1722,7 @@
           <w:szCs w:val="36"/>
         </w:rPr>
       </w:pPr>
-      <w:bookmarkStart w:id="0" w:name="_Toc222737329"/>
+      <w:bookmarkStart w:id="0" w:name="_Toc224672335"/>
       <w:r>
         <w:rPr>
           <w:b/>
@@ -1770,7 +1837,7 @@
           <w:szCs w:val="36"/>
         </w:rPr>
       </w:pPr>
-      <w:bookmarkStart w:id="1" w:name="_Toc222737330"/>
+      <w:bookmarkStart w:id="1" w:name="_Toc224672336"/>
       <w:r>
         <w:rPr>
           <w:b/>
@@ -1981,19 +2048,11 @@
         <w:t xml:space="preserve"> –</w:t>
       </w:r>
       <w:r>
-        <w:t xml:space="preserve"> This will be a central place that users can navigate to which will store data to determine how secure their browsing habits have been. It will include </w:t>
+        <w:t xml:space="preserve"> This will be a central place that users can navigate to which will store data to determine how secure their browsing habits have been. It </w:t>
       </w:r>
       <w:r>
         <w:lastRenderedPageBreak/>
-        <w:t xml:space="preserve">things like how many times they have overridden blocks, how many times they have attempted to visit blocked sites etc. The dashboard will also be the location of where they can customise the browser, and where they will see how many </w:t>
-      </w:r>
-      <w:proofErr w:type="gramStart"/>
-      <w:r>
-        <w:t>experience</w:t>
-      </w:r>
-      <w:proofErr w:type="gramEnd"/>
-      <w:r>
-        <w:t xml:space="preserve"> </w:t>
+        <w:t xml:space="preserve">will include things like how many times they have overridden blocks, how many times they have attempted to visit blocked sites etc. The dashboard will also be the location of where they can customise the browser, and where they will see how many experience </w:t>
       </w:r>
       <w:r>
         <w:t>points</w:t>
@@ -2044,7 +2103,7 @@
           <w:szCs w:val="36"/>
         </w:rPr>
       </w:pPr>
-      <w:bookmarkStart w:id="2" w:name="_Toc222737331"/>
+      <w:bookmarkStart w:id="2" w:name="_Toc224672337"/>
       <w:r>
         <w:rPr>
           <w:b/>
@@ -2176,7 +2235,7 @@
           <w:szCs w:val="36"/>
         </w:rPr>
       </w:pPr>
-      <w:bookmarkStart w:id="3" w:name="_Toc222737332"/>
+      <w:bookmarkStart w:id="3" w:name="_Toc224672338"/>
       <w:r>
         <w:rPr>
           <w:b/>
@@ -2268,7 +2327,7 @@
           <w:szCs w:val="36"/>
         </w:rPr>
       </w:pPr>
-      <w:bookmarkStart w:id="4" w:name="_Toc222737333"/>
+      <w:bookmarkStart w:id="4" w:name="_Toc224672339"/>
       <w:r>
         <w:rPr>
           <w:b/>
@@ -2344,7 +2403,7 @@
           <w:szCs w:val="36"/>
         </w:rPr>
       </w:pPr>
-      <w:bookmarkStart w:id="5" w:name="_Toc222737334"/>
+      <w:bookmarkStart w:id="5" w:name="_Toc224672340"/>
       <w:r>
         <w:rPr>
           <w:b/>
@@ -2371,7 +2430,7 @@
           <w:szCs w:val="28"/>
         </w:rPr>
       </w:pPr>
-      <w:bookmarkStart w:id="6" w:name="_Toc222737335"/>
+      <w:bookmarkStart w:id="6" w:name="_Toc224672341"/>
       <w:r>
         <w:rPr>
           <w:b/>
@@ -2397,7 +2456,7 @@
           <w:szCs w:val="24"/>
         </w:rPr>
       </w:pPr>
-      <w:bookmarkStart w:id="7" w:name="_Toc222737336"/>
+      <w:bookmarkStart w:id="7" w:name="_Toc224672342"/>
       <w:r>
         <w:rPr>
           <w:b/>
@@ -2530,7 +2589,7 @@
           <w:szCs w:val="24"/>
         </w:rPr>
       </w:pPr>
-      <w:bookmarkStart w:id="8" w:name="_Toc222737337"/>
+      <w:bookmarkStart w:id="8" w:name="_Toc224672343"/>
       <w:r>
         <w:rPr>
           <w:b/>
@@ -2672,11 +2731,11 @@
     </w:p>
     <w:p>
       <w:r>
-        <w:t xml:space="preserve">At a minimum, I want to implement the experience points features (including levels), the account feature, the hints and the summary report. As a stretch task, I want to aim to implement the behaviour comparison between weeks, as well as the filter for different time periods within the safety report. Lastly, I want to aim to complete the quizzes and challenges </w:t>
+        <w:t xml:space="preserve">At a minimum, I want to implement the experience points features (including levels), the account feature, the hints and the summary report. As a stretch task, I want to aim to </w:t>
       </w:r>
       <w:r>
         <w:lastRenderedPageBreak/>
-        <w:t xml:space="preserve">as a stretch task. The colours for the elements are likely to change in the final implementation.  </w:t>
+        <w:t xml:space="preserve">implement the behaviour comparison between weeks, as well as the filter for different time periods within the safety report. Lastly, I want to aim to complete the quizzes and challenges as a stretch task. The colours for the elements are likely to change in the final implementation.  </w:t>
       </w:r>
     </w:p>
     <w:p>
@@ -2696,7 +2755,7 @@
           <w:szCs w:val="24"/>
         </w:rPr>
       </w:pPr>
-      <w:bookmarkStart w:id="9" w:name="_Toc222737338"/>
+      <w:bookmarkStart w:id="9" w:name="_Toc224672344"/>
       <w:r>
         <w:rPr>
           <w:b/>
@@ -2868,15 +2927,7 @@
         <w:t xml:space="preserve">At minimum, I want to have all elements of this taskbar implemented and able to perform their tasks. As a stretch task, </w:t>
       </w:r>
       <w:r>
-        <w:t xml:space="preserve">I want to aim to have all elements of the taskbar be customisable for each user, such as changing the colour, font and size of the taskbar, as well as repositioning each element of the taskbar. The design of the buttons </w:t>
-      </w:r>
-      <w:proofErr w:type="gramStart"/>
-      <w:r>
-        <w:t>are</w:t>
-      </w:r>
-      <w:proofErr w:type="gramEnd"/>
-      <w:r>
-        <w:t xml:space="preserve"> open to change in the final implementation.</w:t>
+        <w:t>I want to aim to have all elements of the taskbar be customisable for each user, such as changing the colour, font and size of the taskbar, as well as repositioning each element of the taskbar. The design of the buttons are open to change in the final implementation.</w:t>
       </w:r>
     </w:p>
     <w:p/>
@@ -2894,7 +2945,7 @@
           <w:szCs w:val="24"/>
         </w:rPr>
       </w:pPr>
-      <w:bookmarkStart w:id="10" w:name="_Toc222737339"/>
+      <w:bookmarkStart w:id="10" w:name="_Toc224672345"/>
       <w:r>
         <w:rPr>
           <w:b/>
@@ -2982,7 +3033,7 @@
           <w:szCs w:val="28"/>
         </w:rPr>
       </w:pPr>
-      <w:bookmarkStart w:id="11" w:name="_Toc222737340"/>
+      <w:bookmarkStart w:id="11" w:name="_Toc224672346"/>
       <w:r>
         <w:rPr>
           <w:b/>
@@ -3010,7 +3061,7 @@
           <w:szCs w:val="28"/>
         </w:rPr>
       </w:pPr>
-      <w:bookmarkStart w:id="12" w:name="_Toc222737341"/>
+      <w:bookmarkStart w:id="12" w:name="_Toc224672347"/>
       <w:r>
         <w:rPr>
           <w:b/>
@@ -3036,7 +3087,7 @@
           <w:szCs w:val="24"/>
         </w:rPr>
       </w:pPr>
-      <w:bookmarkStart w:id="13" w:name="_Toc222737342"/>
+      <w:bookmarkStart w:id="13" w:name="_Toc224672348"/>
       <w:r>
         <w:rPr>
           <w:b/>
@@ -3063,7 +3114,7 @@
           <w:szCs w:val="24"/>
         </w:rPr>
       </w:pPr>
-      <w:bookmarkStart w:id="14" w:name="_Toc222737343"/>
+      <w:bookmarkStart w:id="14" w:name="_Toc224672349"/>
       <w:r>
         <w:rPr>
           <w:b/>
@@ -3090,7 +3141,7 @@
           <w:szCs w:val="24"/>
         </w:rPr>
       </w:pPr>
-      <w:bookmarkStart w:id="15" w:name="_Toc222737344"/>
+      <w:bookmarkStart w:id="15" w:name="_Toc224672350"/>
       <w:r>
         <w:rPr>
           <w:b/>
@@ -3117,7 +3168,7 @@
           <w:szCs w:val="24"/>
         </w:rPr>
       </w:pPr>
-      <w:bookmarkStart w:id="16" w:name="_Toc222737345"/>
+      <w:bookmarkStart w:id="16" w:name="_Toc224672351"/>
       <w:r>
         <w:rPr>
           <w:b/>
@@ -3146,7 +3197,7 @@
           <w:szCs w:val="28"/>
         </w:rPr>
       </w:pPr>
-      <w:bookmarkStart w:id="17" w:name="_Toc222737346"/>
+      <w:bookmarkStart w:id="17" w:name="_Toc224672352"/>
       <w:r>
         <w:rPr>
           <w:b/>
@@ -3163,6 +3214,19 @@
     </w:p>
     <w:p>
       <w:pPr>
+        <w:rPr>
+          <w:u w:val="single"/>
+        </w:rPr>
+      </w:pPr>
+      <w:r>
+        <w:rPr>
+          <w:u w:val="single"/>
+        </w:rPr>
+        <w:t>Case 1: Sign In</w:t>
+      </w:r>
+    </w:p>
+    <w:p>
+      <w:pPr>
         <w:pStyle w:val="ListParagraph"/>
         <w:numPr>
           <w:ilvl w:val="0"/>
@@ -3171,6 +3235,817 @@
       </w:pPr>
       <w:r>
         <w:t>User wants to sign into an account</w:t>
+      </w:r>
+    </w:p>
+    <w:p>
+      <w:pPr>
+        <w:pStyle w:val="ListParagraph"/>
+        <w:numPr>
+          <w:ilvl w:val="0"/>
+          <w:numId w:val="1"/>
+        </w:numPr>
+      </w:pPr>
+      <w:r>
+        <w:t>User clicks on sign in button when opening the browser</w:t>
+      </w:r>
+    </w:p>
+    <w:p>
+      <w:pPr>
+        <w:pStyle w:val="ListParagraph"/>
+        <w:numPr>
+          <w:ilvl w:val="0"/>
+          <w:numId w:val="1"/>
+        </w:numPr>
+      </w:pPr>
+      <w:r>
+        <w:t>User enters google account email and password</w:t>
+      </w:r>
+    </w:p>
+    <w:p>
+      <w:pPr>
+        <w:pStyle w:val="ListParagraph"/>
+        <w:numPr>
+          <w:ilvl w:val="0"/>
+          <w:numId w:val="1"/>
+        </w:numPr>
+      </w:pPr>
+      <w:r>
+        <w:t>Account information is sent to Firebase</w:t>
+      </w:r>
+    </w:p>
+    <w:p>
+      <w:pPr>
+        <w:pStyle w:val="ListParagraph"/>
+        <w:numPr>
+          <w:ilvl w:val="0"/>
+          <w:numId w:val="1"/>
+        </w:numPr>
+      </w:pPr>
+      <w:r>
+        <w:t>If user’s email is found in database, they are signed in and timestamp is updated to current time</w:t>
+      </w:r>
+    </w:p>
+    <w:p>
+      <w:pPr>
+        <w:pStyle w:val="ListParagraph"/>
+        <w:numPr>
+          <w:ilvl w:val="0"/>
+          <w:numId w:val="1"/>
+        </w:numPr>
+      </w:pPr>
+      <w:r>
+        <w:t>If user’s email is not found in database, they are signed in and database collection is filled out with preset base entries</w:t>
+      </w:r>
+    </w:p>
+    <w:p>
+      <w:pPr>
+        <w:pStyle w:val="ListParagraph"/>
+        <w:numPr>
+          <w:ilvl w:val="0"/>
+          <w:numId w:val="1"/>
+        </w:numPr>
+      </w:pPr>
+      <w:r>
+        <w:t>User can then continue to home page</w:t>
+      </w:r>
+    </w:p>
+    <w:p>
+      <w:pPr>
+        <w:rPr>
+          <w:u w:val="single"/>
+        </w:rPr>
+      </w:pPr>
+      <w:r>
+        <w:rPr>
+          <w:u w:val="single"/>
+        </w:rPr>
+        <w:t>Case 2: Search for Website</w:t>
+      </w:r>
+    </w:p>
+    <w:p>
+      <w:pPr>
+        <w:pStyle w:val="ListParagraph"/>
+        <w:numPr>
+          <w:ilvl w:val="0"/>
+          <w:numId w:val="1"/>
+        </w:numPr>
+      </w:pPr>
+      <w:r>
+        <w:t>User wants to search for a specific website</w:t>
+      </w:r>
+    </w:p>
+    <w:p>
+      <w:pPr>
+        <w:pStyle w:val="ListParagraph"/>
+        <w:numPr>
+          <w:ilvl w:val="0"/>
+          <w:numId w:val="1"/>
+        </w:numPr>
+      </w:pPr>
+      <w:r>
+        <w:t>User enters the URL in the search bar</w:t>
+      </w:r>
+    </w:p>
+    <w:p>
+      <w:pPr>
+        <w:pStyle w:val="ListParagraph"/>
+        <w:numPr>
+          <w:ilvl w:val="0"/>
+          <w:numId w:val="1"/>
+        </w:numPr>
+      </w:pPr>
+      <w:r>
+        <w:t>System checks to make sure the URL is in a valid format</w:t>
+      </w:r>
+    </w:p>
+    <w:p>
+      <w:pPr>
+        <w:pStyle w:val="ListParagraph"/>
+        <w:numPr>
+          <w:ilvl w:val="0"/>
+          <w:numId w:val="1"/>
+        </w:numPr>
+      </w:pPr>
+      <w:r>
+        <w:t>If it is in a valid format, the system then checks the URL for a security score</w:t>
+      </w:r>
+    </w:p>
+    <w:p>
+      <w:pPr>
+        <w:pStyle w:val="ListParagraph"/>
+        <w:numPr>
+          <w:ilvl w:val="0"/>
+          <w:numId w:val="1"/>
+        </w:numPr>
+      </w:pPr>
+      <w:r>
+        <w:t>If the security score is 0-50, the URL is loaded</w:t>
+      </w:r>
+    </w:p>
+    <w:p>
+      <w:pPr>
+        <w:pStyle w:val="ListParagraph"/>
+        <w:numPr>
+          <w:ilvl w:val="0"/>
+          <w:numId w:val="1"/>
+        </w:numPr>
+      </w:pPr>
+      <w:r>
+        <w:t>If the security score is 50-100, a warning is presented, with the URL loaded after this warning is accepted</w:t>
+      </w:r>
+    </w:p>
+    <w:p>
+      <w:pPr>
+        <w:pStyle w:val="ListParagraph"/>
+        <w:numPr>
+          <w:ilvl w:val="0"/>
+          <w:numId w:val="1"/>
+        </w:numPr>
+      </w:pPr>
+      <w:r>
+        <w:t>If the security score is 100+, the URL is automatically blocked with no override</w:t>
+      </w:r>
+    </w:p>
+    <w:p>
+      <w:pPr>
+        <w:pStyle w:val="ListParagraph"/>
+        <w:numPr>
+          <w:ilvl w:val="0"/>
+          <w:numId w:val="1"/>
+        </w:numPr>
+      </w:pPr>
+      <w:r>
+        <w:t>If the URL is not in a valid format, it is searched as a query instead</w:t>
+      </w:r>
+    </w:p>
+    <w:p>
+      <w:pPr>
+        <w:rPr>
+          <w:u w:val="single"/>
+        </w:rPr>
+      </w:pPr>
+      <w:r>
+        <w:rPr>
+          <w:u w:val="single"/>
+        </w:rPr>
+        <w:t>Case 3: Open Website from Search Query</w:t>
+      </w:r>
+    </w:p>
+    <w:p>
+      <w:pPr>
+        <w:pStyle w:val="ListParagraph"/>
+        <w:numPr>
+          <w:ilvl w:val="0"/>
+          <w:numId w:val="1"/>
+        </w:numPr>
+      </w:pPr>
+      <w:r>
+        <w:t>User wants to open a website after entering a search query</w:t>
+      </w:r>
+    </w:p>
+    <w:p>
+      <w:pPr>
+        <w:pStyle w:val="ListParagraph"/>
+        <w:numPr>
+          <w:ilvl w:val="0"/>
+          <w:numId w:val="1"/>
+        </w:numPr>
+      </w:pPr>
+      <w:r>
+        <w:t>User clicks on the website they want to open</w:t>
+      </w:r>
+    </w:p>
+    <w:p>
+      <w:pPr>
+        <w:pStyle w:val="ListParagraph"/>
+        <w:numPr>
+          <w:ilvl w:val="0"/>
+          <w:numId w:val="1"/>
+        </w:numPr>
+      </w:pPr>
+      <w:r>
+        <w:t>System performs security checks on the URL to generate a security score</w:t>
+      </w:r>
+    </w:p>
+    <w:p>
+      <w:pPr>
+        <w:pStyle w:val="ListParagraph"/>
+        <w:numPr>
+          <w:ilvl w:val="0"/>
+          <w:numId w:val="1"/>
+        </w:numPr>
+      </w:pPr>
+      <w:r>
+        <w:t>If the security score is 0-50, the URL is loaded</w:t>
+      </w:r>
+    </w:p>
+    <w:p>
+      <w:pPr>
+        <w:pStyle w:val="ListParagraph"/>
+        <w:numPr>
+          <w:ilvl w:val="0"/>
+          <w:numId w:val="1"/>
+        </w:numPr>
+      </w:pPr>
+      <w:r>
+        <w:t>If the security score is 50-100, a warning is presented, with the URL loaded after this warning is accepted</w:t>
+      </w:r>
+    </w:p>
+    <w:p>
+      <w:pPr>
+        <w:pStyle w:val="ListParagraph"/>
+        <w:numPr>
+          <w:ilvl w:val="0"/>
+          <w:numId w:val="1"/>
+        </w:numPr>
+      </w:pPr>
+      <w:r>
+        <w:t>If the security score is 100+, the URL is automatically blocked with no override</w:t>
+      </w:r>
+    </w:p>
+    <w:p>
+      <w:pPr>
+        <w:rPr>
+          <w:u w:val="single"/>
+        </w:rPr>
+      </w:pPr>
+      <w:r>
+        <w:rPr>
+          <w:u w:val="single"/>
+        </w:rPr>
+        <w:t>Case 4: Download File</w:t>
+      </w:r>
+    </w:p>
+    <w:p>
+      <w:pPr>
+        <w:pStyle w:val="ListParagraph"/>
+        <w:numPr>
+          <w:ilvl w:val="0"/>
+          <w:numId w:val="1"/>
+        </w:numPr>
+      </w:pPr>
+      <w:r>
+        <w:t>User wants to download a file from a website</w:t>
+      </w:r>
+    </w:p>
+    <w:p>
+      <w:pPr>
+        <w:pStyle w:val="ListParagraph"/>
+        <w:numPr>
+          <w:ilvl w:val="0"/>
+          <w:numId w:val="1"/>
+        </w:numPr>
+      </w:pPr>
+      <w:r>
+        <w:t>User clicks on the download link</w:t>
+      </w:r>
+    </w:p>
+    <w:p>
+      <w:pPr>
+        <w:pStyle w:val="ListParagraph"/>
+        <w:numPr>
+          <w:ilvl w:val="0"/>
+          <w:numId w:val="1"/>
+        </w:numPr>
+      </w:pPr>
+      <w:r>
+        <w:t>System intercepts the request before the download can begin</w:t>
+      </w:r>
+    </w:p>
+    <w:p>
+      <w:pPr>
+        <w:pStyle w:val="ListParagraph"/>
+        <w:numPr>
+          <w:ilvl w:val="0"/>
+          <w:numId w:val="1"/>
+        </w:numPr>
+      </w:pPr>
+      <w:r>
+        <w:t>File is scanned for typically malicious file extensions</w:t>
+      </w:r>
+      <w:r>
+        <w:t xml:space="preserve"> and valid signatures</w:t>
+      </w:r>
+    </w:p>
+    <w:p>
+      <w:pPr>
+        <w:pStyle w:val="ListParagraph"/>
+        <w:numPr>
+          <w:ilvl w:val="0"/>
+          <w:numId w:val="1"/>
+        </w:numPr>
+      </w:pPr>
+      <w:r>
+        <w:t>If the download is deemed safe, it is allowed and stored on user’s device</w:t>
+      </w:r>
+    </w:p>
+    <w:p>
+      <w:pPr>
+        <w:pStyle w:val="ListParagraph"/>
+        <w:numPr>
+          <w:ilvl w:val="0"/>
+          <w:numId w:val="1"/>
+        </w:numPr>
+      </w:pPr>
+      <w:r>
+        <w:t>If the download is deemed dangerous, it is blocked and user is warned</w:t>
+      </w:r>
+    </w:p>
+    <w:p>
+      <w:pPr>
+        <w:rPr>
+          <w:u w:val="single"/>
+        </w:rPr>
+      </w:pPr>
+    </w:p>
+    <w:p>
+      <w:pPr>
+        <w:rPr>
+          <w:u w:val="single"/>
+        </w:rPr>
+      </w:pPr>
+      <w:r>
+        <w:rPr>
+          <w:u w:val="single"/>
+        </w:rPr>
+        <w:lastRenderedPageBreak/>
+        <w:t>Case 5: View Downloads</w:t>
+      </w:r>
+    </w:p>
+    <w:p>
+      <w:pPr>
+        <w:pStyle w:val="ListParagraph"/>
+        <w:numPr>
+          <w:ilvl w:val="0"/>
+          <w:numId w:val="1"/>
+        </w:numPr>
+      </w:pPr>
+      <w:r>
+        <w:t>User wants to view downloads</w:t>
+      </w:r>
+    </w:p>
+    <w:p>
+      <w:pPr>
+        <w:pStyle w:val="ListParagraph"/>
+        <w:numPr>
+          <w:ilvl w:val="0"/>
+          <w:numId w:val="1"/>
+        </w:numPr>
+      </w:pPr>
+      <w:r>
+        <w:t>User clicks on downloads button in taskbar</w:t>
+      </w:r>
+    </w:p>
+    <w:p>
+      <w:pPr>
+        <w:pStyle w:val="ListParagraph"/>
+        <w:numPr>
+          <w:ilvl w:val="0"/>
+          <w:numId w:val="1"/>
+        </w:numPr>
+      </w:pPr>
+      <w:r>
+        <w:t>System displays 5 most recent downloads and a ‘view all’ button in a pop-up menu</w:t>
+      </w:r>
+    </w:p>
+    <w:p>
+      <w:pPr>
+        <w:pStyle w:val="ListParagraph"/>
+        <w:numPr>
+          <w:ilvl w:val="0"/>
+          <w:numId w:val="1"/>
+        </w:numPr>
+      </w:pPr>
+      <w:r>
+        <w:t>User clicks on view all button</w:t>
+      </w:r>
+    </w:p>
+    <w:p>
+      <w:pPr>
+        <w:pStyle w:val="ListParagraph"/>
+        <w:numPr>
+          <w:ilvl w:val="0"/>
+          <w:numId w:val="1"/>
+        </w:numPr>
+      </w:pPr>
+      <w:r>
+        <w:t>System displays all downloads available in that browser instance</w:t>
+      </w:r>
+    </w:p>
+    <w:p>
+      <w:pPr>
+        <w:rPr>
+          <w:u w:val="single"/>
+        </w:rPr>
+      </w:pPr>
+      <w:r>
+        <w:rPr>
+          <w:u w:val="single"/>
+        </w:rPr>
+        <w:t>Case 6: Play Quiz</w:t>
+      </w:r>
+    </w:p>
+    <w:p>
+      <w:pPr>
+        <w:pStyle w:val="ListParagraph"/>
+        <w:numPr>
+          <w:ilvl w:val="0"/>
+          <w:numId w:val="1"/>
+        </w:numPr>
+      </w:pPr>
+      <w:r>
+        <w:t>User wants to do daily / weekly quiz</w:t>
+      </w:r>
+    </w:p>
+    <w:p>
+      <w:pPr>
+        <w:pStyle w:val="ListParagraph"/>
+        <w:numPr>
+          <w:ilvl w:val="0"/>
+          <w:numId w:val="1"/>
+        </w:numPr>
+      </w:pPr>
+      <w:r>
+        <w:t>User selects daily / weekly quiz from dashboard</w:t>
+      </w:r>
+    </w:p>
+    <w:p>
+      <w:pPr>
+        <w:pStyle w:val="ListParagraph"/>
+        <w:numPr>
+          <w:ilvl w:val="0"/>
+          <w:numId w:val="1"/>
+        </w:numPr>
+      </w:pPr>
+      <w:r>
+        <w:t>System loads 5 questions for daily quiz or 15 questions for weekly quiz, randomly generated from Firebase</w:t>
+      </w:r>
+    </w:p>
+    <w:p>
+      <w:pPr>
+        <w:pStyle w:val="ListParagraph"/>
+        <w:numPr>
+          <w:ilvl w:val="0"/>
+          <w:numId w:val="1"/>
+        </w:numPr>
+      </w:pPr>
+      <w:r>
+        <w:t>System checks user’s answers and calculates a final score which is displayed to the user</w:t>
+      </w:r>
+    </w:p>
+    <w:p>
+      <w:pPr>
+        <w:rPr>
+          <w:u w:val="single"/>
+        </w:rPr>
+      </w:pPr>
+      <w:r>
+        <w:rPr>
+          <w:u w:val="single"/>
+        </w:rPr>
+        <w:t>Case 7: Change Setting</w:t>
+      </w:r>
+      <w:r>
+        <w:rPr>
+          <w:u w:val="single"/>
+        </w:rPr>
+        <w:t>s</w:t>
+      </w:r>
+    </w:p>
+    <w:p>
+      <w:pPr>
+        <w:pStyle w:val="ListParagraph"/>
+        <w:numPr>
+          <w:ilvl w:val="0"/>
+          <w:numId w:val="1"/>
+        </w:numPr>
+      </w:pPr>
+      <w:r>
+        <w:t>User wants to change settings</w:t>
+      </w:r>
+    </w:p>
+    <w:p>
+      <w:pPr>
+        <w:pStyle w:val="ListParagraph"/>
+        <w:numPr>
+          <w:ilvl w:val="0"/>
+          <w:numId w:val="1"/>
+        </w:numPr>
+      </w:pPr>
+      <w:r>
+        <w:t>User opens settings menu</w:t>
+      </w:r>
+    </w:p>
+    <w:p>
+      <w:pPr>
+        <w:pStyle w:val="ListParagraph"/>
+        <w:numPr>
+          <w:ilvl w:val="0"/>
+          <w:numId w:val="1"/>
+        </w:numPr>
+      </w:pPr>
+      <w:r>
+        <w:t>If signed in, user enters a pin</w:t>
+      </w:r>
+    </w:p>
+    <w:p>
+      <w:pPr>
+        <w:pStyle w:val="ListParagraph"/>
+        <w:numPr>
+          <w:ilvl w:val="0"/>
+          <w:numId w:val="1"/>
+        </w:numPr>
+      </w:pPr>
+      <w:r>
+        <w:t>If browsing as guest, system asks for sign in</w:t>
+      </w:r>
+    </w:p>
+    <w:p>
+      <w:pPr>
+        <w:pStyle w:val="ListParagraph"/>
+        <w:numPr>
+          <w:ilvl w:val="0"/>
+          <w:numId w:val="1"/>
+        </w:numPr>
+      </w:pPr>
+      <w:r>
+        <w:t>User selects a setting to change and updates their preferences</w:t>
+      </w:r>
+    </w:p>
+    <w:p>
+      <w:pPr>
+        <w:pStyle w:val="ListParagraph"/>
+        <w:numPr>
+          <w:ilvl w:val="0"/>
+          <w:numId w:val="1"/>
+        </w:numPr>
+      </w:pPr>
+      <w:r>
+        <w:t>System saves changes into Firebase</w:t>
+      </w:r>
+    </w:p>
+    <w:p>
+      <w:pPr>
+        <w:pStyle w:val="ListParagraph"/>
+        <w:numPr>
+          <w:ilvl w:val="0"/>
+          <w:numId w:val="1"/>
+        </w:numPr>
+      </w:pPr>
+      <w:r>
+        <w:t>Setting is updated immediately</w:t>
+      </w:r>
+    </w:p>
+    <w:p>
+      <w:pPr>
+        <w:rPr>
+          <w:u w:val="single"/>
+        </w:rPr>
+      </w:pPr>
+      <w:r>
+        <w:rPr>
+          <w:u w:val="single"/>
+        </w:rPr>
+        <w:t>Case 8:</w:t>
+      </w:r>
+      <w:r>
+        <w:rPr>
+          <w:u w:val="single"/>
+        </w:rPr>
+        <w:t xml:space="preserve"> View Dashboard</w:t>
+      </w:r>
+    </w:p>
+    <w:p>
+      <w:pPr>
+        <w:pStyle w:val="ListParagraph"/>
+        <w:numPr>
+          <w:ilvl w:val="0"/>
+          <w:numId w:val="1"/>
+        </w:numPr>
+      </w:pPr>
+      <w:r>
+        <w:t>User wants to view the dashboard</w:t>
+      </w:r>
+    </w:p>
+    <w:p>
+      <w:pPr>
+        <w:pStyle w:val="ListParagraph"/>
+        <w:numPr>
+          <w:ilvl w:val="0"/>
+          <w:numId w:val="1"/>
+        </w:numPr>
+      </w:pPr>
+      <w:r>
+        <w:t>User clicks on the dashboard button</w:t>
+      </w:r>
+    </w:p>
+    <w:p>
+      <w:pPr>
+        <w:pStyle w:val="ListParagraph"/>
+        <w:numPr>
+          <w:ilvl w:val="0"/>
+          <w:numId w:val="1"/>
+        </w:numPr>
+      </w:pPr>
+      <w:r>
+        <w:t>System retrieves their statistics from Firebase and displays them within the dashboard page</w:t>
+      </w:r>
+    </w:p>
+    <w:p>
+      <w:pPr>
+        <w:rPr>
+          <w:u w:val="single"/>
+        </w:rPr>
+      </w:pPr>
+      <w:r>
+        <w:rPr>
+          <w:u w:val="single"/>
+        </w:rPr>
+        <w:t>Case 9:</w:t>
+      </w:r>
+      <w:r>
+        <w:rPr>
+          <w:u w:val="single"/>
+        </w:rPr>
+        <w:t xml:space="preserve"> Receive Security Warning</w:t>
+      </w:r>
+    </w:p>
+    <w:p>
+      <w:pPr>
+        <w:pStyle w:val="ListParagraph"/>
+        <w:numPr>
+          <w:ilvl w:val="0"/>
+          <w:numId w:val="1"/>
+        </w:numPr>
+      </w:pPr>
+      <w:r>
+        <w:t>User wants to access a dangerous site</w:t>
+      </w:r>
+    </w:p>
+    <w:p>
+      <w:pPr>
+        <w:pStyle w:val="ListParagraph"/>
+        <w:numPr>
+          <w:ilvl w:val="0"/>
+          <w:numId w:val="1"/>
+        </w:numPr>
+      </w:pPr>
+      <w:r>
+        <w:t xml:space="preserve">System flags the site as being a security score of 50+ so identifies it as </w:t>
+      </w:r>
+      <w:r>
+        <w:t>suspicious</w:t>
+      </w:r>
+    </w:p>
+    <w:p>
+      <w:pPr>
+        <w:pStyle w:val="ListParagraph"/>
+        <w:numPr>
+          <w:ilvl w:val="0"/>
+          <w:numId w:val="1"/>
+        </w:numPr>
+      </w:pPr>
+      <w:r>
+        <w:t>System blocks the user from accessing the site with a warning to say why</w:t>
+      </w:r>
+    </w:p>
+    <w:p>
+      <w:pPr>
+        <w:pStyle w:val="ListParagraph"/>
+        <w:numPr>
+          <w:ilvl w:val="0"/>
+          <w:numId w:val="1"/>
+        </w:numPr>
+      </w:pPr>
+      <w:r>
+        <w:t>If security score is 50-100, user can override the warning and continue to the site</w:t>
+      </w:r>
+    </w:p>
+    <w:p>
+      <w:pPr>
+        <w:pStyle w:val="ListParagraph"/>
+        <w:numPr>
+          <w:ilvl w:val="0"/>
+          <w:numId w:val="1"/>
+        </w:numPr>
+      </w:pPr>
+      <w:r>
+        <w:t>If security score is 100+, user cannot override the warning and site is permanently blocked</w:t>
+      </w:r>
+    </w:p>
+    <w:p>
+      <w:pPr>
+        <w:rPr>
+          <w:u w:val="single"/>
+        </w:rPr>
+      </w:pPr>
+    </w:p>
+    <w:p>
+      <w:pPr>
+        <w:rPr>
+          <w:u w:val="single"/>
+        </w:rPr>
+      </w:pPr>
+      <w:r>
+        <w:rPr>
+          <w:u w:val="single"/>
+        </w:rPr>
+        <w:lastRenderedPageBreak/>
+        <w:t>Case 10:</w:t>
+      </w:r>
+      <w:r>
+        <w:rPr>
+          <w:u w:val="single"/>
+        </w:rPr>
+        <w:t xml:space="preserve"> Sign Out</w:t>
+      </w:r>
+    </w:p>
+    <w:p>
+      <w:pPr>
+        <w:pStyle w:val="ListParagraph"/>
+        <w:numPr>
+          <w:ilvl w:val="0"/>
+          <w:numId w:val="1"/>
+        </w:numPr>
+      </w:pPr>
+      <w:r>
+        <w:t>User wants to sign out of their account</w:t>
+      </w:r>
+    </w:p>
+    <w:p>
+      <w:pPr>
+        <w:pStyle w:val="ListParagraph"/>
+        <w:numPr>
+          <w:ilvl w:val="0"/>
+          <w:numId w:val="1"/>
+        </w:numPr>
+      </w:pPr>
+      <w:r>
+        <w:t>User clicks sign out button</w:t>
+      </w:r>
+    </w:p>
+    <w:p>
+      <w:pPr>
+        <w:pStyle w:val="ListParagraph"/>
+        <w:numPr>
+          <w:ilvl w:val="0"/>
+          <w:numId w:val="1"/>
+        </w:numPr>
+      </w:pPr>
+      <w:r>
+        <w:t>User is signed out of their session</w:t>
+      </w:r>
+    </w:p>
+    <w:p>
+      <w:pPr>
+        <w:pStyle w:val="ListParagraph"/>
+        <w:numPr>
+          <w:ilvl w:val="0"/>
+          <w:numId w:val="1"/>
+        </w:numPr>
+      </w:pPr>
+      <w:r>
+        <w:t>Browser displays sign in screen</w:t>
       </w:r>
     </w:p>
     <w:p/>
@@ -3187,7 +4062,7 @@
           <w:szCs w:val="36"/>
         </w:rPr>
       </w:pPr>
-      <w:bookmarkStart w:id="18" w:name="_Toc222737347"/>
+      <w:bookmarkStart w:id="18" w:name="_Toc224672353"/>
       <w:r>
         <w:rPr>
           <w:b/>
@@ -3278,13 +4153,8 @@
           <w:numId w:val="1"/>
         </w:numPr>
       </w:pPr>
-      <w:proofErr w:type="spellStart"/>
-      <w:r>
-        <w:t>ChatGPT</w:t>
-      </w:r>
-      <w:proofErr w:type="spellEnd"/>
-      <w:r>
-        <w:t xml:space="preserve"> was used for debugging purposes and clarification of language (</w:t>
+      <w:r>
+        <w:t>ChatGPT was used for debugging purposes and clarification of language (</w:t>
       </w:r>
       <w:hyperlink r:id="rId13" w:history="1">
         <w:r>
@@ -3375,12 +4245,7 @@
         </w:r>
       </w:hyperlink>
       <w:r>
-        <w:t>,</w:t>
-      </w:r>
-      <w:bookmarkStart w:id="19" w:name="_GoBack"/>
-      <w:bookmarkEnd w:id="19"/>
-      <w:r>
-        <w:t xml:space="preserve"> </w:t>
+        <w:t xml:space="preserve">, </w:t>
       </w:r>
       <w:hyperlink r:id="rId18" w:history="1">
         <w:r>
@@ -3408,7 +4273,7 @@
           <w:szCs w:val="36"/>
         </w:rPr>
       </w:pPr>
-      <w:bookmarkStart w:id="20" w:name="_Toc222737348"/>
+      <w:bookmarkStart w:id="19" w:name="_Toc224672354"/>
       <w:r>
         <w:rPr>
           <w:b/>
@@ -3420,196 +4285,208 @@
         </w:rPr>
         <w:t>Database</w:t>
       </w:r>
+      <w:bookmarkEnd w:id="19"/>
+    </w:p>
+    <w:p>
+      <w:pPr>
+        <w:pStyle w:val="ListParagraph"/>
+        <w:numPr>
+          <w:ilvl w:val="0"/>
+          <w:numId w:val="1"/>
+        </w:numPr>
+      </w:pPr>
+      <w:r>
+        <w:t>Needs to store basic user information</w:t>
+      </w:r>
+    </w:p>
+    <w:p>
+      <w:pPr>
+        <w:pStyle w:val="ListParagraph"/>
+        <w:numPr>
+          <w:ilvl w:val="0"/>
+          <w:numId w:val="1"/>
+        </w:numPr>
+      </w:pPr>
+      <w:r>
+        <w:t>Will use Firebase as it allows for automatic hashing of passwords and can also enable Google OAUTH rather than having to make a specific account</w:t>
+      </w:r>
+    </w:p>
+    <w:p>
+      <w:pPr>
+        <w:pStyle w:val="ListParagraph"/>
+        <w:numPr>
+          <w:ilvl w:val="0"/>
+          <w:numId w:val="1"/>
+        </w:numPr>
+      </w:pPr>
+      <w:r>
+        <w:t xml:space="preserve">The information that </w:t>
+      </w:r>
+      <w:r>
+        <w:t>should</w:t>
+      </w:r>
+      <w:r>
+        <w:t xml:space="preserve"> be stored is:</w:t>
+      </w:r>
+    </w:p>
+    <w:p>
+      <w:pPr>
+        <w:pStyle w:val="ListParagraph"/>
+        <w:numPr>
+          <w:ilvl w:val="2"/>
+          <w:numId w:val="1"/>
+        </w:numPr>
+      </w:pPr>
+      <w:bookmarkStart w:id="20" w:name="OLE_LINK1"/>
+      <w:r>
+        <w:t>Username / User ID</w:t>
+      </w:r>
+    </w:p>
+    <w:p>
+      <w:pPr>
+        <w:pStyle w:val="ListParagraph"/>
+        <w:numPr>
+          <w:ilvl w:val="2"/>
+          <w:numId w:val="1"/>
+        </w:numPr>
+      </w:pPr>
+      <w:r>
+        <w:t>XP amount</w:t>
+      </w:r>
+    </w:p>
+    <w:p>
+      <w:pPr>
+        <w:pStyle w:val="ListParagraph"/>
+        <w:numPr>
+          <w:ilvl w:val="2"/>
+          <w:numId w:val="1"/>
+        </w:numPr>
+      </w:pPr>
+      <w:r>
+        <w:t>XP history (to display recent changes on dashboard)</w:t>
+      </w:r>
+    </w:p>
+    <w:p>
+      <w:pPr>
+        <w:pStyle w:val="ListParagraph"/>
+        <w:numPr>
+          <w:ilvl w:val="2"/>
+          <w:numId w:val="1"/>
+        </w:numPr>
+      </w:pPr>
+      <w:r>
+        <w:t>Level</w:t>
+      </w:r>
+    </w:p>
+    <w:p>
+      <w:pPr>
+        <w:pStyle w:val="ListParagraph"/>
+        <w:numPr>
+          <w:ilvl w:val="2"/>
+          <w:numId w:val="1"/>
+        </w:numPr>
+      </w:pPr>
+      <w:r>
+        <w:t>Safe day streak</w:t>
+      </w:r>
+    </w:p>
+    <w:p>
+      <w:pPr>
+        <w:pStyle w:val="ListParagraph"/>
+        <w:numPr>
+          <w:ilvl w:val="2"/>
+          <w:numId w:val="1"/>
+        </w:numPr>
+      </w:pPr>
+      <w:r>
+        <w:t>Number of sites blocked</w:t>
+      </w:r>
+    </w:p>
+    <w:p>
+      <w:pPr>
+        <w:pStyle w:val="ListParagraph"/>
+        <w:numPr>
+          <w:ilvl w:val="2"/>
+          <w:numId w:val="1"/>
+        </w:numPr>
+      </w:pPr>
+      <w:r>
+        <w:t>Number of downloads blocked</w:t>
+      </w:r>
+    </w:p>
+    <w:p>
+      <w:pPr>
+        <w:pStyle w:val="ListParagraph"/>
+        <w:numPr>
+          <w:ilvl w:val="2"/>
+          <w:numId w:val="1"/>
+        </w:numPr>
+      </w:pPr>
+      <w:r>
+        <w:t>Number of warnings ignored</w:t>
+      </w:r>
+    </w:p>
+    <w:p>
+      <w:pPr>
+        <w:pStyle w:val="ListParagraph"/>
+        <w:numPr>
+          <w:ilvl w:val="2"/>
+          <w:numId w:val="1"/>
+        </w:numPr>
+      </w:pPr>
+      <w:r>
+        <w:lastRenderedPageBreak/>
+        <w:t>Number of cookies deleted</w:t>
+      </w:r>
+    </w:p>
+    <w:p>
+      <w:pPr>
+        <w:pStyle w:val="ListParagraph"/>
+        <w:numPr>
+          <w:ilvl w:val="2"/>
+          <w:numId w:val="1"/>
+        </w:numPr>
+      </w:pPr>
+      <w:r>
+        <w:t>User’s settings (appearance / is search history enabled / are cookies set to clear etc.)</w:t>
+      </w:r>
+    </w:p>
+    <w:p>
+      <w:pPr>
+        <w:pStyle w:val="ListParagraph"/>
+        <w:numPr>
+          <w:ilvl w:val="2"/>
+          <w:numId w:val="1"/>
+        </w:numPr>
+      </w:pPr>
+      <w:r>
+        <w:t>Quiz questions + answers (daily / weekly)</w:t>
+      </w:r>
+    </w:p>
+    <w:p>
+      <w:pPr>
+        <w:pStyle w:val="ListParagraph"/>
+        <w:numPr>
+          <w:ilvl w:val="2"/>
+          <w:numId w:val="1"/>
+        </w:numPr>
+      </w:pPr>
+      <w:r>
+        <w:t>Challenges</w:t>
+      </w:r>
       <w:bookmarkEnd w:id="20"/>
     </w:p>
     <w:p>
       <w:pPr>
         <w:pStyle w:val="ListParagraph"/>
         <w:numPr>
-          <w:ilvl w:val="0"/>
-          <w:numId w:val="1"/>
-        </w:numPr>
-      </w:pPr>
-      <w:r>
-        <w:t>Needs to store basic user information</w:t>
-      </w:r>
-    </w:p>
-    <w:p>
-      <w:pPr>
-        <w:pStyle w:val="ListParagraph"/>
-        <w:numPr>
-          <w:ilvl w:val="0"/>
-          <w:numId w:val="1"/>
-        </w:numPr>
-      </w:pPr>
-      <w:r>
-        <w:t>Will use Firebase as it allows for automatic hashing of passwords and can also enable Google OAUTH rather than having to make a specific account</w:t>
-      </w:r>
-    </w:p>
-    <w:p>
-      <w:pPr>
-        <w:pStyle w:val="ListParagraph"/>
-        <w:numPr>
-          <w:ilvl w:val="0"/>
-          <w:numId w:val="1"/>
-        </w:numPr>
-      </w:pPr>
-      <w:r>
-        <w:t xml:space="preserve">The information that </w:t>
-      </w:r>
-      <w:r>
-        <w:t>should</w:t>
-      </w:r>
-      <w:r>
-        <w:t xml:space="preserve"> be stored is:</w:t>
-      </w:r>
-    </w:p>
-    <w:p>
-      <w:pPr>
-        <w:pStyle w:val="ListParagraph"/>
-        <w:numPr>
           <w:ilvl w:val="2"/>
           <w:numId w:val="1"/>
         </w:numPr>
       </w:pPr>
-      <w:bookmarkStart w:id="21" w:name="OLE_LINK1"/>
-      <w:r>
-        <w:t>Username / User ID</w:t>
-      </w:r>
-    </w:p>
-    <w:p>
-      <w:pPr>
-        <w:pStyle w:val="ListParagraph"/>
-        <w:numPr>
-          <w:ilvl w:val="2"/>
-          <w:numId w:val="1"/>
-        </w:numPr>
-      </w:pPr>
-      <w:r>
-        <w:t>XP amount</w:t>
-      </w:r>
-    </w:p>
-    <w:p>
-      <w:pPr>
-        <w:pStyle w:val="ListParagraph"/>
-        <w:numPr>
-          <w:ilvl w:val="2"/>
-          <w:numId w:val="1"/>
-        </w:numPr>
-      </w:pPr>
-      <w:r>
-        <w:t>XP history (to display recent changes on dashboard)</w:t>
-      </w:r>
-    </w:p>
-    <w:p>
-      <w:pPr>
-        <w:pStyle w:val="ListParagraph"/>
-        <w:numPr>
-          <w:ilvl w:val="2"/>
-          <w:numId w:val="1"/>
-        </w:numPr>
-      </w:pPr>
-      <w:r>
-        <w:t>Level</w:t>
-      </w:r>
-    </w:p>
-    <w:p>
-      <w:pPr>
-        <w:pStyle w:val="ListParagraph"/>
-        <w:numPr>
-          <w:ilvl w:val="2"/>
-          <w:numId w:val="1"/>
-        </w:numPr>
-      </w:pPr>
-      <w:r>
-        <w:t>Safe day streak</w:t>
-      </w:r>
-    </w:p>
-    <w:p>
-      <w:pPr>
-        <w:pStyle w:val="ListParagraph"/>
-        <w:numPr>
-          <w:ilvl w:val="2"/>
-          <w:numId w:val="1"/>
-        </w:numPr>
-      </w:pPr>
-      <w:r>
-        <w:t>Number of sites blocked</w:t>
-      </w:r>
-    </w:p>
-    <w:p>
-      <w:pPr>
-        <w:pStyle w:val="ListParagraph"/>
-        <w:numPr>
-          <w:ilvl w:val="2"/>
-          <w:numId w:val="1"/>
-        </w:numPr>
-      </w:pPr>
-      <w:r>
-        <w:t>Number of downloads blocked</w:t>
-      </w:r>
-    </w:p>
-    <w:p>
-      <w:pPr>
-        <w:pStyle w:val="ListParagraph"/>
-        <w:numPr>
-          <w:ilvl w:val="2"/>
-          <w:numId w:val="1"/>
-        </w:numPr>
-      </w:pPr>
-      <w:r>
-        <w:t>Number of warnings ignored</w:t>
-      </w:r>
-    </w:p>
-    <w:p>
-      <w:pPr>
-        <w:pStyle w:val="ListParagraph"/>
-        <w:numPr>
-          <w:ilvl w:val="2"/>
-          <w:numId w:val="1"/>
-        </w:numPr>
-      </w:pPr>
-      <w:r>
-        <w:t>Number of cookies deleted</w:t>
-      </w:r>
-    </w:p>
-    <w:p>
-      <w:pPr>
-        <w:pStyle w:val="ListParagraph"/>
-        <w:numPr>
-          <w:ilvl w:val="2"/>
-          <w:numId w:val="1"/>
-        </w:numPr>
-      </w:pPr>
-      <w:r>
-        <w:t>User’s settings (appearance / is search history enabled / are cookies set to clear etc.)</w:t>
-      </w:r>
-    </w:p>
-    <w:p>
-      <w:pPr>
-        <w:pStyle w:val="ListParagraph"/>
-        <w:numPr>
-          <w:ilvl w:val="2"/>
-          <w:numId w:val="1"/>
-        </w:numPr>
-      </w:pPr>
-      <w:r>
-        <w:lastRenderedPageBreak/>
-        <w:t>Quiz questions + answers (daily / weekly)</w:t>
-      </w:r>
-    </w:p>
-    <w:p>
-      <w:pPr>
-        <w:pStyle w:val="ListParagraph"/>
-        <w:numPr>
-          <w:ilvl w:val="2"/>
-          <w:numId w:val="1"/>
-        </w:numPr>
-      </w:pPr>
-      <w:r>
-        <w:t>Challenges</w:t>
-      </w:r>
-      <w:bookmarkEnd w:id="21"/>
+      <w:r>
+        <w:t>Timestamps for creation date and last login</w:t>
+      </w:r>
     </w:p>
     <w:p/>
     <w:p>
@@ -3625,6 +4502,7 @@
           <w:szCs w:val="32"/>
         </w:rPr>
       </w:pPr>
+      <w:bookmarkStart w:id="21" w:name="_Toc224672355"/>
       <w:r>
         <w:rPr>
           <w:b/>
@@ -3636,6 +4514,7 @@
         </w:rPr>
         <w:t>Parental Controls</w:t>
       </w:r>
+      <w:bookmarkEnd w:id="21"/>
     </w:p>
     <w:p>
       <w:pPr>
@@ -3824,7 +4703,7 @@
 </file>
 
 <file path=word/numbering.xml><?xml version="1.0" encoding="utf-8"?>
-<w:numbering xmlns:wpc="http://schemas.microsoft.com/office/word/2010/wordprocessingCanvas" xmlns:cx="http://schemas.microsoft.com/office/drawing/2014/chartex" xmlns:cx1="http://schemas.microsoft.com/office/drawing/2015/9/8/chartex" xmlns:cx2="http://schemas.microsoft.com/office/drawing/2015/10/21/chartex" xmlns:cx3="http://schemas.microsoft.com/office/drawing/2016/5/9/chartex" xmlns:cx4="http://schemas.microsoft.com/office/drawing/2016/5/10/chartex" xmlns:cx5="http://schemas.microsoft.com/office/drawing/2016/5/11/chartex" xmlns:cx6="http://schemas.microsoft.com/office/drawing/2016/5/12/chartex" xmlns:cx7="http://schemas.microsoft.com/office/drawing/2016/5/13/chartex" xmlns:cx8="http://schemas.microsoft.com/office/drawing/2016/5/14/chartex" xmlns:mc="http://schemas.openxmlformats.org/markup-compatibility/2006" xmlns:aink="http://schemas.microsoft.com/office/drawing/2016/ink" xmlns:am3d="http://schemas.microsoft.com/office/drawing/2017/model3d" xmlns:o="urn:schemas-microsoft-com:office:office" xmlns:r="http://schemas.openxmlformats.org/officeDocument/2006/relationships" xmlns:m="http://schemas.openxmlformats.org/officeDocument/2006/math" xmlns:v="urn:schemas-microsoft-com:vml" xmlns:wp14="http://schemas.microsoft.com/office/word/2010/wordprocessingDrawing" xmlns:wp="http://schemas.openxmlformats.org/drawingml/2006/wordprocessingDrawing" xmlns:w10="urn:schemas-microsoft-com:office:word" xmlns:w="http://schemas.openxmlformats.org/wordprocessingml/2006/main" xmlns:w14="http://schemas.microsoft.com/office/word/2010/wordml" xmlns:w15="http://schemas.microsoft.com/office/word/2012/wordml" xmlns:w16cid="http://schemas.microsoft.com/office/word/2016/wordml/cid" xmlns:w16se="http://schemas.microsoft.com/office/word/2015/wordml/symex" xmlns:wpg="http://schemas.microsoft.com/office/word/2010/wordprocessingGroup" xmlns:wpi="http://schemas.microsoft.com/office/word/2010/wordprocessingInk" xmlns:wne="http://schemas.microsoft.com/office/word/2006/wordml" xmlns:wps="http://schemas.microsoft.com/office/word/2010/wordprocessingShape" mc:Ignorable="w14 w15 w16se w16cid wp14">
+<w:numbering xmlns:wpc="http://schemas.microsoft.com/office/word/2010/wordprocessingCanvas" xmlns:cx="http://schemas.microsoft.com/office/drawing/2014/chartex" xmlns:cx1="http://schemas.microsoft.com/office/drawing/2015/9/8/chartex" xmlns:cx2="http://schemas.microsoft.com/office/drawing/2015/10/21/chartex" xmlns:cx3="http://schemas.microsoft.com/office/drawing/2016/5/9/chartex" xmlns:cx4="http://schemas.microsoft.com/office/drawing/2016/5/10/chartex" xmlns:cx5="http://schemas.microsoft.com/office/drawing/2016/5/11/chartex" xmlns:cx6="http://schemas.microsoft.com/office/drawing/2016/5/12/chartex" xmlns:cx7="http://schemas.microsoft.com/office/drawing/2016/5/13/chartex" xmlns:cx8="http://schemas.microsoft.com/office/drawing/2016/5/14/chartex" xmlns:mc="http://schemas.openxmlformats.org/markup-compatibility/2006" xmlns:aink="http://schemas.microsoft.com/office/drawing/2016/ink" xmlns:am3d="http://schemas.microsoft.com/office/drawing/2017/model3d" xmlns:o="urn:schemas-microsoft-com:office:office" xmlns:oel="http://schemas.microsoft.com/office/2019/extlst" xmlns:r="http://schemas.openxmlformats.org/officeDocument/2006/relationships" xmlns:m="http://schemas.openxmlformats.org/officeDocument/2006/math" xmlns:v="urn:schemas-microsoft-com:vml" xmlns:wp14="http://schemas.microsoft.com/office/word/2010/wordprocessingDrawing" xmlns:wp="http://schemas.openxmlformats.org/drawingml/2006/wordprocessingDrawing" xmlns:w10="urn:schemas-microsoft-com:office:word" xmlns:w="http://schemas.openxmlformats.org/wordprocessingml/2006/main" xmlns:w14="http://schemas.microsoft.com/office/word/2010/wordml" xmlns:w15="http://schemas.microsoft.com/office/word/2012/wordml" xmlns:w16cex="http://schemas.microsoft.com/office/word/2018/wordml/cex" xmlns:w16cid="http://schemas.microsoft.com/office/word/2016/wordml/cid" xmlns:w16="http://schemas.microsoft.com/office/word/2018/wordml" xmlns:w16du="http://schemas.microsoft.com/office/word/2023/wordml/word16du" xmlns:w16sdtdh="http://schemas.microsoft.com/office/word/2020/wordml/sdtdatahash" xmlns:w16sdtfl="http://schemas.microsoft.com/office/word/2024/wordml/sdtformatlock" xmlns:w16se="http://schemas.microsoft.com/office/word/2015/wordml/symex" xmlns:wpg="http://schemas.microsoft.com/office/word/2010/wordprocessingGroup" xmlns:wpi="http://schemas.microsoft.com/office/word/2010/wordprocessingInk" xmlns:wne="http://schemas.microsoft.com/office/word/2006/wordml" xmlns:wps="http://schemas.microsoft.com/office/word/2010/wordprocessingShape" mc:Ignorable="w14 w15 w16se w16cid w16 w16cex w16sdtdh w16sdtfl w16du wp14">
   <w:abstractNum w:abstractNumId="0" w15:restartNumberingAfterBreak="0">
     <w:nsid w:val="22EF6F06"/>
     <w:multiLevelType w:val="hybridMultilevel"/>
@@ -4583,35 +5462,35 @@
       </w:pPr>
     </w:lvl>
   </w:abstractNum>
-  <w:num w:numId="1">
+  <w:num w:numId="1" w16cid:durableId="583956496">
     <w:abstractNumId w:val="5"/>
   </w:num>
-  <w:num w:numId="2">
+  <w:num w:numId="2" w16cid:durableId="1628707438">
     <w:abstractNumId w:val="6"/>
   </w:num>
-  <w:num w:numId="3">
+  <w:num w:numId="3" w16cid:durableId="1107388948">
     <w:abstractNumId w:val="3"/>
   </w:num>
-  <w:num w:numId="4">
+  <w:num w:numId="4" w16cid:durableId="1882087432">
     <w:abstractNumId w:val="4"/>
   </w:num>
-  <w:num w:numId="5">
+  <w:num w:numId="5" w16cid:durableId="177472015">
     <w:abstractNumId w:val="7"/>
   </w:num>
-  <w:num w:numId="6">
+  <w:num w:numId="6" w16cid:durableId="1226916489">
     <w:abstractNumId w:val="1"/>
   </w:num>
-  <w:num w:numId="7">
+  <w:num w:numId="7" w16cid:durableId="602538694">
     <w:abstractNumId w:val="2"/>
   </w:num>
-  <w:num w:numId="8">
+  <w:num w:numId="8" w16cid:durableId="839539077">
     <w:abstractNumId w:val="0"/>
   </w:num>
 </w:numbering>
 </file>
 
 <file path=word/styles.xml><?xml version="1.0" encoding="utf-8"?>
-<w:styles xmlns:mc="http://schemas.openxmlformats.org/markup-compatibility/2006" xmlns:r="http://schemas.openxmlformats.org/officeDocument/2006/relationships" xmlns:w="http://schemas.openxmlformats.org/wordprocessingml/2006/main" xmlns:w14="http://schemas.microsoft.com/office/word/2010/wordml" xmlns:w15="http://schemas.microsoft.com/office/word/2012/wordml" xmlns:w16cid="http://schemas.microsoft.com/office/word/2016/wordml/cid" xmlns:w16se="http://schemas.microsoft.com/office/word/2015/wordml/symex" mc:Ignorable="w14 w15 w16se w16cid">
+<w:styles xmlns:mc="http://schemas.openxmlformats.org/markup-compatibility/2006" xmlns:r="http://schemas.openxmlformats.org/officeDocument/2006/relationships" xmlns:w="http://schemas.openxmlformats.org/wordprocessingml/2006/main" xmlns:w14="http://schemas.microsoft.com/office/word/2010/wordml" xmlns:w15="http://schemas.microsoft.com/office/word/2012/wordml" xmlns:w16cex="http://schemas.microsoft.com/office/word/2018/wordml/cex" xmlns:w16cid="http://schemas.microsoft.com/office/word/2016/wordml/cid" xmlns:w16="http://schemas.microsoft.com/office/word/2018/wordml" xmlns:w16du="http://schemas.microsoft.com/office/word/2023/wordml/word16du" xmlns:w16sdtdh="http://schemas.microsoft.com/office/word/2020/wordml/sdtdatahash" xmlns:w16sdtfl="http://schemas.microsoft.com/office/word/2024/wordml/sdtformatlock" xmlns:w16se="http://schemas.microsoft.com/office/word/2015/wordml/symex" mc:Ignorable="w14 w15 w16se w16cid w16 w16cex w16sdtdh w16sdtfl w16du">
   <w:docDefaults>
     <w:rPrDefault>
       <w:rPr>
@@ -4629,7 +5508,7 @@
       </w:pPr>
     </w:pPrDefault>
   </w:docDefaults>
-  <w:latentStyles w:defLockedState="0" w:defUIPriority="99" w:defSemiHidden="0" w:defUnhideWhenUsed="0" w:defQFormat="0" w:count="375">
+  <w:latentStyles w:defLockedState="0" w:defUIPriority="99" w:defSemiHidden="0" w:defUnhideWhenUsed="0" w:defQFormat="0" w:count="376">
     <w:lsdException w:name="Normal" w:uiPriority="0" w:qFormat="1"/>
     <w:lsdException w:name="heading 1" w:uiPriority="9" w:qFormat="1"/>
     <w:lsdException w:name="heading 2" w:semiHidden="1" w:uiPriority="9" w:unhideWhenUsed="1" w:qFormat="1"/>
@@ -5005,6 +5884,7 @@
     <w:lsdException w:name="Smart Hyperlink" w:semiHidden="1" w:unhideWhenUsed="1"/>
     <w:lsdException w:name="Hashtag" w:semiHidden="1" w:unhideWhenUsed="1"/>
     <w:lsdException w:name="Unresolved Mention" w:semiHidden="1" w:unhideWhenUsed="1"/>
+    <w:lsdException w:name="Smart Link" w:semiHidden="1" w:unhideWhenUsed="1"/>
   </w:latentStyles>
   <w:style w:type="paragraph" w:default="1" w:styleId="Normal">
     <w:name w:val="Normal"/>

</xml_diff>

<commit_message>
Update COMP3000 Final Document.docx
</commit_message>
<xml_diff>
--- a/COMP3000 Final Document.docx
+++ b/COMP3000 Final Document.docx
@@ -2023,10 +2023,7 @@
         <w:t xml:space="preserve">will discuss the creation of a security-focussed web browser titled ‘Stronghold’. The purpose of this project is to teach children how to browse the internet safely, utilising behavioural conditioning and gamification aspects to do so. </w:t>
       </w:r>
       <w:r>
-        <w:t xml:space="preserve">The project was initially targeted towards the elderly due to their high presence as victims of malicious attacks such as phishing, however the decision to implement gamification led to a pivot to a target audience of young children who may benefit more from learning about internet safety before using less safe, unrestricted internet browsing. </w:t>
-      </w:r>
-      <w:r>
-        <w:t>Leaning towards behavioural conditioning then felt to be the best pivot since children can be easily manipulated when using positive reinforcement techniques. The project will finalise in a browser that will ensure the safety of children while online, mitigating the risk of malicious attacks and reducing the impact of attacks which are successful.</w:t>
+        <w:t>The project was initially targeted towards the elderly due to their high presence as victims of malicious attacks such as phishing, however the decision to implement gamification led to a pivot to a target audience of young children who may benefit more from learning about internet safety before using less safe, unrestricted internet browsing. Leaning towards behavioural conditioning then felt to be the best pivot since children can be easily manipulated when using positive reinforcement techniques. The project will finalise in a browser that will ensure the safety of children while online, mitigating the risk of malicious attacks and reducing the impact of attacks which are successful.</w:t>
       </w:r>
     </w:p>
     <w:p>
@@ -2034,16 +2031,10 @@
         <w:t xml:space="preserve">The report will cover </w:t>
       </w:r>
       <w:r>
-        <w:t>the initial design that had been planned for implementation, including wireframes, storyboards, flowcharts, and use cases for each initial page and feature, the methodology behind the development lifecycle</w:t>
-      </w:r>
-      <w:r>
-        <w:t xml:space="preserve">, </w:t>
-      </w:r>
-      <w:r>
-        <w:t>the main features that were both planned and implemented in the final design</w:t>
-      </w:r>
-      <w:r>
-        <w:t xml:space="preserve">, </w:t>
+        <w:t xml:space="preserve">the initial design that had been planned for implementation, including wireframes, storyboards, flowcharts, and use cases for each initial page and feature, the methodology behind the development lifecycle, </w:t>
+      </w:r>
+      <w:r>
+        <w:t xml:space="preserve">the main features that were both planned and implemented in the final design, </w:t>
       </w:r>
       <w:r>
         <w:t>the unique selling points that make the browser different from other products,</w:t>
@@ -2133,6 +2124,7 @@
           <w:sz w:val="28"/>
           <w:szCs w:val="28"/>
         </w:rPr>
+        <w:lastRenderedPageBreak/>
         <w:t>Wireframes</w:t>
       </w:r>
       <w:bookmarkEnd w:id="2"/>
@@ -2285,6 +2277,7 @@
           <w:sz w:val="24"/>
           <w:szCs w:val="24"/>
         </w:rPr>
+        <w:lastRenderedPageBreak/>
         <w:t>Dashboard</w:t>
       </w:r>
       <w:bookmarkEnd w:id="4"/>
@@ -2416,6 +2409,7 @@
     </w:p>
     <w:p>
       <w:r>
+        <w:lastRenderedPageBreak/>
         <w:t xml:space="preserve">At a basic level, the experience-based features, including user levels and experience point changes, the account feature, the hints, and the summary report are to be implemented. </w:t>
       </w:r>
     </w:p>
@@ -3089,6 +3083,50 @@
         <w:t>alerted</w:t>
       </w:r>
     </w:p>
+    <w:p>
+      <w:pPr>
+        <w:rPr>
+          <w:u w:val="single"/>
+        </w:rPr>
+      </w:pPr>
+      <w:r>
+        <w:rPr>
+          <w:u w:val="single"/>
+        </w:rPr>
+        <w:t>Case 3: Guest User Browsing</w:t>
+      </w:r>
+    </w:p>
+    <w:p>
+      <w:pPr>
+        <w:pStyle w:val="ListParagraph"/>
+        <w:numPr>
+          <w:ilvl w:val="0"/>
+          <w:numId w:val="1"/>
+        </w:numPr>
+      </w:pPr>
+    </w:p>
+    <w:p>
+      <w:pPr>
+        <w:rPr>
+          <w:u w:val="single"/>
+        </w:rPr>
+      </w:pPr>
+      <w:r>
+        <w:rPr>
+          <w:u w:val="single"/>
+        </w:rPr>
+        <w:t>Case 4: Parent Securing Child’s Settings</w:t>
+      </w:r>
+    </w:p>
+    <w:p>
+      <w:pPr>
+        <w:pStyle w:val="ListParagraph"/>
+        <w:numPr>
+          <w:ilvl w:val="0"/>
+          <w:numId w:val="1"/>
+        </w:numPr>
+      </w:pPr>
+    </w:p>
     <w:p/>
     <w:p>
       <w:pPr>
@@ -3113,10 +3151,14 @@
           <w:sz w:val="36"/>
           <w:szCs w:val="36"/>
         </w:rPr>
-        <w:lastRenderedPageBreak/>
         <w:t>Methodology</w:t>
       </w:r>
       <w:bookmarkEnd w:id="14"/>
+    </w:p>
+    <w:p>
+      <w:r>
+        <w:t xml:space="preserve">This section will discuss the methodology used throughout the development of the project, explaining the architecture used to develop this project, including for the main code and the database, the decision making behind some of the core security features, and a discussion on future enhancements which could be made to the browser. </w:t>
+      </w:r>
     </w:p>
     <w:p>
       <w:pPr>
@@ -3196,6 +3238,7 @@
         </w:numPr>
       </w:pPr>
       <w:r>
+        <w:lastRenderedPageBreak/>
         <w:t>ChatGPT was used for debugging purposes, to generate pseudocode, and for clarification of language (</w:t>
       </w:r>
       <w:hyperlink r:id="rId13" w:history="1">
@@ -3465,11 +3508,96 @@
         </w:numPr>
       </w:pPr>
       <w:r>
-        <w:t xml:space="preserve">Cookie scrapers can take things such as login tokens, which enables unauthorised access to websites like emails, usernames and passwords, which can be used to log into accounts for malicious purposes, and bank </w:t>
+        <w:t xml:space="preserve">Cookie scrapers can take things such as login tokens, which enables unauthorised access to websites like emails, usernames and passwords, which can be used to log into accounts for malicious purposes, and bank details, which can then lead to unauthorised use of bank cards and fraudulent transactions. </w:t>
+      </w:r>
+    </w:p>
+    <w:p>
+      <w:pPr>
+        <w:pStyle w:val="ListParagraph"/>
+        <w:numPr>
+          <w:ilvl w:val="1"/>
+          <w:numId w:val="1"/>
+        </w:numPr>
+      </w:pPr>
+      <w:r>
+        <w:t>This feature has been implemented fully in the final product.</w:t>
+      </w:r>
+    </w:p>
+    <w:p>
+      <w:pPr>
+        <w:pStyle w:val="ListParagraph"/>
+      </w:pPr>
+    </w:p>
+    <w:p>
+      <w:pPr>
+        <w:pStyle w:val="ListParagraph"/>
+        <w:numPr>
+          <w:ilvl w:val="0"/>
+          <w:numId w:val="1"/>
+        </w:numPr>
+      </w:pPr>
+      <w:r>
+        <w:t>Strong authentication for exporting cookies or saved passwords</w:t>
+      </w:r>
+      <w:r>
+        <w:t>:</w:t>
+      </w:r>
+      <w:r>
+        <w:t xml:space="preserve"> </w:t>
+      </w:r>
+    </w:p>
+    <w:p>
+      <w:pPr>
+        <w:pStyle w:val="ListParagraph"/>
+        <w:numPr>
+          <w:ilvl w:val="1"/>
+          <w:numId w:val="1"/>
+        </w:numPr>
+      </w:pPr>
+      <w:r>
+        <w:t>Prevents things such as cookie scrapers from being able to function as they cannot be exported / seen without correct authentication</w:t>
+      </w:r>
+      <w:r>
+        <w:t>.</w:t>
+      </w:r>
+      <w:r>
+        <w:t xml:space="preserve"> </w:t>
+      </w:r>
+    </w:p>
+    <w:p>
+      <w:pPr>
+        <w:pStyle w:val="ListParagraph"/>
+        <w:numPr>
+          <w:ilvl w:val="1"/>
+          <w:numId w:val="1"/>
+        </w:numPr>
+      </w:pPr>
+      <w:r>
+        <w:t xml:space="preserve">This was initially supposed to work alongside the setting which allowed the user to enable cookies should they wish, however since it was </w:t>
       </w:r>
       <w:r>
         <w:lastRenderedPageBreak/>
-        <w:t xml:space="preserve">details, which can then lead to unauthorised use of bank cards and fraudulent transactions. </w:t>
+        <w:t>decided to give all users non-changeable session only cookies, this felt like an unnecessary addition at this stage, especially with it being a stretch goal, therefore it did not make it into the final product.</w:t>
+      </w:r>
+    </w:p>
+    <w:p>
+      <w:pPr>
+        <w:pStyle w:val="ListParagraph"/>
+      </w:pPr>
+    </w:p>
+    <w:p>
+      <w:pPr>
+        <w:pStyle w:val="ListParagraph"/>
+        <w:numPr>
+          <w:ilvl w:val="0"/>
+          <w:numId w:val="1"/>
+        </w:numPr>
+      </w:pPr>
+      <w:r>
+        <w:t>Blocking non-HTTPS sites</w:t>
+      </w:r>
+      <w:r>
+        <w:t>:</w:t>
       </w:r>
     </w:p>
     <w:p>
@@ -3481,7 +3609,19 @@
         </w:numPr>
       </w:pPr>
       <w:r>
-        <w:t>This feature has been implemented fully in the final product.</w:t>
+        <w:t>Ensures that all sites which are accessed are using secure transmissions and therefore have a higher likelihood of safety</w:t>
+      </w:r>
+    </w:p>
+    <w:p>
+      <w:pPr>
+        <w:pStyle w:val="ListParagraph"/>
+        <w:numPr>
+          <w:ilvl w:val="1"/>
+          <w:numId w:val="1"/>
+        </w:numPr>
+      </w:pPr>
+      <w:r>
+        <w:t>Was not implemented as explained but was integrated as part of the risk score</w:t>
       </w:r>
     </w:p>
     <w:p>
@@ -3498,14 +3638,177 @@
         </w:numPr>
       </w:pPr>
       <w:r>
-        <w:t>Strong authentication for exporting cookies or saved passwords</w:t>
+        <w:t>Scanning files and blocking downloads of typically malicious extensions</w:t>
       </w:r>
       <w:r>
         <w:t>:</w:t>
       </w:r>
+    </w:p>
+    <w:p>
+      <w:pPr>
+        <w:pStyle w:val="ListParagraph"/>
+        <w:numPr>
+          <w:ilvl w:val="1"/>
+          <w:numId w:val="1"/>
+        </w:numPr>
+      </w:pPr>
+      <w:r>
+        <w:t xml:space="preserve"> i.e. .exe files</w:t>
+      </w:r>
+    </w:p>
+    <w:p>
+      <w:pPr>
+        <w:pStyle w:val="ListParagraph"/>
+        <w:numPr>
+          <w:ilvl w:val="1"/>
+          <w:numId w:val="1"/>
+        </w:numPr>
+      </w:pPr>
+      <w:r>
+        <w:t xml:space="preserve">Prevents any dangerous files from being downloaded accidentally </w:t>
+      </w:r>
+    </w:p>
+    <w:p>
+      <w:pPr>
+        <w:pStyle w:val="ListParagraph"/>
+        <w:numPr>
+          <w:ilvl w:val="1"/>
+          <w:numId w:val="1"/>
+        </w:numPr>
+      </w:pPr>
+      <w:r>
+        <w:t>Since the browser is targeted to children, they shouldn’t really be downloading things anyway without at least their parent’s permission; also means that they can’t be run which takes stress away from needing antivirus</w:t>
+      </w:r>
+    </w:p>
+    <w:p>
+      <w:pPr>
+        <w:pStyle w:val="ListParagraph"/>
+      </w:pPr>
+    </w:p>
+    <w:p>
+      <w:pPr>
+        <w:pStyle w:val="ListParagraph"/>
+        <w:numPr>
+          <w:ilvl w:val="0"/>
+          <w:numId w:val="1"/>
+        </w:numPr>
+      </w:pPr>
+      <w:r>
+        <w:t>TLS Certificate Checking</w:t>
+      </w:r>
+      <w:r>
+        <w:t>:</w:t>
+      </w:r>
+    </w:p>
+    <w:p>
+      <w:pPr>
+        <w:pStyle w:val="ListParagraph"/>
+        <w:numPr>
+          <w:ilvl w:val="1"/>
+          <w:numId w:val="1"/>
+        </w:numPr>
+      </w:pPr>
+      <w:r>
+        <w:t>Ensures that websites can be trusted by verifying the connection is secure and encrypted</w:t>
+      </w:r>
+    </w:p>
+    <w:p>
+      <w:pPr>
+        <w:pStyle w:val="ListParagraph"/>
+      </w:pPr>
+    </w:p>
+    <w:p>
+      <w:pPr>
+        <w:pStyle w:val="ListParagraph"/>
+        <w:numPr>
+          <w:ilvl w:val="0"/>
+          <w:numId w:val="1"/>
+        </w:numPr>
+      </w:pPr>
+      <w:r>
+        <w:t>Security Based Hints – The main goal of the browser is to encourage safe browsing habits within children, so by including hints and tips when there is a learning opportunity, this will engage their brains to think about what they are doing. Additionally, these hints will tie into the gamification aspect of the browser which shou</w:t>
+      </w:r>
+      <w:r>
+        <w:t>ld act as a way of engagement too.</w:t>
+      </w:r>
+    </w:p>
+    <w:p>
+      <w:pPr>
+        <w:pStyle w:val="ListParagraph"/>
+      </w:pPr>
+    </w:p>
+    <w:p>
+      <w:pPr>
+        <w:pStyle w:val="ListParagraph"/>
+        <w:numPr>
+          <w:ilvl w:val="0"/>
+          <w:numId w:val="1"/>
+        </w:numPr>
+      </w:pPr>
+      <w:r>
+        <w:t>Domain detection</w:t>
+      </w:r>
+      <w:r>
+        <w:t xml:space="preserve"> – </w:t>
+      </w:r>
+    </w:p>
+    <w:p>
+      <w:pPr>
+        <w:pStyle w:val="ListParagraph"/>
+      </w:pPr>
+    </w:p>
+    <w:p>
+      <w:pPr>
+        <w:pStyle w:val="ListParagraph"/>
+        <w:numPr>
+          <w:ilvl w:val="0"/>
+          <w:numId w:val="1"/>
+        </w:numPr>
+      </w:pPr>
+      <w:r>
+        <w:t xml:space="preserve">Override </w:t>
+      </w:r>
+      <w:r>
+        <w:t>M</w:t>
+      </w:r>
+      <w:r>
+        <w:t>ethods</w:t>
+      </w:r>
+      <w:r>
+        <w:t xml:space="preserve"> –</w:t>
+      </w:r>
+      <w:r>
+        <w:t xml:space="preserve"> Allows the browser to be used by people of all ages, rather than JUST children by giving them an override to download certain file types or access certain restricted websites etc. Also allows parents to give their children possibly temporary access to these features, maybe use something like a limited time request sent to the parent’s email or SMS, or use something like a specific pin (or have them type something like “I ACKNOWLEDGE” with an explanation pop-up so they are at least aware of the risks)</w:t>
+      </w:r>
+    </w:p>
+    <w:p>
+      <w:pPr>
+        <w:pStyle w:val="ListParagraph"/>
+      </w:pPr>
+    </w:p>
+    <w:p>
+      <w:pPr>
+        <w:pStyle w:val="ListParagraph"/>
+        <w:numPr>
+          <w:ilvl w:val="0"/>
+          <w:numId w:val="1"/>
+        </w:numPr>
+      </w:pPr>
+      <w:r>
+        <w:t>Parental</w:t>
+      </w:r>
       <w:r>
         <w:t xml:space="preserve"> </w:t>
       </w:r>
+      <w:r>
+        <w:t>C</w:t>
+      </w:r>
+      <w:r>
+        <w:t>ontrols</w:t>
+      </w:r>
+      <w:r>
+        <w:t>:</w:t>
+      </w:r>
     </w:p>
     <w:p>
       <w:pPr>
@@ -3516,14 +3819,48 @@
         </w:numPr>
       </w:pPr>
       <w:r>
-        <w:t>Prevents things such as cookie scrapers from being able to function as they cannot be exported / seen without correct authentication</w:t>
-      </w:r>
-      <w:r>
-        <w:t>.</w:t>
-      </w:r>
-      <w:r>
         <w:t xml:space="preserve"> </w:t>
       </w:r>
+      <w:r>
+        <w:t>Considered allowing user to input date of birth on first sign in then asking for another user sign in (parent) if under 13</w:t>
+      </w:r>
+    </w:p>
+    <w:p>
+      <w:pPr>
+        <w:pStyle w:val="ListParagraph"/>
+        <w:numPr>
+          <w:ilvl w:val="2"/>
+          <w:numId w:val="1"/>
+        </w:numPr>
+      </w:pPr>
+      <w:r>
+        <w:lastRenderedPageBreak/>
+        <w:t>Child could lie about their date of birth to not need a parent login</w:t>
+      </w:r>
+    </w:p>
+    <w:p>
+      <w:pPr>
+        <w:pStyle w:val="ListParagraph"/>
+        <w:numPr>
+          <w:ilvl w:val="2"/>
+          <w:numId w:val="1"/>
+        </w:numPr>
+      </w:pPr>
+      <w:r>
+        <w:t>Child could sign in with a separate google account they own to act as a parent without an actual parent signing in</w:t>
+      </w:r>
+    </w:p>
+    <w:p>
+      <w:pPr>
+        <w:pStyle w:val="ListParagraph"/>
+        <w:numPr>
+          <w:ilvl w:val="2"/>
+          <w:numId w:val="1"/>
+        </w:numPr>
+      </w:pPr>
+      <w:r>
+        <w:t>Requires linking 2 google accounts sign in states which makes problems in firebase</w:t>
+      </w:r>
     </w:p>
     <w:p>
       <w:pPr>
@@ -3534,12 +3871,61 @@
         </w:numPr>
       </w:pPr>
       <w:r>
-        <w:t>This was initially supposed to work alongside the setting which allowed the user to enable cookies should they wish, however since it was decided to give all users non-changeable session only cookies, this felt like an unnecessary addition at this stage, especially with it being a stretch goal, therefore it did not make it into the final product.</w:t>
-      </w:r>
-    </w:p>
-    <w:p>
-      <w:pPr>
-        <w:pStyle w:val="ListParagraph"/>
+        <w:t>Workaround is to add a button in the settings menu to ‘add a pin’ which is then asked for whenever a setting that affects security needs to be changed</w:t>
+      </w:r>
+    </w:p>
+    <w:p>
+      <w:pPr>
+        <w:pStyle w:val="ListParagraph"/>
+        <w:numPr>
+          <w:ilvl w:val="2"/>
+          <w:numId w:val="1"/>
+        </w:numPr>
+      </w:pPr>
+      <w:r>
+        <w:t>I.e. user tries to change the ability to allow HTTP – this asks for a pin if one is set up (ignores if no pin is set)</w:t>
+      </w:r>
+    </w:p>
+    <w:p>
+      <w:pPr>
+        <w:pStyle w:val="ListParagraph"/>
+        <w:numPr>
+          <w:ilvl w:val="2"/>
+          <w:numId w:val="1"/>
+        </w:numPr>
+      </w:pPr>
+      <w:r>
+        <w:t>Since main use will be parents setting up for their kids having it as part of the setup process ensures that a pin will be set</w:t>
+      </w:r>
+    </w:p>
+    <w:p>
+      <w:pPr>
+        <w:pStyle w:val="ListParagraph"/>
+        <w:numPr>
+          <w:ilvl w:val="1"/>
+          <w:numId w:val="1"/>
+        </w:numPr>
+      </w:pPr>
+      <w:r>
+        <w:t xml:space="preserve"> Require pin to be 6-digit and is only set when forced if signed into an account and user actively enables pin on start up</w:t>
+      </w:r>
+    </w:p>
+    <w:p>
+      <w:pPr>
+        <w:pStyle w:val="ListParagraph"/>
+        <w:numPr>
+          <w:ilvl w:val="1"/>
+          <w:numId w:val="1"/>
+        </w:numPr>
+      </w:pPr>
+      <w:r>
+        <w:t>Use firebase persistence mode to make sure the child cannot simply close the browser to bypass pin</w:t>
+      </w:r>
+    </w:p>
+    <w:p>
+      <w:pPr>
+        <w:pStyle w:val="ListParagraph"/>
+        <w:ind w:left="1440"/>
       </w:pPr>
     </w:p>
     <w:p>
@@ -3550,9 +3936,11 @@
           <w:numId w:val="1"/>
         </w:numPr>
       </w:pPr>
-      <w:r>
-        <w:t>Blocking non-HTTPS sites</w:t>
-      </w:r>
+      <w:bookmarkStart w:id="16" w:name="_Toc227007186"/>
+      <w:r>
+        <w:t>AI Chatbot</w:t>
+      </w:r>
+      <w:bookmarkEnd w:id="16"/>
       <w:r>
         <w:t>:</w:t>
       </w:r>
@@ -3566,7 +3954,7 @@
         </w:numPr>
       </w:pPr>
       <w:r>
-        <w:t>Ensures that all sites which are accessed are using secure transmissions and therefore have a higher likelihood of safety</w:t>
+        <w:t>Plug in Gemini AI</w:t>
       </w:r>
     </w:p>
     <w:p>
@@ -3578,12 +3966,13 @@
         </w:numPr>
       </w:pPr>
       <w:r>
-        <w:t>Was not implemented as explained but was integrated as part of the risk score</w:t>
-      </w:r>
-    </w:p>
-    <w:p>
-      <w:pPr>
-        <w:pStyle w:val="ListParagraph"/>
+        <w:t>Was not implemented</w:t>
+      </w:r>
+    </w:p>
+    <w:p>
+      <w:pPr>
+        <w:pStyle w:val="ListParagraph"/>
+        <w:ind w:left="1440"/>
       </w:pPr>
     </w:p>
     <w:p>
@@ -3594,9 +3983,11 @@
           <w:numId w:val="1"/>
         </w:numPr>
       </w:pPr>
-      <w:r>
-        <w:t>Scanning files and blocking downloads of typically malicious extensions</w:t>
-      </w:r>
+      <w:bookmarkStart w:id="17" w:name="_Toc227007187"/>
+      <w:r>
+        <w:t>Built in VPN</w:t>
+      </w:r>
+      <w:bookmarkEnd w:id="17"/>
       <w:r>
         <w:t>:</w:t>
       </w:r>
@@ -3610,7 +4001,7 @@
         </w:numPr>
       </w:pPr>
       <w:r>
-        <w:t xml:space="preserve"> i.e. .exe files</w:t>
+        <w:t>Plug into free VPN provider</w:t>
       </w:r>
     </w:p>
     <w:p>
@@ -3622,19 +4013,7 @@
         </w:numPr>
       </w:pPr>
       <w:r>
-        <w:t xml:space="preserve">Prevents any dangerous files from being downloaded accidentally </w:t>
-      </w:r>
-    </w:p>
-    <w:p>
-      <w:pPr>
-        <w:pStyle w:val="ListParagraph"/>
-        <w:numPr>
-          <w:ilvl w:val="1"/>
-          <w:numId w:val="1"/>
-        </w:numPr>
-      </w:pPr>
-      <w:r>
-        <w:t>Since the browser is targeted to children, they shouldn’t really be downloading things anyway without at least their parent’s permission; also means that they can’t be run which takes stress away from needing antivirus</w:t>
+        <w:t>Was not implemented</w:t>
       </w:r>
     </w:p>
     <w:p>
@@ -3651,22 +4030,19 @@
         </w:numPr>
       </w:pPr>
       <w:r>
-        <w:t>TLS Certificate Checking</w:t>
-      </w:r>
-      <w:r>
-        <w:t>:</w:t>
-      </w:r>
-    </w:p>
-    <w:p>
-      <w:pPr>
-        <w:pStyle w:val="ListParagraph"/>
-        <w:numPr>
-          <w:ilvl w:val="1"/>
-          <w:numId w:val="1"/>
-        </w:numPr>
-      </w:pPr>
-      <w:r>
-        <w:t>Ensures that websites can be trusted by verifying the connection is secure and encrypted</w:t>
+        <w:t>Security Dashboard</w:t>
+      </w:r>
+      <w:r>
+        <w:t xml:space="preserve"> –</w:t>
+      </w:r>
+      <w:r>
+        <w:t xml:space="preserve"> This will be a central place that users can navigate to which will store data to determine how secure their browsing habits have been. It will include things like how many times they have overridden blocks, how many times they have attempted to visit blocked sites etc. The dashboard will also be the location of where they can customise the browser, and where they will see how many experience </w:t>
+      </w:r>
+      <w:r>
+        <w:t>points</w:t>
+      </w:r>
+      <w:r>
+        <w:t xml:space="preserve"> they have and what level they are. Lastly, this will be where the quizzes and potential games are stored to allow them to gain bonus points for learning about safe browsing</w:t>
       </w:r>
     </w:p>
     <w:p>
@@ -3683,353 +4059,17 @@
         </w:numPr>
       </w:pPr>
       <w:r>
-        <w:t>Security Based Hints – The main goal of the browser is to encourage safe browsing habits within children, so by including hints and tips when there is a learning opportunity, this will engage their brains to think about what they are doing. Additionally, these hints will tie into the gamification aspect of the browser which shou</w:t>
-      </w:r>
-      <w:r>
-        <w:t>ld act as a way of engagement too.</w:t>
-      </w:r>
-    </w:p>
-    <w:p>
-      <w:pPr>
-        <w:pStyle w:val="ListParagraph"/>
-      </w:pPr>
-    </w:p>
-    <w:p>
-      <w:pPr>
-        <w:pStyle w:val="ListParagraph"/>
-        <w:numPr>
-          <w:ilvl w:val="0"/>
-          <w:numId w:val="1"/>
-        </w:numPr>
-      </w:pPr>
-      <w:r>
-        <w:t>Domain detection</w:t>
-      </w:r>
-      <w:r>
-        <w:t xml:space="preserve"> – </w:t>
-      </w:r>
-    </w:p>
-    <w:p>
-      <w:pPr>
-        <w:pStyle w:val="ListParagraph"/>
-      </w:pPr>
-    </w:p>
-    <w:p>
-      <w:pPr>
-        <w:pStyle w:val="ListParagraph"/>
-        <w:numPr>
-          <w:ilvl w:val="0"/>
-          <w:numId w:val="1"/>
-        </w:numPr>
-      </w:pPr>
-      <w:r>
-        <w:t xml:space="preserve">Override </w:t>
-      </w:r>
-      <w:r>
-        <w:t>M</w:t>
-      </w:r>
-      <w:r>
-        <w:t>ethods</w:t>
-      </w:r>
-      <w:r>
-        <w:t xml:space="preserve"> –</w:t>
-      </w:r>
-      <w:r>
-        <w:t xml:space="preserve"> Allows the browser to be used by people of all ages, rather than JUST children by giving them an override to download certain file types or </w:t>
+        <w:t>Gamification –</w:t>
+      </w:r>
+      <w:r>
+        <w:t xml:space="preserve"> </w:t>
+      </w:r>
+      <w:r>
+        <w:t xml:space="preserve">The dashboard will contain a variety of gamified aspects for the user to keep them engaged and to encourage continuous use of the browser. These will include quizzes (singular daily quiz and 10 weekly questions focussed on security and safe browsing), challenges which encourage the user to perform safe browsing actions in exchange for a reward, experience points which can be earned from a variety of sources (including the quizzes and challenges), and </w:t>
       </w:r>
       <w:r>
         <w:lastRenderedPageBreak/>
-        <w:t>access certain restricted websites etc. Also allows parents to give their children possibly temporary access to these features, maybe use something like a limited time request sent to the parent’s email or SMS, or use something like a specific pin (or have them type something like “I ACKNOWLEDGE” with an explanation pop-up so they are at least aware of the risks)</w:t>
-      </w:r>
-    </w:p>
-    <w:p>
-      <w:pPr>
-        <w:pStyle w:val="ListParagraph"/>
-      </w:pPr>
-    </w:p>
-    <w:p>
-      <w:pPr>
-        <w:pStyle w:val="ListParagraph"/>
-        <w:numPr>
-          <w:ilvl w:val="0"/>
-          <w:numId w:val="1"/>
-        </w:numPr>
-      </w:pPr>
-      <w:r>
-        <w:t>Parental</w:t>
-      </w:r>
-      <w:r>
-        <w:t xml:space="preserve"> </w:t>
-      </w:r>
-      <w:r>
-        <w:t>C</w:t>
-      </w:r>
-      <w:r>
-        <w:t>ontrols</w:t>
-      </w:r>
-      <w:r>
-        <w:t>:</w:t>
-      </w:r>
-    </w:p>
-    <w:p>
-      <w:pPr>
-        <w:pStyle w:val="ListParagraph"/>
-        <w:numPr>
-          <w:ilvl w:val="1"/>
-          <w:numId w:val="1"/>
-        </w:numPr>
-      </w:pPr>
-      <w:r>
-        <w:t xml:space="preserve"> </w:t>
-      </w:r>
-      <w:r>
-        <w:t>Considered allowing user to input date of birth on first sign in then asking for another user sign in (parent) if under 13</w:t>
-      </w:r>
-    </w:p>
-    <w:p>
-      <w:pPr>
-        <w:pStyle w:val="ListParagraph"/>
-        <w:numPr>
-          <w:ilvl w:val="2"/>
-          <w:numId w:val="1"/>
-        </w:numPr>
-      </w:pPr>
-      <w:r>
-        <w:t>Child could lie about their date of birth to not need a parent login</w:t>
-      </w:r>
-    </w:p>
-    <w:p>
-      <w:pPr>
-        <w:pStyle w:val="ListParagraph"/>
-        <w:numPr>
-          <w:ilvl w:val="2"/>
-          <w:numId w:val="1"/>
-        </w:numPr>
-      </w:pPr>
-      <w:r>
-        <w:t>Child could sign in with a separate google account they own to act as a parent without an actual parent signing in</w:t>
-      </w:r>
-    </w:p>
-    <w:p>
-      <w:pPr>
-        <w:pStyle w:val="ListParagraph"/>
-        <w:numPr>
-          <w:ilvl w:val="2"/>
-          <w:numId w:val="1"/>
-        </w:numPr>
-      </w:pPr>
-      <w:r>
-        <w:t>Requires linking 2 google accounts sign in states which makes problems in firebase</w:t>
-      </w:r>
-    </w:p>
-    <w:p>
-      <w:pPr>
-        <w:pStyle w:val="ListParagraph"/>
-        <w:numPr>
-          <w:ilvl w:val="1"/>
-          <w:numId w:val="1"/>
-        </w:numPr>
-      </w:pPr>
-      <w:r>
-        <w:t>Workaround is to add a button in the settings menu to ‘add a pin’ which is then asked for whenever a setting that affects security needs to be changed</w:t>
-      </w:r>
-    </w:p>
-    <w:p>
-      <w:pPr>
-        <w:pStyle w:val="ListParagraph"/>
-        <w:numPr>
-          <w:ilvl w:val="2"/>
-          <w:numId w:val="1"/>
-        </w:numPr>
-      </w:pPr>
-      <w:r>
-        <w:t>I.e. user tries to change the ability to allow HTTP – this asks for a pin if one is set up (ignores if no pin is set)</w:t>
-      </w:r>
-    </w:p>
-    <w:p>
-      <w:pPr>
-        <w:pStyle w:val="ListParagraph"/>
-        <w:numPr>
-          <w:ilvl w:val="2"/>
-          <w:numId w:val="1"/>
-        </w:numPr>
-      </w:pPr>
-      <w:r>
-        <w:t>Since main use will be parents setting up for their kids having it as part of the setup process ensures that a pin will be set</w:t>
-      </w:r>
-    </w:p>
-    <w:p>
-      <w:pPr>
-        <w:pStyle w:val="ListParagraph"/>
-        <w:numPr>
-          <w:ilvl w:val="1"/>
-          <w:numId w:val="1"/>
-        </w:numPr>
-      </w:pPr>
-      <w:r>
-        <w:t xml:space="preserve"> Require pin to be 6-digit and is only set when forced if signed into an account and user actively enables pin on start up</w:t>
-      </w:r>
-    </w:p>
-    <w:p>
-      <w:pPr>
-        <w:pStyle w:val="ListParagraph"/>
-        <w:numPr>
-          <w:ilvl w:val="1"/>
-          <w:numId w:val="1"/>
-        </w:numPr>
-      </w:pPr>
-      <w:r>
-        <w:t>Use firebase persistence mode to make sure the child cannot simply close the browser to bypass pin</w:t>
-      </w:r>
-    </w:p>
-    <w:p>
-      <w:pPr>
-        <w:pStyle w:val="ListParagraph"/>
-        <w:ind w:left="1440"/>
-      </w:pPr>
-    </w:p>
-    <w:p>
-      <w:pPr>
-        <w:pStyle w:val="ListParagraph"/>
-        <w:numPr>
-          <w:ilvl w:val="0"/>
-          <w:numId w:val="1"/>
-        </w:numPr>
-      </w:pPr>
-      <w:bookmarkStart w:id="16" w:name="_Toc227007186"/>
-      <w:r>
-        <w:t>AI Chatbot</w:t>
-      </w:r>
-      <w:bookmarkEnd w:id="16"/>
-      <w:r>
-        <w:t>:</w:t>
-      </w:r>
-    </w:p>
-    <w:p>
-      <w:pPr>
-        <w:pStyle w:val="ListParagraph"/>
-        <w:numPr>
-          <w:ilvl w:val="1"/>
-          <w:numId w:val="1"/>
-        </w:numPr>
-      </w:pPr>
-      <w:r>
-        <w:t>Plug in Gemini AI</w:t>
-      </w:r>
-    </w:p>
-    <w:p>
-      <w:pPr>
-        <w:pStyle w:val="ListParagraph"/>
-        <w:numPr>
-          <w:ilvl w:val="1"/>
-          <w:numId w:val="1"/>
-        </w:numPr>
-      </w:pPr>
-      <w:r>
-        <w:t>Was not implemented</w:t>
-      </w:r>
-    </w:p>
-    <w:p>
-      <w:pPr>
-        <w:pStyle w:val="ListParagraph"/>
-        <w:ind w:left="1440"/>
-      </w:pPr>
-    </w:p>
-    <w:p>
-      <w:pPr>
-        <w:pStyle w:val="ListParagraph"/>
-        <w:numPr>
-          <w:ilvl w:val="0"/>
-          <w:numId w:val="1"/>
-        </w:numPr>
-      </w:pPr>
-      <w:bookmarkStart w:id="17" w:name="_Toc227007187"/>
-      <w:r>
-        <w:t>Built in VPN</w:t>
-      </w:r>
-      <w:bookmarkEnd w:id="17"/>
-      <w:r>
-        <w:t>:</w:t>
-      </w:r>
-    </w:p>
-    <w:p>
-      <w:pPr>
-        <w:pStyle w:val="ListParagraph"/>
-        <w:numPr>
-          <w:ilvl w:val="1"/>
-          <w:numId w:val="1"/>
-        </w:numPr>
-      </w:pPr>
-      <w:r>
-        <w:t>Plug into free VPN provider</w:t>
-      </w:r>
-    </w:p>
-    <w:p>
-      <w:pPr>
-        <w:pStyle w:val="ListParagraph"/>
-        <w:numPr>
-          <w:ilvl w:val="1"/>
-          <w:numId w:val="1"/>
-        </w:numPr>
-      </w:pPr>
-      <w:r>
-        <w:t>Was not implemented</w:t>
-      </w:r>
-    </w:p>
-    <w:p>
-      <w:pPr>
-        <w:pStyle w:val="ListParagraph"/>
-      </w:pPr>
-    </w:p>
-    <w:p>
-      <w:pPr>
-        <w:pStyle w:val="ListParagraph"/>
-        <w:numPr>
-          <w:ilvl w:val="0"/>
-          <w:numId w:val="1"/>
-        </w:numPr>
-      </w:pPr>
-      <w:r>
-        <w:t>Security Dashboard</w:t>
-      </w:r>
-      <w:r>
-        <w:t xml:space="preserve"> –</w:t>
-      </w:r>
-      <w:r>
-        <w:t xml:space="preserve"> This will be a central place that users can navigate to which will store data to determine how secure their browsing habits have been. It will include things like how many times they have overridden blocks, how many times they have attempted to visit blocked sites etc. The dashboard will also be the location of where they can customise the browser, and where they will see how many experience </w:t>
-      </w:r>
-      <w:r>
-        <w:t>points</w:t>
-      </w:r>
-      <w:r>
-        <w:t xml:space="preserve"> they have and what level they are. Lastly, this will be </w:t>
-      </w:r>
-      <w:r>
-        <w:lastRenderedPageBreak/>
-        <w:t>where the quizzes and potential games are stored to allow them to gain bonus points for learning about safe browsing</w:t>
-      </w:r>
-    </w:p>
-    <w:p>
-      <w:pPr>
-        <w:pStyle w:val="ListParagraph"/>
-      </w:pPr>
-    </w:p>
-    <w:p>
-      <w:pPr>
-        <w:pStyle w:val="ListParagraph"/>
-        <w:numPr>
-          <w:ilvl w:val="0"/>
-          <w:numId w:val="1"/>
-        </w:numPr>
-      </w:pPr>
-      <w:r>
-        <w:t>Gamification –</w:t>
-      </w:r>
-      <w:r>
-        <w:t xml:space="preserve"> </w:t>
-      </w:r>
-      <w:r>
-        <w:t>The dashboard will contain a variety of gamified aspects for the user to keep them engaged and to encourage continuous use of the browser. These will include quizzes (singular daily quiz and 10 weekly questions focussed on security and safe browsing), challenges which encourage the user to perform safe browsing actions in exchange for a reward, experience points which can be earned from a variety of sources (including the quizzes and challenges), and cosmetic unlocks which encourage the user to level up their account, providing unique customisation which they can look forward to unlocking.</w:t>
+        <w:t>cosmetic unlocks which encourage the user to level up their account, providing unique customisation which they can look forward to unlocking.</w:t>
       </w:r>
     </w:p>
     <w:p>
@@ -4203,37 +4243,37 @@
           <w:sz w:val="36"/>
           <w:szCs w:val="36"/>
         </w:rPr>
+        <w:t>Testing</w:t>
+      </w:r>
+      <w:bookmarkEnd w:id="19"/>
+    </w:p>
+    <w:p>
+      <w:r>
+        <w:t>This section will detail the entire testing methodology, including who was chosen and why, what kind of tests were performed, what feedback was provided from participants, and how the provided feedback was used to make improvements to the project.</w:t>
+      </w:r>
+    </w:p>
+    <w:p>
+      <w:pPr>
+        <w:pStyle w:val="ListParagraph"/>
+        <w:numPr>
+          <w:ilvl w:val="0"/>
+          <w:numId w:val="1"/>
+        </w:numPr>
+      </w:pPr>
+      <w:r>
+        <w:t>Will get several people to test the browser and answer a Google Form with a variety of questions to get an understanding of what they like and what should change</w:t>
+      </w:r>
+    </w:p>
+    <w:p>
+      <w:pPr>
+        <w:pStyle w:val="ListParagraph"/>
+        <w:numPr>
+          <w:ilvl w:val="0"/>
+          <w:numId w:val="1"/>
+        </w:numPr>
+      </w:pPr>
+      <w:r>
         <w:lastRenderedPageBreak/>
-        <w:t>Testing</w:t>
-      </w:r>
-      <w:bookmarkEnd w:id="19"/>
-    </w:p>
-    <w:p>
-      <w:r>
-        <w:t>This section will detail the entire testing methodology, including who was chosen and why, what kind of tests were performed, what feedback was provided from participants, and how the provided feedback was used to make improvements to the project.</w:t>
-      </w:r>
-    </w:p>
-    <w:p>
-      <w:pPr>
-        <w:pStyle w:val="ListParagraph"/>
-        <w:numPr>
-          <w:ilvl w:val="0"/>
-          <w:numId w:val="1"/>
-        </w:numPr>
-      </w:pPr>
-      <w:r>
-        <w:t>Will get several people to test the browser and answer a Google Form with a variety of questions to get an understanding of what they like and what should change</w:t>
-      </w:r>
-    </w:p>
-    <w:p>
-      <w:pPr>
-        <w:pStyle w:val="ListParagraph"/>
-        <w:numPr>
-          <w:ilvl w:val="0"/>
-          <w:numId w:val="1"/>
-        </w:numPr>
-      </w:pPr>
-      <w:r>
         <w:t>Test both initial wireframes (so I can change before proper development begins), and with the final design (so I can make changes before the VIVA and final presentation)</w:t>
       </w:r>
     </w:p>
@@ -4422,6 +4462,7 @@
           <w:sz w:val="32"/>
           <w:szCs w:val="32"/>
         </w:rPr>
+        <w:lastRenderedPageBreak/>
         <w:t>Database</w:t>
       </w:r>
       <w:bookmarkEnd w:id="22"/>
@@ -4828,6 +4869,7 @@
         </w:numPr>
       </w:pPr>
       <w:r>
+        <w:lastRenderedPageBreak/>
         <w:t>Disabled</w:t>
       </w:r>
     </w:p>
@@ -5133,7 +5175,6 @@
         </w:numPr>
       </w:pPr>
       <w:r>
-        <w:lastRenderedPageBreak/>
         <w:t>When first starting the browser, it should ask the user to sign into a google account, or browse as guest – this allows private browsing</w:t>
       </w:r>
     </w:p>
@@ -5162,6 +5203,7 @@
           <w:sz w:val="32"/>
           <w:szCs w:val="32"/>
         </w:rPr>
+        <w:lastRenderedPageBreak/>
         <w:t>Risk Score Calculation</w:t>
       </w:r>
       <w:bookmarkEnd w:id="24"/>
@@ -5295,7 +5337,15 @@
         </w:numPr>
       </w:pPr>
       <w:r>
-        <w:t>If it contains ‘xn--’ which indicates a homograph attack since browsers represent Unicode as that</w:t>
+        <w:t>If it contains ‘</w:t>
+      </w:r>
+      <w:proofErr w:type="spellStart"/>
+      <w:r>
+        <w:t>xn</w:t>
+      </w:r>
+      <w:proofErr w:type="spellEnd"/>
+      <w:r>
+        <w:t>--’ which indicates a homograph attack since browsers represent Unicode as that</w:t>
       </w:r>
     </w:p>
     <w:p>
@@ -5379,7 +5429,15 @@
         </w:numPr>
       </w:pPr>
       <w:r>
-        <w:t>Runs the domain name through a WhoIs search and adds to the risk score if the age of the domain is relatively new:</w:t>
+        <w:t xml:space="preserve">Runs the domain name through a </w:t>
+      </w:r>
+      <w:proofErr w:type="spellStart"/>
+      <w:r>
+        <w:t>WhoIs</w:t>
+      </w:r>
+      <w:proofErr w:type="spellEnd"/>
+      <w:r>
+        <w:t xml:space="preserve"> search and adds to the risk score if the age of the domain is relatively new:</w:t>
       </w:r>
     </w:p>
     <w:p>
@@ -5454,8 +5512,61 @@
         </w:numPr>
       </w:pPr>
       <w:r>
+        <w:t>Checks all the HTTP headers from the website and adds to the risk score depending on whether they are there or not (or vice versa for some which are dangerous to have)</w:t>
+      </w:r>
+    </w:p>
+    <w:p>
+      <w:pPr>
+        <w:pStyle w:val="ListParagraph"/>
+        <w:numPr>
+          <w:ilvl w:val="3"/>
+          <w:numId w:val="1"/>
+        </w:numPr>
+      </w:pPr>
+      <w:r>
+        <w:t>Used the following site to get all the headers that could be present:</w:t>
+      </w:r>
+    </w:p>
+    <w:p>
+      <w:pPr>
+        <w:pStyle w:val="ListParagraph"/>
+        <w:numPr>
+          <w:ilvl w:val="4"/>
+          <w:numId w:val="1"/>
+        </w:numPr>
+      </w:pPr>
+      <w:r>
+        <w:t>https://cheatsheetseries.owasp.org/cheatsheets/HTTP_Headers_Cheat_Sheet.html</w:t>
+      </w:r>
+    </w:p>
+    <w:p>
+      <w:pPr>
+        <w:pStyle w:val="ListParagraph"/>
+        <w:numPr>
+          <w:ilvl w:val="3"/>
+          <w:numId w:val="1"/>
+        </w:numPr>
+      </w:pPr>
+      <w:r>
         <w:lastRenderedPageBreak/>
-        <w:t>Checks all the HTTP headers from the website and adds to the risk score depending on whether they are there or not (or vice versa for some which are dangerous to have)</w:t>
+        <w:t>Filtered through to then determine which headers are security-focussed and which ones aren’t to make sure there wasn’t excessive flagging</w:t>
+      </w:r>
+    </w:p>
+    <w:p>
+      <w:pPr>
+        <w:pStyle w:val="ListParagraph"/>
+        <w:numPr>
+          <w:ilvl w:val="2"/>
+          <w:numId w:val="1"/>
+        </w:numPr>
+      </w:pPr>
+      <w:proofErr w:type="spellStart"/>
+      <w:r>
+        <w:t>Typosquatting</w:t>
+      </w:r>
+      <w:proofErr w:type="spellEnd"/>
+      <w:r>
+        <w:t xml:space="preserve"> check:</w:t>
       </w:r>
     </w:p>
     <w:p>
@@ -5467,59 +5578,21 @@
         </w:numPr>
       </w:pPr>
       <w:r>
-        <w:t>Used the following site to get all the headers that could be present:</w:t>
-      </w:r>
-    </w:p>
-    <w:p>
-      <w:pPr>
-        <w:pStyle w:val="ListParagraph"/>
-        <w:numPr>
-          <w:ilvl w:val="4"/>
-          <w:numId w:val="1"/>
-        </w:numPr>
-      </w:pPr>
-      <w:r>
-        <w:t>https://cheatsheetseries.owasp.org/cheatsheets/HTTP_Headers_Cheat_Sheet.html</w:t>
-      </w:r>
-    </w:p>
-    <w:p>
-      <w:pPr>
-        <w:pStyle w:val="ListParagraph"/>
-        <w:numPr>
-          <w:ilvl w:val="3"/>
-          <w:numId w:val="1"/>
-        </w:numPr>
-      </w:pPr>
-      <w:r>
-        <w:t>Filtered through to then determine which headers are security-focussed and which ones aren’t to make sure there wasn’t excessive flagging</w:t>
-      </w:r>
-    </w:p>
-    <w:p>
-      <w:pPr>
-        <w:pStyle w:val="ListParagraph"/>
-        <w:numPr>
-          <w:ilvl w:val="2"/>
-          <w:numId w:val="1"/>
-        </w:numPr>
-      </w:pPr>
-      <w:r>
-        <w:t>Typosquatting check:</w:t>
-      </w:r>
-    </w:p>
-    <w:p>
-      <w:pPr>
-        <w:pStyle w:val="ListParagraph"/>
-        <w:numPr>
-          <w:ilvl w:val="3"/>
-          <w:numId w:val="1"/>
-        </w:numPr>
-      </w:pPr>
-      <w:r>
-        <w:t xml:space="preserve">Utilises the npm Talisman package and the built-in </w:t>
-      </w:r>
+        <w:t xml:space="preserve">Utilises the </w:t>
+      </w:r>
+      <w:proofErr w:type="spellStart"/>
+      <w:r>
+        <w:t>npm</w:t>
+      </w:r>
+      <w:proofErr w:type="spellEnd"/>
+      <w:r>
+        <w:t xml:space="preserve"> Talisman package and the built-in </w:t>
+      </w:r>
+      <w:proofErr w:type="spellStart"/>
       <w:r>
         <w:t>damerauLevenshtein</w:t>
       </w:r>
+      <w:proofErr w:type="spellEnd"/>
       <w:r>
         <w:t xml:space="preserve"> to determine how close the URL is to a known URL:</w:t>
       </w:r>
@@ -5579,7 +5652,47 @@
         </w:numPr>
       </w:pPr>
       <w:r>
-        <w:t>Opted to use Talisman over other npm packages (fast-levenshtein, js-levenshtein etc.) as it has the largest library and is the best for swapped letters due to using Damerau-Levenshtein algorithm instead of just Levenshtein algorithm</w:t>
+        <w:t xml:space="preserve">Opted to use Talisman over other </w:t>
+      </w:r>
+      <w:proofErr w:type="spellStart"/>
+      <w:r>
+        <w:t>npm</w:t>
+      </w:r>
+      <w:proofErr w:type="spellEnd"/>
+      <w:r>
+        <w:t xml:space="preserve"> packages (fast-</w:t>
+      </w:r>
+      <w:proofErr w:type="spellStart"/>
+      <w:r>
+        <w:t>levenshtein</w:t>
+      </w:r>
+      <w:proofErr w:type="spellEnd"/>
+      <w:r>
+        <w:t xml:space="preserve">, </w:t>
+      </w:r>
+      <w:proofErr w:type="spellStart"/>
+      <w:r>
+        <w:t>js-levenshtein</w:t>
+      </w:r>
+      <w:proofErr w:type="spellEnd"/>
+      <w:r>
+        <w:t xml:space="preserve"> etc.) as it has the largest library and is the best for swapped letters due to using </w:t>
+      </w:r>
+      <w:proofErr w:type="spellStart"/>
+      <w:r>
+        <w:t>Damerau-Levenshtein</w:t>
+      </w:r>
+      <w:proofErr w:type="spellEnd"/>
+      <w:r>
+        <w:t xml:space="preserve"> algorithm instead of just </w:t>
+      </w:r>
+      <w:proofErr w:type="spellStart"/>
+      <w:r>
+        <w:t>Levenshtein</w:t>
+      </w:r>
+      <w:proofErr w:type="spellEnd"/>
+      <w:r>
+        <w:t xml:space="preserve"> algorithm</w:t>
       </w:r>
     </w:p>
     <w:p>
@@ -5627,7 +5740,15 @@
         </w:numPr>
       </w:pPr>
       <w:r>
-        <w:t>Used the following source to identify which domains should be included in knownDomains as they are highest risk:</w:t>
+        <w:t xml:space="preserve">Used the following source to identify which domains should be included in </w:t>
+      </w:r>
+      <w:proofErr w:type="spellStart"/>
+      <w:r>
+        <w:t>knownDomains</w:t>
+      </w:r>
+      <w:proofErr w:type="spellEnd"/>
+      <w:r>
+        <w:t xml:space="preserve"> as they are highest risk:</w:t>
       </w:r>
     </w:p>
     <w:p>

</xml_diff>

<commit_message>
attempt 2 at dashboard
redesigned how the dashboard and firebase receive information and display it on the page - works on first attempt but then doesn't after that
</commit_message>
<xml_diff>
--- a/COMP3000 Final Document.docx
+++ b/COMP3000 Final Document.docx
@@ -6992,7 +6992,31 @@
                 <w:iCs/>
                 <w:noProof/>
               </w:rPr>
-              <w:t>Risk Score Calculation</w:t>
+              <w:t>Risk Score Cal</w:t>
+            </w:r>
+            <w:r>
+              <w:rPr>
+                <w:rStyle w:val="Hyperlink"/>
+                <w:rFonts w:ascii="Arial" w:hAnsi="Arial" w:cs="Arial"/>
+                <w:b/>
+                <w:bCs/>
+                <w:i/>
+                <w:iCs/>
+                <w:noProof/>
+              </w:rPr>
+              <w:t>c</w:t>
+            </w:r>
+            <w:r>
+              <w:rPr>
+                <w:rStyle w:val="Hyperlink"/>
+                <w:rFonts w:ascii="Arial" w:hAnsi="Arial" w:cs="Arial"/>
+                <w:b/>
+                <w:bCs/>
+                <w:i/>
+                <w:iCs/>
+                <w:noProof/>
+              </w:rPr>
+              <w:t>ulation</w:t>
             </w:r>
             <w:r>
               <w:rPr>
@@ -15881,26 +15905,44 @@
         <w:rPr>
           <w:rFonts w:ascii="Arial" w:hAnsi="Arial" w:cs="Arial"/>
         </w:rPr>
-        <w:t xml:space="preserve"> contains commonly malicious formatting</w:t>
-      </w:r>
-      <w:r>
-        <w:rPr>
-          <w:rFonts w:ascii="Arial" w:hAnsi="Arial" w:cs="Arial"/>
-        </w:rPr>
-        <w:t xml:space="preserve">. This involved extracting the domain name </w:t>
+        <w:t xml:space="preserve"> contains </w:t>
+      </w:r>
+      <w:r>
+        <w:rPr>
+          <w:rFonts w:ascii="Arial" w:hAnsi="Arial" w:cs="Arial"/>
+        </w:rPr>
+        <w:t>characteristics frequently hinting to malicious behaviours</w:t>
+      </w:r>
+      <w:r>
+        <w:rPr>
+          <w:rFonts w:ascii="Arial" w:hAnsi="Arial" w:cs="Arial"/>
+        </w:rPr>
+        <w:t xml:space="preserve">. This involved </w:t>
       </w:r>
       <w:r>
         <w:rPr>
           <w:rFonts w:ascii="Arial" w:hAnsi="Arial" w:cs="Arial"/>
         </w:rPr>
         <w:lastRenderedPageBreak/>
-        <w:t xml:space="preserve">from the URL and scanning it </w:t>
-      </w:r>
-      <w:r>
-        <w:rPr>
-          <w:rFonts w:ascii="Arial" w:hAnsi="Arial" w:cs="Arial"/>
-        </w:rPr>
-        <w:t>against</w:t>
+        <w:t xml:space="preserve">extracting the domain name from the URL and </w:t>
+      </w:r>
+      <w:r>
+        <w:rPr>
+          <w:rFonts w:ascii="Arial" w:hAnsi="Arial" w:cs="Arial"/>
+        </w:rPr>
+        <w:t>comparing</w:t>
+      </w:r>
+      <w:r>
+        <w:rPr>
+          <w:rFonts w:ascii="Arial" w:hAnsi="Arial" w:cs="Arial"/>
+        </w:rPr>
+        <w:t xml:space="preserve"> it </w:t>
+      </w:r>
+      <w:r>
+        <w:rPr>
+          <w:rFonts w:ascii="Arial" w:hAnsi="Arial" w:cs="Arial"/>
+        </w:rPr>
+        <w:t>to</w:t>
       </w:r>
       <w:r>
         <w:rPr>
@@ -15937,7 +15979,19 @@
         <w:rPr>
           <w:rFonts w:ascii="Arial" w:hAnsi="Arial" w:cs="Arial"/>
         </w:rPr>
-        <w:t>shows the code for the ‘</w:t>
+        <w:t xml:space="preserve">shows the </w:t>
+      </w:r>
+      <w:r>
+        <w:rPr>
+          <w:rFonts w:ascii="Arial" w:hAnsi="Arial" w:cs="Arial"/>
+        </w:rPr>
+        <w:t>implementation of the</w:t>
+      </w:r>
+      <w:r>
+        <w:rPr>
+          <w:rFonts w:ascii="Arial" w:hAnsi="Arial" w:cs="Arial"/>
+        </w:rPr>
+        <w:t xml:space="preserve"> ‘</w:t>
       </w:r>
       <w:proofErr w:type="spellStart"/>
       <w:proofErr w:type="gramStart"/>
@@ -15959,425 +16013,1060 @@
         <w:rPr>
           <w:rFonts w:ascii="Arial" w:hAnsi="Arial" w:cs="Arial"/>
         </w:rPr>
-        <w:t xml:space="preserve">)’ function within Visual Studio Code. </w:t>
-      </w:r>
-      <w:r>
-        <w:rPr>
-          <w:rFonts w:ascii="Arial" w:hAnsi="Arial" w:cs="Arial"/>
-        </w:rPr>
-        <w:t>The following factors were considered to determine if the domain name could be malicious</w:t>
-      </w:r>
-      <w:r>
-        <w:rPr>
-          <w:rFonts w:ascii="Arial" w:hAnsi="Arial" w:cs="Arial"/>
-        </w:rPr>
-        <w:t>:</w:t>
-      </w:r>
-    </w:p>
-    <w:p>
-      <w:pPr>
-        <w:pStyle w:val="Heading5"/>
-        <w:numPr>
-          <w:ilvl w:val="0"/>
-          <w:numId w:val="0"/>
-        </w:numPr>
-        <w:spacing w:line="360" w:lineRule="auto"/>
-        <w:ind w:left="1008" w:hanging="1008"/>
+        <w:t xml:space="preserve">)’ function. </w:t>
+      </w:r>
+      <w:r>
         <w:rPr>
           <w:rFonts w:ascii="Arial" w:hAnsi="Arial" w:cs="Arial"/>
           <w:b/>
           <w:bCs/>
-          <w:i/>
-          <w:iCs/>
-        </w:rPr>
-      </w:pPr>
-      <w:r>
-        <w:rPr>
-          <w:rFonts w:ascii="Arial" w:hAnsi="Arial" w:cs="Arial"/>
-          <w:b/>
-          <w:bCs/>
-          <w:i/>
-          <w:iCs/>
-        </w:rPr>
-        <w:t>Phishing Words</w:t>
-      </w:r>
-    </w:p>
-    <w:p>
-      <w:pPr>
-        <w:spacing w:after="240" w:line="360" w:lineRule="auto"/>
-        <w:rPr>
-          <w:rFonts w:ascii="Arial" w:hAnsi="Arial" w:cs="Arial"/>
-        </w:rPr>
-      </w:pPr>
-      <w:r>
-        <w:rPr>
-          <w:rFonts w:ascii="Arial" w:hAnsi="Arial" w:cs="Arial"/>
-        </w:rPr>
-        <w:t>The detection of common phishing-related words (i.e. ‘login’, ‘secure’, or ‘verification’), increases the risk score by 10 points. These terms are frequently used in deceptive ways for malicious purposes, often misleading and causing harm to users.</w:t>
-      </w:r>
-    </w:p>
-    <w:p>
-      <w:pPr>
-        <w:pStyle w:val="Heading5"/>
-        <w:numPr>
-          <w:ilvl w:val="0"/>
-          <w:numId w:val="0"/>
-        </w:numPr>
-        <w:spacing w:line="360" w:lineRule="auto"/>
-        <w:ind w:left="1008" w:hanging="1008"/>
-        <w:rPr>
-          <w:rFonts w:ascii="Arial" w:hAnsi="Arial" w:cs="Arial"/>
-          <w:b/>
-          <w:bCs/>
-          <w:i/>
-          <w:iCs/>
-        </w:rPr>
-      </w:pPr>
-      <w:r>
-        <w:rPr>
-          <w:rFonts w:ascii="Arial" w:hAnsi="Arial" w:cs="Arial"/>
-          <w:b/>
-          <w:bCs/>
-          <w:i/>
-          <w:iCs/>
-        </w:rPr>
-        <w:t>R</w:t>
-      </w:r>
-      <w:r>
-        <w:rPr>
-          <w:rFonts w:ascii="Arial" w:hAnsi="Arial" w:cs="Arial"/>
-          <w:b/>
-          <w:bCs/>
-          <w:i/>
-          <w:iCs/>
-        </w:rPr>
-        <w:t>epeated Hyphens</w:t>
-      </w:r>
-    </w:p>
-    <w:p>
-      <w:pPr>
-        <w:spacing w:after="240" w:line="360" w:lineRule="auto"/>
-        <w:rPr>
-          <w:rFonts w:ascii="Arial" w:hAnsi="Arial" w:cs="Arial"/>
-        </w:rPr>
-      </w:pPr>
-      <w:r>
-        <w:rPr>
-          <w:rFonts w:ascii="Arial" w:hAnsi="Arial" w:cs="Arial"/>
-        </w:rPr>
-        <w:t>T</w:t>
-      </w:r>
-      <w:r>
-        <w:rPr>
-          <w:rFonts w:ascii="Arial" w:hAnsi="Arial" w:cs="Arial"/>
-        </w:rPr>
-        <w:t xml:space="preserve">he use of repeated hyphens increases the risk score by 10 </w:t>
-      </w:r>
-      <w:r>
-        <w:rPr>
-          <w:rFonts w:ascii="Arial" w:hAnsi="Arial" w:cs="Arial"/>
-        </w:rPr>
-        <w:t>points</w:t>
-      </w:r>
-      <w:r>
-        <w:rPr>
-          <w:rFonts w:ascii="Arial" w:hAnsi="Arial" w:cs="Arial"/>
-        </w:rPr>
-        <w:t>. Threat actors commonly use hyphenated domains to create illegitimate and often malicious which imitate legitimate ones, potentially causing harm to users.</w:t>
-      </w:r>
-    </w:p>
-    <w:p>
-      <w:pPr>
-        <w:pStyle w:val="Heading5"/>
-        <w:numPr>
-          <w:ilvl w:val="0"/>
-          <w:numId w:val="0"/>
-        </w:numPr>
-        <w:spacing w:line="360" w:lineRule="auto"/>
-        <w:ind w:left="1008" w:hanging="1008"/>
-        <w:rPr>
-          <w:rFonts w:ascii="Arial" w:hAnsi="Arial" w:cs="Arial"/>
-          <w:b/>
-          <w:bCs/>
-          <w:i/>
-          <w:iCs/>
-        </w:rPr>
-      </w:pPr>
-      <w:r>
-        <w:rPr>
-          <w:rFonts w:ascii="Arial" w:hAnsi="Arial" w:cs="Arial"/>
-          <w:b/>
-          <w:bCs/>
-          <w:i/>
-          <w:iCs/>
-        </w:rPr>
-        <w:t>Long Domain Name</w:t>
-      </w:r>
-    </w:p>
-    <w:p>
-      <w:pPr>
-        <w:spacing w:after="240" w:line="360" w:lineRule="auto"/>
-        <w:rPr>
-          <w:rFonts w:ascii="Arial" w:hAnsi="Arial" w:cs="Arial"/>
-        </w:rPr>
-      </w:pPr>
-      <w:r>
-        <w:rPr>
-          <w:rFonts w:ascii="Arial" w:hAnsi="Arial" w:cs="Arial"/>
-        </w:rPr>
-        <w:t xml:space="preserve">A </w:t>
-      </w:r>
-      <w:r>
-        <w:rPr>
-          <w:rFonts w:ascii="Arial" w:hAnsi="Arial" w:cs="Arial"/>
-        </w:rPr>
-        <w:t xml:space="preserve">domain name </w:t>
-      </w:r>
-      <w:r>
-        <w:rPr>
-          <w:rFonts w:ascii="Arial" w:hAnsi="Arial" w:cs="Arial"/>
-        </w:rPr>
-        <w:t xml:space="preserve">longer than 50 characters increases </w:t>
-      </w:r>
-      <w:r>
-        <w:rPr>
-          <w:rFonts w:ascii="Arial" w:hAnsi="Arial" w:cs="Arial"/>
-        </w:rPr>
-        <w:t xml:space="preserve">the risk score by 5 </w:t>
-      </w:r>
-      <w:r>
-        <w:rPr>
-          <w:rFonts w:ascii="Arial" w:hAnsi="Arial" w:cs="Arial"/>
-        </w:rPr>
-        <w:t>points</w:t>
-      </w:r>
-      <w:r>
-        <w:rPr>
-          <w:rFonts w:ascii="Arial" w:hAnsi="Arial" w:cs="Arial"/>
-        </w:rPr>
-        <w:t>. This is deemed as excessive in length which can be commonly used to hide the true meaning of a URL, leading a user to a potentially malicious site.</w:t>
-      </w:r>
-    </w:p>
-    <w:p>
-      <w:pPr>
-        <w:pStyle w:val="Heading5"/>
-        <w:numPr>
-          <w:ilvl w:val="0"/>
-          <w:numId w:val="0"/>
-        </w:numPr>
-        <w:spacing w:line="360" w:lineRule="auto"/>
-        <w:ind w:left="1008" w:hanging="1008"/>
-        <w:rPr>
-          <w:rFonts w:ascii="Arial" w:hAnsi="Arial" w:cs="Arial"/>
-          <w:b/>
-          <w:bCs/>
-          <w:i/>
-          <w:iCs/>
-        </w:rPr>
-      </w:pPr>
-      <w:r>
-        <w:rPr>
-          <w:rFonts w:ascii="Arial" w:hAnsi="Arial" w:cs="Arial"/>
-          <w:b/>
-          <w:bCs/>
-          <w:i/>
-          <w:iCs/>
-        </w:rPr>
-        <w:t>IP Address</w:t>
-      </w:r>
-    </w:p>
-    <w:p>
-      <w:pPr>
-        <w:spacing w:line="360" w:lineRule="auto"/>
-        <w:rPr>
-          <w:rFonts w:ascii="Arial" w:hAnsi="Arial" w:cs="Arial"/>
-        </w:rPr>
-      </w:pPr>
-      <w:r>
-        <w:rPr>
-          <w:rFonts w:ascii="Arial" w:hAnsi="Arial" w:cs="Arial"/>
-        </w:rPr>
-        <w:t xml:space="preserve">If the URL is detected as an IP address, this increases the risk score by 30 </w:t>
-      </w:r>
-      <w:r>
-        <w:rPr>
-          <w:rFonts w:ascii="Arial" w:hAnsi="Arial" w:cs="Arial"/>
-        </w:rPr>
-        <w:t>points d</w:t>
-      </w:r>
-      <w:r>
-        <w:rPr>
-          <w:rFonts w:ascii="Arial" w:hAnsi="Arial" w:cs="Arial"/>
-        </w:rPr>
-        <w:t>ue t</w:t>
-      </w:r>
-      <w:r>
-        <w:rPr>
-          <w:rFonts w:ascii="Arial" w:hAnsi="Arial" w:cs="Arial"/>
-        </w:rPr>
-        <w:t>o</w:t>
-      </w:r>
-    </w:p>
-    <w:p>
-      <w:pPr>
-        <w:pStyle w:val="Heading5"/>
-        <w:numPr>
-          <w:ilvl w:val="0"/>
-          <w:numId w:val="0"/>
-        </w:numPr>
-        <w:spacing w:line="360" w:lineRule="auto"/>
-        <w:ind w:left="1008" w:hanging="1008"/>
-        <w:rPr>
-          <w:rFonts w:ascii="Arial" w:hAnsi="Arial" w:cs="Arial"/>
-          <w:b/>
-          <w:bCs/>
-          <w:i/>
-          <w:iCs/>
-        </w:rPr>
-      </w:pPr>
-      <w:r>
-        <w:rPr>
-          <w:rFonts w:ascii="Arial" w:hAnsi="Arial" w:cs="Arial"/>
-          <w:b/>
-          <w:bCs/>
-          <w:i/>
-          <w:iCs/>
-        </w:rPr>
-        <w:t>Homograph Attack</w:t>
-      </w:r>
-    </w:p>
-    <w:p>
-      <w:pPr>
-        <w:spacing w:line="360" w:lineRule="auto"/>
-        <w:rPr>
-          <w:rFonts w:ascii="Arial" w:hAnsi="Arial" w:cs="Arial"/>
-        </w:rPr>
-      </w:pPr>
-      <w:r>
-        <w:rPr>
-          <w:rFonts w:ascii="Arial" w:hAnsi="Arial" w:cs="Arial"/>
-        </w:rPr>
-        <w:t>The URL is scanned for the characters ‘</w:t>
-      </w:r>
-      <w:proofErr w:type="spellStart"/>
-      <w:r>
-        <w:rPr>
-          <w:rFonts w:ascii="Arial" w:hAnsi="Arial" w:cs="Arial"/>
-        </w:rPr>
-        <w:t>xn</w:t>
-      </w:r>
-      <w:proofErr w:type="spellEnd"/>
-      <w:r>
-        <w:rPr>
-          <w:rFonts w:ascii="Arial" w:hAnsi="Arial" w:cs="Arial"/>
-        </w:rPr>
-        <w:t>--’, which could indicate a homograph attack due to browsers representing Unicode characters in this manner. If this is detected, the risk score is increased by 30</w:t>
-      </w:r>
-      <w:r>
-        <w:rPr>
-          <w:rFonts w:ascii="Arial" w:hAnsi="Arial" w:cs="Arial"/>
-        </w:rPr>
-        <w:t xml:space="preserve"> points</w:t>
-      </w:r>
-      <w:r>
-        <w:rPr>
-          <w:rFonts w:ascii="Arial" w:hAnsi="Arial" w:cs="Arial"/>
-        </w:rPr>
-        <w:t xml:space="preserve"> due to</w:t>
-      </w:r>
-    </w:p>
-    <w:p>
-      <w:pPr>
-        <w:pStyle w:val="Heading5"/>
-        <w:numPr>
-          <w:ilvl w:val="0"/>
-          <w:numId w:val="0"/>
-        </w:numPr>
-        <w:spacing w:line="360" w:lineRule="auto"/>
-        <w:ind w:left="1008" w:hanging="1008"/>
-        <w:rPr>
-          <w:rFonts w:ascii="Arial" w:hAnsi="Arial" w:cs="Arial"/>
-          <w:b/>
-          <w:bCs/>
-          <w:i/>
-          <w:iCs/>
-        </w:rPr>
-      </w:pPr>
-      <w:r>
-        <w:rPr>
-          <w:rFonts w:ascii="Arial" w:hAnsi="Arial" w:cs="Arial"/>
-          <w:b/>
-          <w:bCs/>
-          <w:i/>
-          <w:iCs/>
-        </w:rPr>
-        <w:t>@ Symbol</w:t>
-      </w:r>
-    </w:p>
-    <w:p>
-      <w:pPr>
-        <w:spacing w:line="360" w:lineRule="auto"/>
-        <w:rPr>
-          <w:rFonts w:ascii="Arial" w:hAnsi="Arial" w:cs="Arial"/>
-        </w:rPr>
-      </w:pPr>
-      <w:r>
-        <w:rPr>
-          <w:rFonts w:ascii="Arial" w:hAnsi="Arial" w:cs="Arial"/>
-        </w:rPr>
-        <w:t>If an ‘@’ symbol is detected in the URL, the risk score is increased by 20 points due to</w:t>
-      </w:r>
-    </w:p>
-    <w:p>
-      <w:pPr>
-        <w:spacing w:line="360" w:lineRule="auto"/>
-        <w:rPr>
-          <w:rFonts w:ascii="Arial" w:hAnsi="Arial" w:cs="Arial"/>
-        </w:rPr>
-      </w:pPr>
-    </w:p>
-    <w:p>
-      <w:pPr>
-        <w:pStyle w:val="Heading5"/>
-        <w:numPr>
-          <w:ilvl w:val="0"/>
-          <w:numId w:val="0"/>
-        </w:numPr>
-        <w:spacing w:line="360" w:lineRule="auto"/>
-        <w:ind w:left="1008" w:hanging="1008"/>
-        <w:rPr>
-          <w:rFonts w:ascii="Arial" w:hAnsi="Arial" w:cs="Arial"/>
-          <w:b/>
-          <w:bCs/>
-          <w:i/>
-          <w:iCs/>
-        </w:rPr>
-      </w:pPr>
-      <w:r>
-        <w:rPr>
-          <w:rFonts w:ascii="Arial" w:hAnsi="Arial" w:cs="Arial"/>
-          <w:b/>
-          <w:bCs/>
-          <w:i/>
-          <w:iCs/>
-        </w:rPr>
-        <w:lastRenderedPageBreak/>
-        <w:t>Multiple Dots</w:t>
-      </w:r>
-    </w:p>
-    <w:p>
-      <w:pPr>
-        <w:spacing w:line="360" w:lineRule="auto"/>
-        <w:rPr>
-          <w:rFonts w:ascii="Arial" w:hAnsi="Arial" w:cs="Arial"/>
-        </w:rPr>
-      </w:pPr>
-      <w:r>
-        <w:rPr>
-          <w:rFonts w:ascii="Arial" w:hAnsi="Arial" w:cs="Arial"/>
-        </w:rPr>
-        <w:t>If 3 or more dots are detected in the URL, the risk score is increased by 5 points due to</w:t>
-      </w:r>
+          <w:sz w:val="36"/>
+          <w:szCs w:val="36"/>
+          <w:highlight w:val="cyan"/>
+        </w:rPr>
+        <w:t>Table XX</w:t>
+      </w:r>
+      <w:r>
+        <w:rPr>
+          <w:rFonts w:ascii="Arial" w:hAnsi="Arial" w:cs="Arial"/>
+        </w:rPr>
+        <w:t xml:space="preserve"> shows which </w:t>
+      </w:r>
+      <w:r>
+        <w:rPr>
+          <w:rFonts w:ascii="Arial" w:hAnsi="Arial" w:cs="Arial"/>
+        </w:rPr>
+        <w:t xml:space="preserve">risk </w:t>
+      </w:r>
+      <w:r>
+        <w:rPr>
+          <w:rFonts w:ascii="Arial" w:hAnsi="Arial" w:cs="Arial"/>
+        </w:rPr>
+        <w:t xml:space="preserve">factors were considered to determine if </w:t>
+      </w:r>
+      <w:r>
+        <w:rPr>
+          <w:rFonts w:ascii="Arial" w:hAnsi="Arial" w:cs="Arial"/>
+        </w:rPr>
+        <w:t>a</w:t>
+      </w:r>
+      <w:r>
+        <w:rPr>
+          <w:rFonts w:ascii="Arial" w:hAnsi="Arial" w:cs="Arial"/>
+        </w:rPr>
+        <w:t xml:space="preserve"> domain </w:t>
+      </w:r>
+      <w:r>
+        <w:rPr>
+          <w:rFonts w:ascii="Arial" w:hAnsi="Arial" w:cs="Arial"/>
+        </w:rPr>
+        <w:t xml:space="preserve">may </w:t>
+      </w:r>
+      <w:r>
+        <w:rPr>
+          <w:rFonts w:ascii="Arial" w:hAnsi="Arial" w:cs="Arial"/>
+        </w:rPr>
+        <w:t>be malicious</w:t>
+      </w:r>
+      <w:r>
+        <w:rPr>
+          <w:rFonts w:ascii="Arial" w:hAnsi="Arial" w:cs="Arial"/>
+        </w:rPr>
+        <w:t>.</w:t>
+      </w:r>
+    </w:p>
+    <w:p>
+      <w:pPr>
+        <w:pStyle w:val="Caption"/>
+        <w:keepNext/>
+      </w:pPr>
+      <w:r>
+        <w:t xml:space="preserve">Table </w:t>
+      </w:r>
+      <w:r>
+        <w:fldChar w:fldCharType="begin"/>
+      </w:r>
+      <w:r>
+        <w:instrText xml:space="preserve"> SEQ Table \* ARABIC </w:instrText>
+      </w:r>
+      <w:r>
+        <w:fldChar w:fldCharType="separate"/>
+      </w:r>
+      <w:r>
+        <w:rPr>
+          <w:noProof/>
+        </w:rPr>
+        <w:t>1</w:t>
+      </w:r>
+      <w:r>
+        <w:fldChar w:fldCharType="end"/>
+      </w:r>
+      <w:r>
+        <w:t xml:space="preserve"> – Domain Name</w:t>
+      </w:r>
+      <w:r>
+        <w:t xml:space="preserve"> Check</w:t>
+      </w:r>
+      <w:r>
+        <w:t xml:space="preserve"> Risk Factors</w:t>
+      </w:r>
+    </w:p>
+    <w:tbl>
+      <w:tblPr>
+        <w:tblStyle w:val="TableGrid"/>
+        <w:tblW w:w="0" w:type="auto"/>
+        <w:tblBorders>
+          <w:top w:val="single" w:sz="24" w:space="0" w:color="auto"/>
+          <w:left w:val="single" w:sz="24" w:space="0" w:color="auto"/>
+          <w:bottom w:val="single" w:sz="24" w:space="0" w:color="auto"/>
+          <w:right w:val="single" w:sz="24" w:space="0" w:color="auto"/>
+          <w:insideH w:val="single" w:sz="6" w:space="0" w:color="auto"/>
+          <w:insideV w:val="single" w:sz="6" w:space="0" w:color="auto"/>
+        </w:tblBorders>
+        <w:tblCellMar>
+          <w:left w:w="170" w:type="dxa"/>
+          <w:right w:w="170" w:type="dxa"/>
+        </w:tblCellMar>
+        <w:tblLook w:val="05A0" w:firstRow="1" w:lastRow="0" w:firstColumn="1" w:lastColumn="1" w:noHBand="0" w:noVBand="1"/>
+      </w:tblPr>
+      <w:tblGrid>
+        <w:gridCol w:w="1681"/>
+        <w:gridCol w:w="2364"/>
+        <w:gridCol w:w="1660"/>
+        <w:gridCol w:w="3261"/>
+      </w:tblGrid>
+      <w:tr>
+        <w:trPr>
+          <w:cantSplit/>
+        </w:trPr>
+        <w:tc>
+          <w:tcPr>
+            <w:tcW w:w="1685" w:type="dxa"/>
+            <w:tcBorders>
+              <w:top w:val="single" w:sz="24" w:space="0" w:color="auto"/>
+              <w:bottom w:val="single" w:sz="24" w:space="0" w:color="auto"/>
+            </w:tcBorders>
+            <w:vAlign w:val="center"/>
+          </w:tcPr>
+          <w:p>
+            <w:pPr>
+              <w:spacing w:line="360" w:lineRule="auto"/>
+              <w:jc w:val="center"/>
+              <w:rPr>
+                <w:rFonts w:ascii="Arial" w:hAnsi="Arial" w:cs="Arial"/>
+                <w:b/>
+                <w:bCs/>
+              </w:rPr>
+            </w:pPr>
+            <w:r>
+              <w:rPr>
+                <w:rFonts w:ascii="Arial" w:hAnsi="Arial" w:cs="Arial"/>
+                <w:b/>
+                <w:bCs/>
+              </w:rPr>
+              <w:t>Factor</w:t>
+            </w:r>
+          </w:p>
+        </w:tc>
+        <w:tc>
+          <w:tcPr>
+            <w:tcW w:w="2396" w:type="dxa"/>
+            <w:tcBorders>
+              <w:top w:val="single" w:sz="24" w:space="0" w:color="auto"/>
+              <w:bottom w:val="single" w:sz="24" w:space="0" w:color="auto"/>
+            </w:tcBorders>
+            <w:vAlign w:val="center"/>
+          </w:tcPr>
+          <w:p>
+            <w:pPr>
+              <w:spacing w:line="360" w:lineRule="auto"/>
+              <w:jc w:val="center"/>
+              <w:rPr>
+                <w:rFonts w:ascii="Arial" w:hAnsi="Arial" w:cs="Arial"/>
+                <w:b/>
+                <w:bCs/>
+              </w:rPr>
+            </w:pPr>
+            <w:r>
+              <w:rPr>
+                <w:rFonts w:ascii="Arial" w:hAnsi="Arial" w:cs="Arial"/>
+                <w:b/>
+                <w:bCs/>
+              </w:rPr>
+              <w:t>Condition</w:t>
+            </w:r>
+          </w:p>
+        </w:tc>
+        <w:tc>
+          <w:tcPr>
+            <w:tcW w:w="1559" w:type="dxa"/>
+            <w:tcBorders>
+              <w:top w:val="single" w:sz="24" w:space="0" w:color="auto"/>
+              <w:bottom w:val="single" w:sz="24" w:space="0" w:color="auto"/>
+            </w:tcBorders>
+            <w:vAlign w:val="center"/>
+          </w:tcPr>
+          <w:p>
+            <w:pPr>
+              <w:spacing w:line="360" w:lineRule="auto"/>
+              <w:jc w:val="center"/>
+              <w:rPr>
+                <w:rFonts w:ascii="Arial" w:hAnsi="Arial" w:cs="Arial"/>
+                <w:b/>
+                <w:bCs/>
+              </w:rPr>
+            </w:pPr>
+            <w:r>
+              <w:rPr>
+                <w:rFonts w:ascii="Arial" w:hAnsi="Arial" w:cs="Arial"/>
+                <w:b/>
+                <w:bCs/>
+              </w:rPr>
+              <w:t>Score Adjustment</w:t>
+            </w:r>
+          </w:p>
+        </w:tc>
+        <w:tc>
+          <w:tcPr>
+            <w:tcW w:w="3326" w:type="dxa"/>
+            <w:tcBorders>
+              <w:top w:val="single" w:sz="24" w:space="0" w:color="auto"/>
+              <w:bottom w:val="single" w:sz="24" w:space="0" w:color="auto"/>
+            </w:tcBorders>
+            <w:vAlign w:val="center"/>
+          </w:tcPr>
+          <w:p>
+            <w:pPr>
+              <w:spacing w:line="360" w:lineRule="auto"/>
+              <w:jc w:val="center"/>
+              <w:rPr>
+                <w:rFonts w:ascii="Arial" w:hAnsi="Arial" w:cs="Arial"/>
+                <w:b/>
+                <w:bCs/>
+              </w:rPr>
+            </w:pPr>
+            <w:r>
+              <w:rPr>
+                <w:rFonts w:ascii="Arial" w:hAnsi="Arial" w:cs="Arial"/>
+                <w:b/>
+                <w:bCs/>
+              </w:rPr>
+              <w:t>Reason</w:t>
+            </w:r>
+          </w:p>
+        </w:tc>
+      </w:tr>
+      <w:tr>
+        <w:trPr>
+          <w:cantSplit/>
+        </w:trPr>
+        <w:tc>
+          <w:tcPr>
+            <w:tcW w:w="1685" w:type="dxa"/>
+            <w:tcBorders>
+              <w:top w:val="single" w:sz="24" w:space="0" w:color="auto"/>
+            </w:tcBorders>
+            <w:vAlign w:val="center"/>
+          </w:tcPr>
+          <w:p>
+            <w:pPr>
+              <w:spacing w:line="360" w:lineRule="auto"/>
+              <w:jc w:val="center"/>
+              <w:rPr>
+                <w:rFonts w:ascii="Arial" w:hAnsi="Arial" w:cs="Arial"/>
+                <w:i/>
+                <w:iCs/>
+              </w:rPr>
+            </w:pPr>
+            <w:r>
+              <w:rPr>
+                <w:rFonts w:ascii="Arial" w:hAnsi="Arial" w:cs="Arial"/>
+                <w:i/>
+                <w:iCs/>
+              </w:rPr>
+              <w:t>Phishing Words</w:t>
+            </w:r>
+          </w:p>
+        </w:tc>
+        <w:tc>
+          <w:tcPr>
+            <w:tcW w:w="2396" w:type="dxa"/>
+            <w:tcBorders>
+              <w:top w:val="single" w:sz="24" w:space="0" w:color="auto"/>
+            </w:tcBorders>
+          </w:tcPr>
+          <w:p>
+            <w:pPr>
+              <w:spacing w:line="360" w:lineRule="auto"/>
+              <w:rPr>
+                <w:rFonts w:ascii="Arial" w:hAnsi="Arial" w:cs="Arial"/>
+              </w:rPr>
+            </w:pPr>
+            <w:r>
+              <w:rPr>
+                <w:rFonts w:ascii="Arial" w:hAnsi="Arial" w:cs="Arial"/>
+              </w:rPr>
+              <w:t>Contains phishing words i.e. ‘login’, ‘secure’, or ‘verification’</w:t>
+            </w:r>
+          </w:p>
+        </w:tc>
+        <w:tc>
+          <w:tcPr>
+            <w:tcW w:w="1559" w:type="dxa"/>
+            <w:tcBorders>
+              <w:top w:val="single" w:sz="24" w:space="0" w:color="auto"/>
+            </w:tcBorders>
+            <w:vAlign w:val="center"/>
+          </w:tcPr>
+          <w:p>
+            <w:pPr>
+              <w:spacing w:line="360" w:lineRule="auto"/>
+              <w:jc w:val="center"/>
+              <w:rPr>
+                <w:rFonts w:ascii="Arial" w:hAnsi="Arial" w:cs="Arial"/>
+              </w:rPr>
+            </w:pPr>
+            <w:r>
+              <w:rPr>
+                <w:rFonts w:ascii="Arial" w:hAnsi="Arial" w:cs="Arial"/>
+              </w:rPr>
+              <w:t xml:space="preserve">+10 </w:t>
+            </w:r>
+            <w:r>
+              <w:rPr>
+                <w:rFonts w:ascii="Arial" w:hAnsi="Arial" w:cs="Arial"/>
+              </w:rPr>
+              <w:t>p</w:t>
+            </w:r>
+            <w:r>
+              <w:rPr>
+                <w:rFonts w:ascii="Arial" w:hAnsi="Arial" w:cs="Arial"/>
+              </w:rPr>
+              <w:t>oints</w:t>
+            </w:r>
+          </w:p>
+        </w:tc>
+        <w:tc>
+          <w:tcPr>
+            <w:tcW w:w="3326" w:type="dxa"/>
+            <w:tcBorders>
+              <w:top w:val="single" w:sz="24" w:space="0" w:color="auto"/>
+            </w:tcBorders>
+          </w:tcPr>
+          <w:p>
+            <w:pPr>
+              <w:spacing w:line="360" w:lineRule="auto"/>
+              <w:rPr>
+                <w:rFonts w:ascii="Arial" w:hAnsi="Arial" w:cs="Arial"/>
+              </w:rPr>
+            </w:pPr>
+            <w:r>
+              <w:rPr>
+                <w:rFonts w:ascii="Arial" w:hAnsi="Arial" w:cs="Arial"/>
+              </w:rPr>
+              <w:t>C</w:t>
+            </w:r>
+            <w:r>
+              <w:rPr>
+                <w:rFonts w:ascii="Arial" w:hAnsi="Arial" w:cs="Arial"/>
+              </w:rPr>
+              <w:t>ommonly used to</w:t>
+            </w:r>
+            <w:r>
+              <w:rPr>
+                <w:rFonts w:ascii="Arial" w:hAnsi="Arial" w:cs="Arial"/>
+              </w:rPr>
+              <w:t xml:space="preserve"> imitate legitimate services </w:t>
+            </w:r>
+            <w:r>
+              <w:rPr>
+                <w:rFonts w:ascii="Arial" w:hAnsi="Arial" w:cs="Arial"/>
+              </w:rPr>
+              <w:t>and deceive users</w:t>
+            </w:r>
+          </w:p>
+        </w:tc>
+      </w:tr>
+      <w:tr>
+        <w:trPr>
+          <w:cantSplit/>
+        </w:trPr>
+        <w:tc>
+          <w:tcPr>
+            <w:tcW w:w="1685" w:type="dxa"/>
+            <w:vAlign w:val="center"/>
+          </w:tcPr>
+          <w:p>
+            <w:pPr>
+              <w:spacing w:line="360" w:lineRule="auto"/>
+              <w:jc w:val="center"/>
+              <w:rPr>
+                <w:rFonts w:ascii="Arial" w:hAnsi="Arial" w:cs="Arial"/>
+                <w:i/>
+                <w:iCs/>
+              </w:rPr>
+            </w:pPr>
+            <w:r>
+              <w:rPr>
+                <w:rFonts w:ascii="Arial" w:hAnsi="Arial" w:cs="Arial"/>
+                <w:i/>
+                <w:iCs/>
+              </w:rPr>
+              <w:t>Repeated Hyphens</w:t>
+            </w:r>
+          </w:p>
+        </w:tc>
+        <w:tc>
+          <w:tcPr>
+            <w:tcW w:w="2396" w:type="dxa"/>
+          </w:tcPr>
+          <w:p>
+            <w:pPr>
+              <w:spacing w:line="360" w:lineRule="auto"/>
+              <w:rPr>
+                <w:rFonts w:ascii="Arial" w:hAnsi="Arial" w:cs="Arial"/>
+              </w:rPr>
+            </w:pPr>
+            <w:r>
+              <w:rPr>
+                <w:rFonts w:ascii="Arial" w:hAnsi="Arial" w:cs="Arial"/>
+              </w:rPr>
+              <w:t>Contains multiple hyphens in a row</w:t>
+            </w:r>
+          </w:p>
+        </w:tc>
+        <w:tc>
+          <w:tcPr>
+            <w:tcW w:w="1559" w:type="dxa"/>
+            <w:vAlign w:val="center"/>
+          </w:tcPr>
+          <w:p>
+            <w:pPr>
+              <w:spacing w:line="360" w:lineRule="auto"/>
+              <w:jc w:val="center"/>
+              <w:rPr>
+                <w:rFonts w:ascii="Arial" w:hAnsi="Arial" w:cs="Arial"/>
+              </w:rPr>
+            </w:pPr>
+            <w:r>
+              <w:rPr>
+                <w:rFonts w:ascii="Arial" w:hAnsi="Arial" w:cs="Arial"/>
+              </w:rPr>
+              <w:t>+</w:t>
+            </w:r>
+            <w:r>
+              <w:rPr>
+                <w:rFonts w:ascii="Arial" w:hAnsi="Arial" w:cs="Arial"/>
+              </w:rPr>
+              <w:t>5</w:t>
+            </w:r>
+            <w:r>
+              <w:rPr>
+                <w:rFonts w:ascii="Arial" w:hAnsi="Arial" w:cs="Arial"/>
+              </w:rPr>
+              <w:t xml:space="preserve"> </w:t>
+            </w:r>
+            <w:r>
+              <w:rPr>
+                <w:rFonts w:ascii="Arial" w:hAnsi="Arial" w:cs="Arial"/>
+              </w:rPr>
+              <w:t>p</w:t>
+            </w:r>
+            <w:r>
+              <w:rPr>
+                <w:rFonts w:ascii="Arial" w:hAnsi="Arial" w:cs="Arial"/>
+              </w:rPr>
+              <w:t>oints</w:t>
+            </w:r>
+          </w:p>
+        </w:tc>
+        <w:tc>
+          <w:tcPr>
+            <w:tcW w:w="3326" w:type="dxa"/>
+          </w:tcPr>
+          <w:p>
+            <w:pPr>
+              <w:spacing w:line="360" w:lineRule="auto"/>
+              <w:rPr>
+                <w:rFonts w:ascii="Arial" w:hAnsi="Arial" w:cs="Arial"/>
+              </w:rPr>
+            </w:pPr>
+            <w:r>
+              <w:rPr>
+                <w:rFonts w:ascii="Arial" w:hAnsi="Arial" w:cs="Arial"/>
+              </w:rPr>
+              <w:t>Used to</w:t>
+            </w:r>
+            <w:r>
+              <w:rPr>
+                <w:rFonts w:ascii="Arial" w:hAnsi="Arial" w:cs="Arial"/>
+              </w:rPr>
+              <w:t xml:space="preserve"> </w:t>
+            </w:r>
+            <w:r>
+              <w:rPr>
+                <w:rFonts w:ascii="Arial" w:hAnsi="Arial" w:cs="Arial"/>
+              </w:rPr>
+              <w:t xml:space="preserve">replicate legitimate </w:t>
+            </w:r>
+            <w:r>
+              <w:rPr>
+                <w:rFonts w:ascii="Arial" w:hAnsi="Arial" w:cs="Arial"/>
+              </w:rPr>
+              <w:t xml:space="preserve">domains </w:t>
+            </w:r>
+          </w:p>
+        </w:tc>
+      </w:tr>
+      <w:tr>
+        <w:trPr>
+          <w:cantSplit/>
+        </w:trPr>
+        <w:tc>
+          <w:tcPr>
+            <w:tcW w:w="1685" w:type="dxa"/>
+            <w:vAlign w:val="center"/>
+          </w:tcPr>
+          <w:p>
+            <w:pPr>
+              <w:spacing w:line="360" w:lineRule="auto"/>
+              <w:jc w:val="center"/>
+              <w:rPr>
+                <w:rFonts w:ascii="Arial" w:hAnsi="Arial" w:cs="Arial"/>
+                <w:i/>
+                <w:iCs/>
+              </w:rPr>
+            </w:pPr>
+            <w:r>
+              <w:rPr>
+                <w:rFonts w:ascii="Arial" w:hAnsi="Arial" w:cs="Arial"/>
+                <w:i/>
+                <w:iCs/>
+              </w:rPr>
+              <w:t>Long Domain Name</w:t>
+            </w:r>
+          </w:p>
+        </w:tc>
+        <w:tc>
+          <w:tcPr>
+            <w:tcW w:w="2396" w:type="dxa"/>
+          </w:tcPr>
+          <w:p>
+            <w:pPr>
+              <w:spacing w:line="360" w:lineRule="auto"/>
+              <w:rPr>
+                <w:rFonts w:ascii="Arial" w:hAnsi="Arial" w:cs="Arial"/>
+              </w:rPr>
+            </w:pPr>
+            <w:r>
+              <w:rPr>
+                <w:rFonts w:ascii="Arial" w:hAnsi="Arial" w:cs="Arial"/>
+              </w:rPr>
+              <w:t>Domain name exceeds 50 characters</w:t>
+            </w:r>
+          </w:p>
+        </w:tc>
+        <w:tc>
+          <w:tcPr>
+            <w:tcW w:w="1559" w:type="dxa"/>
+            <w:vAlign w:val="center"/>
+          </w:tcPr>
+          <w:p>
+            <w:pPr>
+              <w:spacing w:line="360" w:lineRule="auto"/>
+              <w:jc w:val="center"/>
+              <w:rPr>
+                <w:rFonts w:ascii="Arial" w:hAnsi="Arial" w:cs="Arial"/>
+              </w:rPr>
+            </w:pPr>
+            <w:r>
+              <w:rPr>
+                <w:rFonts w:ascii="Arial" w:hAnsi="Arial" w:cs="Arial"/>
+              </w:rPr>
+              <w:t xml:space="preserve">+10 </w:t>
+            </w:r>
+            <w:r>
+              <w:rPr>
+                <w:rFonts w:ascii="Arial" w:hAnsi="Arial" w:cs="Arial"/>
+              </w:rPr>
+              <w:t>p</w:t>
+            </w:r>
+            <w:r>
+              <w:rPr>
+                <w:rFonts w:ascii="Arial" w:hAnsi="Arial" w:cs="Arial"/>
+              </w:rPr>
+              <w:t>oints</w:t>
+            </w:r>
+          </w:p>
+        </w:tc>
+        <w:tc>
+          <w:tcPr>
+            <w:tcW w:w="3326" w:type="dxa"/>
+          </w:tcPr>
+          <w:p>
+            <w:pPr>
+              <w:spacing w:line="360" w:lineRule="auto"/>
+              <w:rPr>
+                <w:rFonts w:ascii="Arial" w:hAnsi="Arial" w:cs="Arial"/>
+              </w:rPr>
+            </w:pPr>
+            <w:r>
+              <w:rPr>
+                <w:rFonts w:ascii="Arial" w:hAnsi="Arial" w:cs="Arial"/>
+              </w:rPr>
+              <w:t>Can</w:t>
+            </w:r>
+            <w:r>
+              <w:rPr>
+                <w:rFonts w:ascii="Arial" w:hAnsi="Arial" w:cs="Arial"/>
+              </w:rPr>
+              <w:t xml:space="preserve"> blend in malicious pathways and avoid traditional security filters</w:t>
+            </w:r>
+          </w:p>
+        </w:tc>
+      </w:tr>
+      <w:tr>
+        <w:trPr>
+          <w:cantSplit/>
+        </w:trPr>
+        <w:tc>
+          <w:tcPr>
+            <w:tcW w:w="1685" w:type="dxa"/>
+            <w:vAlign w:val="center"/>
+          </w:tcPr>
+          <w:p>
+            <w:pPr>
+              <w:spacing w:line="360" w:lineRule="auto"/>
+              <w:jc w:val="center"/>
+              <w:rPr>
+                <w:rFonts w:ascii="Arial" w:hAnsi="Arial" w:cs="Arial"/>
+                <w:i/>
+                <w:iCs/>
+              </w:rPr>
+            </w:pPr>
+            <w:r>
+              <w:rPr>
+                <w:rFonts w:ascii="Arial" w:hAnsi="Arial" w:cs="Arial"/>
+                <w:i/>
+                <w:iCs/>
+              </w:rPr>
+              <w:t>IP Address</w:t>
+            </w:r>
+          </w:p>
+        </w:tc>
+        <w:tc>
+          <w:tcPr>
+            <w:tcW w:w="2396" w:type="dxa"/>
+          </w:tcPr>
+          <w:p>
+            <w:pPr>
+              <w:spacing w:line="360" w:lineRule="auto"/>
+              <w:rPr>
+                <w:rFonts w:ascii="Arial" w:hAnsi="Arial" w:cs="Arial"/>
+              </w:rPr>
+            </w:pPr>
+            <w:r>
+              <w:rPr>
+                <w:rFonts w:ascii="Arial" w:hAnsi="Arial" w:cs="Arial"/>
+              </w:rPr>
+              <w:t>URL is an IP address</w:t>
+            </w:r>
+          </w:p>
+        </w:tc>
+        <w:tc>
+          <w:tcPr>
+            <w:tcW w:w="1559" w:type="dxa"/>
+            <w:vAlign w:val="center"/>
+          </w:tcPr>
+          <w:p>
+            <w:pPr>
+              <w:spacing w:line="360" w:lineRule="auto"/>
+              <w:jc w:val="center"/>
+              <w:rPr>
+                <w:rFonts w:ascii="Arial" w:hAnsi="Arial" w:cs="Arial"/>
+              </w:rPr>
+            </w:pPr>
+            <w:r>
+              <w:rPr>
+                <w:rFonts w:ascii="Arial" w:hAnsi="Arial" w:cs="Arial"/>
+              </w:rPr>
+              <w:t xml:space="preserve">+30 </w:t>
+            </w:r>
+            <w:r>
+              <w:rPr>
+                <w:rFonts w:ascii="Arial" w:hAnsi="Arial" w:cs="Arial"/>
+              </w:rPr>
+              <w:t>p</w:t>
+            </w:r>
+            <w:r>
+              <w:rPr>
+                <w:rFonts w:ascii="Arial" w:hAnsi="Arial" w:cs="Arial"/>
+              </w:rPr>
+              <w:t>oints</w:t>
+            </w:r>
+          </w:p>
+        </w:tc>
+        <w:tc>
+          <w:tcPr>
+            <w:tcW w:w="3326" w:type="dxa"/>
+          </w:tcPr>
+          <w:p>
+            <w:pPr>
+              <w:spacing w:line="360" w:lineRule="auto"/>
+              <w:rPr>
+                <w:rFonts w:ascii="Arial" w:hAnsi="Arial" w:cs="Arial"/>
+              </w:rPr>
+            </w:pPr>
+            <w:r>
+              <w:rPr>
+                <w:rFonts w:ascii="Arial" w:hAnsi="Arial" w:cs="Arial"/>
+              </w:rPr>
+              <w:t xml:space="preserve">Conceals domain name and </w:t>
+            </w:r>
+            <w:r>
+              <w:rPr>
+                <w:rFonts w:ascii="Arial" w:hAnsi="Arial" w:cs="Arial"/>
+              </w:rPr>
+              <w:t xml:space="preserve">may indicate a </w:t>
+            </w:r>
+            <w:r>
+              <w:rPr>
+                <w:rFonts w:ascii="Arial" w:hAnsi="Arial" w:cs="Arial"/>
+              </w:rPr>
+              <w:t>maliciously hosted server</w:t>
+            </w:r>
+          </w:p>
+        </w:tc>
+      </w:tr>
+      <w:tr>
+        <w:trPr>
+          <w:cantSplit/>
+        </w:trPr>
+        <w:tc>
+          <w:tcPr>
+            <w:tcW w:w="1685" w:type="dxa"/>
+            <w:vAlign w:val="center"/>
+          </w:tcPr>
+          <w:p>
+            <w:pPr>
+              <w:spacing w:line="360" w:lineRule="auto"/>
+              <w:jc w:val="center"/>
+              <w:rPr>
+                <w:rFonts w:ascii="Arial" w:hAnsi="Arial" w:cs="Arial"/>
+                <w:i/>
+                <w:iCs/>
+              </w:rPr>
+            </w:pPr>
+            <w:r>
+              <w:rPr>
+                <w:rFonts w:ascii="Arial" w:hAnsi="Arial" w:cs="Arial"/>
+                <w:i/>
+                <w:iCs/>
+              </w:rPr>
+              <w:t>Homograph Attack</w:t>
+            </w:r>
+          </w:p>
+        </w:tc>
+        <w:tc>
+          <w:tcPr>
+            <w:tcW w:w="2396" w:type="dxa"/>
+          </w:tcPr>
+          <w:p>
+            <w:pPr>
+              <w:spacing w:line="360" w:lineRule="auto"/>
+              <w:rPr>
+                <w:rFonts w:ascii="Arial" w:hAnsi="Arial" w:cs="Arial"/>
+              </w:rPr>
+            </w:pPr>
+            <w:r>
+              <w:rPr>
+                <w:rFonts w:ascii="Arial" w:hAnsi="Arial" w:cs="Arial"/>
+              </w:rPr>
+              <w:t>Contains punycode ‘xn</w:t>
+            </w:r>
+            <w:r>
+              <w:rPr>
+                <w:rFonts w:ascii="Arial" w:hAnsi="Arial" w:cs="Arial"/>
+              </w:rPr>
+              <w:t>--'</w:t>
+            </w:r>
+          </w:p>
+        </w:tc>
+        <w:tc>
+          <w:tcPr>
+            <w:tcW w:w="1559" w:type="dxa"/>
+            <w:vAlign w:val="center"/>
+          </w:tcPr>
+          <w:p>
+            <w:pPr>
+              <w:spacing w:line="360" w:lineRule="auto"/>
+              <w:jc w:val="center"/>
+              <w:rPr>
+                <w:rFonts w:ascii="Arial" w:hAnsi="Arial" w:cs="Arial"/>
+              </w:rPr>
+            </w:pPr>
+            <w:r>
+              <w:rPr>
+                <w:rFonts w:ascii="Arial" w:hAnsi="Arial" w:cs="Arial"/>
+              </w:rPr>
+              <w:t xml:space="preserve">+30 </w:t>
+            </w:r>
+            <w:r>
+              <w:rPr>
+                <w:rFonts w:ascii="Arial" w:hAnsi="Arial" w:cs="Arial"/>
+              </w:rPr>
+              <w:t>p</w:t>
+            </w:r>
+            <w:r>
+              <w:rPr>
+                <w:rFonts w:ascii="Arial" w:hAnsi="Arial" w:cs="Arial"/>
+              </w:rPr>
+              <w:t>oints</w:t>
+            </w:r>
+          </w:p>
+        </w:tc>
+        <w:tc>
+          <w:tcPr>
+            <w:tcW w:w="3326" w:type="dxa"/>
+          </w:tcPr>
+          <w:p>
+            <w:pPr>
+              <w:spacing w:line="360" w:lineRule="auto"/>
+              <w:rPr>
+                <w:rFonts w:ascii="Arial" w:hAnsi="Arial" w:cs="Arial"/>
+              </w:rPr>
+            </w:pPr>
+            <w:r>
+              <w:rPr>
+                <w:rFonts w:ascii="Arial" w:hAnsi="Arial" w:cs="Arial"/>
+              </w:rPr>
+              <w:t xml:space="preserve">Exploits similar looking characters to </w:t>
+            </w:r>
+            <w:r>
+              <w:rPr>
+                <w:rFonts w:ascii="Arial" w:hAnsi="Arial" w:cs="Arial"/>
+              </w:rPr>
+              <w:t xml:space="preserve">impersonate legitimate domains </w:t>
+            </w:r>
+          </w:p>
+        </w:tc>
+      </w:tr>
+      <w:tr>
+        <w:trPr>
+          <w:cantSplit/>
+        </w:trPr>
+        <w:tc>
+          <w:tcPr>
+            <w:tcW w:w="1685" w:type="dxa"/>
+            <w:vAlign w:val="center"/>
+          </w:tcPr>
+          <w:p>
+            <w:pPr>
+              <w:spacing w:line="360" w:lineRule="auto"/>
+              <w:jc w:val="center"/>
+              <w:rPr>
+                <w:rFonts w:ascii="Arial" w:hAnsi="Arial" w:cs="Arial"/>
+                <w:i/>
+                <w:iCs/>
+              </w:rPr>
+            </w:pPr>
+            <w:r>
+              <w:rPr>
+                <w:rFonts w:ascii="Arial" w:hAnsi="Arial" w:cs="Arial"/>
+                <w:i/>
+                <w:iCs/>
+              </w:rPr>
+              <w:t>@ Symbol</w:t>
+            </w:r>
+          </w:p>
+        </w:tc>
+        <w:tc>
+          <w:tcPr>
+            <w:tcW w:w="2396" w:type="dxa"/>
+          </w:tcPr>
+          <w:p>
+            <w:pPr>
+              <w:spacing w:line="360" w:lineRule="auto"/>
+              <w:rPr>
+                <w:rFonts w:ascii="Arial" w:hAnsi="Arial" w:cs="Arial"/>
+              </w:rPr>
+            </w:pPr>
+            <w:r>
+              <w:rPr>
+                <w:rFonts w:ascii="Arial" w:hAnsi="Arial" w:cs="Arial"/>
+              </w:rPr>
+              <w:t xml:space="preserve">Contains ‘@’ </w:t>
+            </w:r>
+          </w:p>
+        </w:tc>
+        <w:tc>
+          <w:tcPr>
+            <w:tcW w:w="1559" w:type="dxa"/>
+            <w:vAlign w:val="center"/>
+          </w:tcPr>
+          <w:p>
+            <w:pPr>
+              <w:spacing w:line="360" w:lineRule="auto"/>
+              <w:jc w:val="center"/>
+              <w:rPr>
+                <w:rFonts w:ascii="Arial" w:hAnsi="Arial" w:cs="Arial"/>
+              </w:rPr>
+            </w:pPr>
+            <w:r>
+              <w:rPr>
+                <w:rFonts w:ascii="Arial" w:hAnsi="Arial" w:cs="Arial"/>
+              </w:rPr>
+              <w:t xml:space="preserve">+20 </w:t>
+            </w:r>
+            <w:r>
+              <w:rPr>
+                <w:rFonts w:ascii="Arial" w:hAnsi="Arial" w:cs="Arial"/>
+              </w:rPr>
+              <w:t>p</w:t>
+            </w:r>
+            <w:r>
+              <w:rPr>
+                <w:rFonts w:ascii="Arial" w:hAnsi="Arial" w:cs="Arial"/>
+              </w:rPr>
+              <w:t>oints</w:t>
+            </w:r>
+          </w:p>
+        </w:tc>
+        <w:tc>
+          <w:tcPr>
+            <w:tcW w:w="3326" w:type="dxa"/>
+          </w:tcPr>
+          <w:p>
+            <w:pPr>
+              <w:spacing w:line="360" w:lineRule="auto"/>
+              <w:rPr>
+                <w:rFonts w:ascii="Arial" w:hAnsi="Arial" w:cs="Arial"/>
+              </w:rPr>
+            </w:pPr>
+            <w:r>
+              <w:rPr>
+                <w:rFonts w:ascii="Arial" w:hAnsi="Arial" w:cs="Arial"/>
+              </w:rPr>
+              <w:t>Obscures destination by placing it</w:t>
+            </w:r>
+            <w:r>
+              <w:rPr>
+                <w:rFonts w:ascii="Arial" w:hAnsi="Arial" w:cs="Arial"/>
+              </w:rPr>
+              <w:t xml:space="preserve"> after a legitimate domain</w:t>
+            </w:r>
+          </w:p>
+        </w:tc>
+      </w:tr>
+      <w:tr>
+        <w:trPr>
+          <w:cantSplit/>
+        </w:trPr>
+        <w:tc>
+          <w:tcPr>
+            <w:tcW w:w="1685" w:type="dxa"/>
+            <w:vAlign w:val="center"/>
+          </w:tcPr>
+          <w:p>
+            <w:pPr>
+              <w:spacing w:line="360" w:lineRule="auto"/>
+              <w:jc w:val="center"/>
+              <w:rPr>
+                <w:rFonts w:ascii="Arial" w:hAnsi="Arial" w:cs="Arial"/>
+                <w:i/>
+                <w:iCs/>
+              </w:rPr>
+            </w:pPr>
+            <w:r>
+              <w:rPr>
+                <w:rFonts w:ascii="Arial" w:hAnsi="Arial" w:cs="Arial"/>
+                <w:i/>
+                <w:iCs/>
+              </w:rPr>
+              <w:t>Multiple Dots</w:t>
+            </w:r>
+          </w:p>
+        </w:tc>
+        <w:tc>
+          <w:tcPr>
+            <w:tcW w:w="2396" w:type="dxa"/>
+          </w:tcPr>
+          <w:p>
+            <w:pPr>
+              <w:spacing w:line="360" w:lineRule="auto"/>
+              <w:rPr>
+                <w:rFonts w:ascii="Arial" w:hAnsi="Arial" w:cs="Arial"/>
+              </w:rPr>
+            </w:pPr>
+            <w:r>
+              <w:rPr>
+                <w:rFonts w:ascii="Arial" w:hAnsi="Arial" w:cs="Arial"/>
+              </w:rPr>
+              <w:t>Contains three or more dots</w:t>
+            </w:r>
+          </w:p>
+        </w:tc>
+        <w:tc>
+          <w:tcPr>
+            <w:tcW w:w="1559" w:type="dxa"/>
+            <w:vAlign w:val="center"/>
+          </w:tcPr>
+          <w:p>
+            <w:pPr>
+              <w:spacing w:line="360" w:lineRule="auto"/>
+              <w:jc w:val="center"/>
+              <w:rPr>
+                <w:rFonts w:ascii="Arial" w:hAnsi="Arial" w:cs="Arial"/>
+              </w:rPr>
+            </w:pPr>
+            <w:r>
+              <w:rPr>
+                <w:rFonts w:ascii="Arial" w:hAnsi="Arial" w:cs="Arial"/>
+              </w:rPr>
+              <w:t xml:space="preserve">+5 </w:t>
+            </w:r>
+            <w:r>
+              <w:rPr>
+                <w:rFonts w:ascii="Arial" w:hAnsi="Arial" w:cs="Arial"/>
+              </w:rPr>
+              <w:t>p</w:t>
+            </w:r>
+            <w:r>
+              <w:rPr>
+                <w:rFonts w:ascii="Arial" w:hAnsi="Arial" w:cs="Arial"/>
+              </w:rPr>
+              <w:t>oints</w:t>
+            </w:r>
+          </w:p>
+        </w:tc>
+        <w:tc>
+          <w:tcPr>
+            <w:tcW w:w="3326" w:type="dxa"/>
+          </w:tcPr>
+          <w:p>
+            <w:pPr>
+              <w:spacing w:line="360" w:lineRule="auto"/>
+              <w:rPr>
+                <w:rFonts w:ascii="Arial" w:hAnsi="Arial" w:cs="Arial"/>
+              </w:rPr>
+            </w:pPr>
+            <w:r>
+              <w:rPr>
+                <w:rFonts w:ascii="Arial" w:hAnsi="Arial" w:cs="Arial"/>
+              </w:rPr>
+              <w:t>Enables subdomain manipulation to imitate legitimate domains</w:t>
+            </w:r>
+          </w:p>
+        </w:tc>
+      </w:tr>
+    </w:tbl>
+    <w:p>
+      <w:pPr>
+        <w:spacing w:line="360" w:lineRule="auto"/>
+        <w:rPr>
+          <w:rFonts w:ascii="Arial" w:hAnsi="Arial" w:cs="Arial"/>
+        </w:rPr>
+      </w:pPr>
     </w:p>
     <w:p>
       <w:pPr>
@@ -16653,7 +17342,19 @@
         <w:rPr>
           <w:rFonts w:ascii="Arial" w:hAnsi="Arial" w:cs="Arial"/>
         </w:rPr>
-        <w:t xml:space="preserve"> API is used to check the age of a domain, increasing the risk score based on how young the domain is. </w:t>
+        <w:t xml:space="preserve"> API is used to check the age of a domain, increasing the risk score based on the</w:t>
+      </w:r>
+      <w:r>
+        <w:rPr>
+          <w:rFonts w:ascii="Arial" w:hAnsi="Arial" w:cs="Arial"/>
+        </w:rPr>
+        <w:t xml:space="preserve"> age</w:t>
+      </w:r>
+      <w:r>
+        <w:rPr>
+          <w:rFonts w:ascii="Arial" w:hAnsi="Arial" w:cs="Arial"/>
+        </w:rPr>
+        <w:t xml:space="preserve">. </w:t>
       </w:r>
       <w:r>
         <w:rPr>
@@ -16678,7 +17379,19 @@
         <w:rPr>
           <w:rFonts w:ascii="Arial" w:hAnsi="Arial" w:cs="Arial"/>
         </w:rPr>
-        <w:t>shows the code for the ‘</w:t>
+        <w:t>shows</w:t>
+      </w:r>
+      <w:r>
+        <w:rPr>
+          <w:rFonts w:ascii="Arial" w:hAnsi="Arial" w:cs="Arial"/>
+        </w:rPr>
+        <w:t xml:space="preserve"> implementation of the</w:t>
+      </w:r>
+      <w:r>
+        <w:rPr>
+          <w:rFonts w:ascii="Arial" w:hAnsi="Arial" w:cs="Arial"/>
+        </w:rPr>
+        <w:t xml:space="preserve"> ‘</w:t>
       </w:r>
       <w:proofErr w:type="spellStart"/>
       <w:proofErr w:type="gramStart"/>
@@ -16700,7 +17413,7 @@
         <w:rPr>
           <w:rFonts w:ascii="Arial" w:hAnsi="Arial" w:cs="Arial"/>
         </w:rPr>
-        <w:t xml:space="preserve">)’ function in Visual Studio Code. The age risk is split into </w:t>
+        <w:t xml:space="preserve">)’ function. The age risk is split into </w:t>
       </w:r>
       <w:r>
         <w:rPr>
@@ -16884,6 +17597,227 @@
           <w:rFonts w:ascii="Arial" w:hAnsi="Arial" w:cs="Arial"/>
         </w:rPr>
       </w:pPr>
+      <w:r>
+        <w:rPr>
+          <w:noProof/>
+        </w:rPr>
+        <mc:AlternateContent>
+          <mc:Choice Requires="wps">
+            <w:drawing>
+              <wp:anchor distT="0" distB="0" distL="114300" distR="114300" simplePos="0" relativeHeight="251682816" behindDoc="0" locked="0" layoutInCell="1" allowOverlap="1" wp14:anchorId="28CE052B" wp14:editId="1AB58D0B">
+                <wp:simplePos x="0" y="0"/>
+                <wp:positionH relativeFrom="column">
+                  <wp:posOffset>0</wp:posOffset>
+                </wp:positionH>
+                <wp:positionV relativeFrom="paragraph">
+                  <wp:posOffset>5531485</wp:posOffset>
+                </wp:positionV>
+                <wp:extent cx="5731510" cy="635"/>
+                <wp:effectExtent l="0" t="0" r="0" b="12065"/>
+                <wp:wrapSquare wrapText="bothSides"/>
+                <wp:docPr id="116828681" name="Text Box 1"/>
+                <wp:cNvGraphicFramePr/>
+                <a:graphic xmlns:a="http://schemas.openxmlformats.org/drawingml/2006/main">
+                  <a:graphicData uri="http://schemas.microsoft.com/office/word/2010/wordprocessingShape">
+                    <wps:wsp>
+                      <wps:cNvSpPr txBox="1"/>
+                      <wps:spPr>
+                        <a:xfrm>
+                          <a:off x="0" y="0"/>
+                          <a:ext cx="5731510" cy="635"/>
+                        </a:xfrm>
+                        <a:prstGeom prst="rect">
+                          <a:avLst/>
+                        </a:prstGeom>
+                        <a:solidFill>
+                          <a:prstClr val="white"/>
+                        </a:solidFill>
+                        <a:ln>
+                          <a:noFill/>
+                        </a:ln>
+                      </wps:spPr>
+                      <wps:txbx>
+                        <w:txbxContent>
+                          <w:p>
+                            <w:pPr>
+                              <w:pStyle w:val="Caption"/>
+                              <w:rPr>
+                                <w:rFonts w:ascii="Arial" w:hAnsi="Arial" w:cs="Arial"/>
+                                <w:noProof/>
+                              </w:rPr>
+                            </w:pPr>
+                            <w:r>
+                              <w:t xml:space="preserve">Figure </w:t>
+                            </w:r>
+                            <w:r>
+                              <w:fldChar w:fldCharType="begin"/>
+                            </w:r>
+                            <w:r>
+                              <w:instrText xml:space="preserve"> SEQ Figure \* ARABIC </w:instrText>
+                            </w:r>
+                            <w:r>
+                              <w:fldChar w:fldCharType="separate"/>
+                            </w:r>
+                            <w:r>
+                              <w:rPr>
+                                <w:noProof/>
+                              </w:rPr>
+                              <w:t>7</w:t>
+                            </w:r>
+                            <w:r>
+                              <w:fldChar w:fldCharType="end"/>
+                            </w:r>
+                            <w:r>
+                              <w:t xml:space="preserve"> – The </w:t>
+                            </w:r>
+                            <w:proofErr w:type="spellStart"/>
+                            <w:proofErr w:type="gramStart"/>
+                            <w:r>
+                              <w:t>checkDomainAge</w:t>
+                            </w:r>
+                            <w:proofErr w:type="spellEnd"/>
+                            <w:r>
+                              <w:t>(</w:t>
+                            </w:r>
+                            <w:proofErr w:type="gramEnd"/>
+                            <w:r>
+                              <w:t>) function integrated in Visual Studio Code</w:t>
+                            </w:r>
+                          </w:p>
+                        </w:txbxContent>
+                      </wps:txbx>
+                      <wps:bodyPr rot="0" spcFirstLastPara="0" vertOverflow="overflow" horzOverflow="overflow" vert="horz" wrap="square" lIns="0" tIns="0" rIns="0" bIns="0" numCol="1" spcCol="0" rtlCol="0" fromWordArt="0" anchor="t" anchorCtr="0" forceAA="0" compatLnSpc="1">
+                        <a:prstTxWarp prst="textNoShape">
+                          <a:avLst/>
+                        </a:prstTxWarp>
+                        <a:spAutoFit/>
+                      </wps:bodyPr>
+                    </wps:wsp>
+                  </a:graphicData>
+                </a:graphic>
+              </wp:anchor>
+            </w:drawing>
+          </mc:Choice>
+          <mc:Fallback>
+            <w:pict>
+              <v:shape w14:anchorId="28CE052B" id="_x0000_s1032" type="#_x0000_t202" style="position:absolute;margin-left:0;margin-top:435.55pt;width:451.3pt;height:.05pt;z-index:251682816;visibility:visible;mso-wrap-style:square;mso-wrap-distance-left:9pt;mso-wrap-distance-top:0;mso-wrap-distance-right:9pt;mso-wrap-distance-bottom:0;mso-position-horizontal:absolute;mso-position-horizontal-relative:text;mso-position-vertical:absolute;mso-position-vertical-relative:text;v-text-anchor:top" o:gfxdata="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" stroked="f">
+                <v:textbox style="mso-fit-shape-to-text:t" inset="0,0,0,0">
+                  <w:txbxContent>
+                    <w:p>
+                      <w:pPr>
+                        <w:pStyle w:val="Caption"/>
+                        <w:rPr>
+                          <w:rFonts w:ascii="Arial" w:hAnsi="Arial" w:cs="Arial"/>
+                          <w:noProof/>
+                        </w:rPr>
+                      </w:pPr>
+                      <w:r>
+                        <w:t xml:space="preserve">Figure </w:t>
+                      </w:r>
+                      <w:r>
+                        <w:fldChar w:fldCharType="begin"/>
+                      </w:r>
+                      <w:r>
+                        <w:instrText xml:space="preserve"> SEQ Figure \* ARABIC </w:instrText>
+                      </w:r>
+                      <w:r>
+                        <w:fldChar w:fldCharType="separate"/>
+                      </w:r>
+                      <w:r>
+                        <w:rPr>
+                          <w:noProof/>
+                        </w:rPr>
+                        <w:t>7</w:t>
+                      </w:r>
+                      <w:r>
+                        <w:fldChar w:fldCharType="end"/>
+                      </w:r>
+                      <w:r>
+                        <w:t xml:space="preserve"> – The </w:t>
+                      </w:r>
+                      <w:proofErr w:type="spellStart"/>
+                      <w:proofErr w:type="gramStart"/>
+                      <w:r>
+                        <w:t>checkDomainAge</w:t>
+                      </w:r>
+                      <w:proofErr w:type="spellEnd"/>
+                      <w:r>
+                        <w:t>(</w:t>
+                      </w:r>
+                      <w:proofErr w:type="gramEnd"/>
+                      <w:r>
+                        <w:t>) function integrated in Visual Studio Code</w:t>
+                      </w:r>
+                    </w:p>
+                  </w:txbxContent>
+                </v:textbox>
+                <w10:wrap type="square"/>
+              </v:shape>
+            </w:pict>
+          </mc:Fallback>
+        </mc:AlternateContent>
+      </w:r>
+      <w:r>
+        <w:rPr>
+          <w:rFonts w:ascii="Arial" w:hAnsi="Arial" w:cs="Arial"/>
+          <w:noProof/>
+        </w:rPr>
+        <w:drawing>
+          <wp:anchor distT="0" distB="0" distL="114300" distR="114300" simplePos="0" relativeHeight="251680768" behindDoc="0" locked="0" layoutInCell="1" allowOverlap="1" wp14:anchorId="6A6A1550" wp14:editId="3FEC122F">
+            <wp:simplePos x="0" y="0"/>
+            <wp:positionH relativeFrom="column">
+              <wp:posOffset>0</wp:posOffset>
+            </wp:positionH>
+            <wp:positionV relativeFrom="paragraph">
+              <wp:posOffset>4445</wp:posOffset>
+            </wp:positionV>
+            <wp:extent cx="5731510" cy="5469890"/>
+            <wp:effectExtent l="0" t="0" r="0" b="3810"/>
+            <wp:wrapSquare wrapText="bothSides"/>
+            <wp:docPr id="1717794914" name="Picture 4"/>
+            <wp:cNvGraphicFramePr>
+              <a:graphicFrameLocks xmlns:a="http://schemas.openxmlformats.org/drawingml/2006/main" noChangeAspect="1"/>
+            </wp:cNvGraphicFramePr>
+            <a:graphic xmlns:a="http://schemas.openxmlformats.org/drawingml/2006/main">
+              <a:graphicData uri="http://schemas.openxmlformats.org/drawingml/2006/picture">
+                <pic:pic xmlns:pic="http://schemas.openxmlformats.org/drawingml/2006/picture">
+                  <pic:nvPicPr>
+                    <pic:cNvPr id="1717794914" name="Picture 1717794914"/>
+                    <pic:cNvPicPr/>
+                  </pic:nvPicPr>
+                  <pic:blipFill>
+                    <a:blip r:embed="rId15" cstate="print">
+                      <a:extLst>
+                        <a:ext uri="{28A0092B-C50C-407E-A947-70E740481C1C}">
+                          <a14:useLocalDpi xmlns:a14="http://schemas.microsoft.com/office/drawing/2010/main" val="0"/>
+                        </a:ext>
+                      </a:extLst>
+                    </a:blip>
+                    <a:stretch>
+                      <a:fillRect/>
+                    </a:stretch>
+                  </pic:blipFill>
+                  <pic:spPr>
+                    <a:xfrm>
+                      <a:off x="0" y="0"/>
+                      <a:ext cx="5731510" cy="5469890"/>
+                    </a:xfrm>
+                    <a:prstGeom prst="rect">
+                      <a:avLst/>
+                    </a:prstGeom>
+                  </pic:spPr>
+                </pic:pic>
+              </a:graphicData>
+            </a:graphic>
+            <wp14:sizeRelH relativeFrom="page">
+              <wp14:pctWidth>0</wp14:pctWidth>
+            </wp14:sizeRelH>
+            <wp14:sizeRelV relativeFrom="page">
+              <wp14:pctHeight>0</wp14:pctHeight>
+            </wp14:sizeRelV>
+          </wp:anchor>
+        </w:drawing>
+      </w:r>
     </w:p>
     <w:p>
       <w:pPr>
@@ -16901,6 +17835,7 @@
           <w:b/>
           <w:bCs/>
         </w:rPr>
+        <w:lastRenderedPageBreak/>
         <w:t>Security Header Check</w:t>
       </w:r>
     </w:p>
@@ -16954,7 +17889,7 @@
           <w:rFonts w:ascii="Arial" w:hAnsi="Arial" w:cs="Arial"/>
         </w:rPr>
       </w:pPr>
-      <w:hyperlink r:id="rId15" w:history="1">
+      <w:hyperlink r:id="rId16" w:history="1">
         <w:r>
           <w:rPr>
             <w:rStyle w:val="Hyperlink"/>
@@ -17079,7 +18014,7 @@
           <w:rFonts w:ascii="Arial" w:hAnsi="Arial" w:cs="Arial"/>
         </w:rPr>
       </w:pPr>
-      <w:hyperlink r:id="rId16" w:history="1">
+      <w:hyperlink r:id="rId17" w:history="1">
         <w:r>
           <w:rPr>
             <w:rStyle w:val="Hyperlink"/>
@@ -17101,7 +18036,7 @@
           <w:rFonts w:ascii="Arial" w:hAnsi="Arial" w:cs="Arial"/>
         </w:rPr>
       </w:pPr>
-      <w:hyperlink r:id="rId17" w:history="1">
+      <w:hyperlink r:id="rId18" w:history="1">
         <w:r>
           <w:rPr>
             <w:rStyle w:val="Hyperlink"/>
@@ -17254,7 +18189,6 @@
         <w:rPr>
           <w:rFonts w:ascii="Arial" w:hAnsi="Arial" w:cs="Arial"/>
         </w:rPr>
-        <w:lastRenderedPageBreak/>
         <w:t>Does not run the distance checking function if the host name of the URL entered matches in the known domains list</w:t>
       </w:r>
     </w:p>
@@ -17322,7 +18256,7 @@
           <w:rFonts w:ascii="Arial" w:hAnsi="Arial" w:cs="Arial"/>
         </w:rPr>
       </w:pPr>
-      <w:hyperlink r:id="rId18" w:history="1">
+      <w:hyperlink r:id="rId19" w:history="1">
         <w:r>
           <w:rPr>
             <w:rStyle w:val="Hyperlink"/>
@@ -17348,6 +18282,7 @@
           <w:b/>
           <w:bCs/>
         </w:rPr>
+        <w:lastRenderedPageBreak/>
         <w:t>DNS Check</w:t>
       </w:r>
     </w:p>
@@ -17526,7 +18461,7 @@
                               <w:rPr>
                                 <w:noProof/>
                               </w:rPr>
-                              <w:t>7</w:t>
+                              <w:t>8</w:t>
                             </w:r>
                             <w:r>
                               <w:fldChar w:fldCharType="end"/>
@@ -17564,7 +18499,7 @@
           </mc:Choice>
           <mc:Fallback>
             <w:pict>
-              <v:shape w14:anchorId="46679ACC" id="_x0000_s1032" type="#_x0000_t202" style="position:absolute;margin-left:0;margin-top:595.1pt;width:451.3pt;height:.05pt;z-index:251679744;visibility:visible;mso-wrap-style:square;mso-wrap-distance-left:9pt;mso-wrap-distance-top:0;mso-wrap-distance-right:9pt;mso-wrap-distance-bottom:0;mso-position-horizontal:absolute;mso-position-horizontal-relative:text;mso-position-vertical:absolute;mso-position-vertical-relative:text;v-text-anchor:top" o:gfxdata="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" stroked="f">
+              <v:shape w14:anchorId="46679ACC" id="_x0000_s1033" type="#_x0000_t202" style="position:absolute;margin-left:0;margin-top:595.1pt;width:451.3pt;height:.05pt;z-index:251679744;visibility:visible;mso-wrap-style:square;mso-wrap-distance-left:9pt;mso-wrap-distance-top:0;mso-wrap-distance-right:9pt;mso-wrap-distance-bottom:0;mso-position-horizontal:absolute;mso-position-horizontal-relative:text;mso-position-vertical:absolute;mso-position-vertical-relative:text;v-text-anchor:top" o:gfxdata="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" stroked="f">
                 <v:textbox style="mso-fit-shape-to-text:t" inset="0,0,0,0">
                   <w:txbxContent>
                     <w:p>
@@ -17591,7 +18526,7 @@
                         <w:rPr>
                           <w:noProof/>
                         </w:rPr>
-                        <w:t>7</w:t>
+                        <w:t>8</w:t>
                       </w:r>
                       <w:r>
                         <w:fldChar w:fldCharType="end"/>
@@ -17650,7 +18585,7 @@
                     <pic:cNvPicPr/>
                   </pic:nvPicPr>
                   <pic:blipFill>
-                    <a:blip r:embed="rId19">
+                    <a:blip r:embed="rId20">
                       <a:extLst>
                         <a:ext uri="{28A0092B-C50C-407E-A947-70E740481C1C}">
                           <a14:useLocalDpi xmlns:a14="http://schemas.microsoft.com/office/drawing/2010/main" val="0"/>
@@ -17782,7 +18717,7 @@
         </w:rPr>
         <w:tab/>
       </w:r>
-      <w:hyperlink r:id="rId20" w:history="1">
+      <w:hyperlink r:id="rId21" w:history="1">
         <w:r>
           <w:rPr>
             <w:rStyle w:val="Hyperlink"/>
@@ -18161,7 +19096,7 @@
         </w:rPr>
         <w:t>Had small experience working within these languages before – Used W3Schools to help with code (</w:t>
       </w:r>
-      <w:hyperlink r:id="rId21" w:history="1">
+      <w:hyperlink r:id="rId22" w:history="1">
         <w:r>
           <w:rPr>
             <w:rStyle w:val="Hyperlink"/>
@@ -18176,7 +19111,7 @@
         </w:rPr>
         <w:t xml:space="preserve">, </w:t>
       </w:r>
-      <w:hyperlink r:id="rId22" w:history="1">
+      <w:hyperlink r:id="rId23" w:history="1">
         <w:r>
           <w:rPr>
             <w:rStyle w:val="Hyperlink"/>
@@ -18191,7 +19126,7 @@
         </w:rPr>
         <w:t xml:space="preserve">, </w:t>
       </w:r>
-      <w:hyperlink r:id="rId23" w:history="1">
+      <w:hyperlink r:id="rId24" w:history="1">
         <w:r>
           <w:rPr>
             <w:rStyle w:val="Hyperlink"/>
@@ -18225,7 +19160,7 @@
         </w:rPr>
         <w:t>ChatGPT was used for debugging purposes, to generate pseudocode, and for clarification of language (</w:t>
       </w:r>
-      <w:hyperlink r:id="rId24" w:history="1">
+      <w:hyperlink r:id="rId25" w:history="1">
         <w:r>
           <w:rPr>
             <w:rStyle w:val="Hyperlink"/>
@@ -18259,7 +19194,7 @@
         </w:rPr>
         <w:t>Used official Electron website and documents (</w:t>
       </w:r>
-      <w:hyperlink r:id="rId25" w:history="1">
+      <w:hyperlink r:id="rId26" w:history="1">
         <w:r>
           <w:rPr>
             <w:rStyle w:val="Hyperlink"/>
@@ -18274,7 +19209,7 @@
         </w:rPr>
         <w:t xml:space="preserve">, </w:t>
       </w:r>
-      <w:hyperlink r:id="rId26" w:history="1">
+      <w:hyperlink r:id="rId27" w:history="1">
         <w:r>
           <w:rPr>
             <w:rStyle w:val="Hyperlink"/>
@@ -18308,7 +19243,7 @@
         </w:rPr>
         <w:t>Used Stack Overflow (</w:t>
       </w:r>
-      <w:hyperlink r:id="rId27" w:history="1">
+      <w:hyperlink r:id="rId28" w:history="1">
         <w:r>
           <w:rPr>
             <w:rStyle w:val="Hyperlink"/>
@@ -18342,7 +19277,7 @@
         </w:rPr>
         <w:t>Used Firebase as the database to store user and quiz data (</w:t>
       </w:r>
-      <w:hyperlink r:id="rId28" w:history="1">
+      <w:hyperlink r:id="rId29" w:history="1">
         <w:r>
           <w:rPr>
             <w:rStyle w:val="Hyperlink"/>
@@ -18357,7 +19292,7 @@
         </w:rPr>
         <w:t xml:space="preserve">, </w:t>
       </w:r>
-      <w:hyperlink r:id="rId29" w:history="1">
+      <w:hyperlink r:id="rId30" w:history="1">
         <w:r>
           <w:rPr>
             <w:rStyle w:val="Hyperlink"/>
@@ -19485,8 +20420,8 @@
       </w:pPr>
     </w:p>
     <w:sectPr>
-      <w:footerReference w:type="even" r:id="rId30"/>
-      <w:footerReference w:type="default" r:id="rId31"/>
+      <w:footerReference w:type="even" r:id="rId31"/>
+      <w:footerReference w:type="default" r:id="rId32"/>
       <w:pgSz w:w="11906" w:h="16838"/>
       <w:pgMar w:top="1440" w:right="1440" w:bottom="1440" w:left="1440" w:header="708" w:footer="708" w:gutter="0"/>
       <w:cols w:space="708"/>
@@ -22522,6 +23457,25 @@
       <w:spacing w:after="0"/>
     </w:pPr>
   </w:style>
+  <w:style w:type="table" w:styleId="TableGrid">
+    <w:name w:val="Table Grid"/>
+    <w:basedOn w:val="TableNormal"/>
+    <w:uiPriority w:val="39"/>
+    <w:rsid w:val="00015503"/>
+    <w:pPr>
+      <w:spacing w:after="0" w:line="240" w:lineRule="auto"/>
+    </w:pPr>
+    <w:tblPr>
+      <w:tblBorders>
+        <w:top w:val="single" w:sz="4" w:space="0" w:color="auto"/>
+        <w:left w:val="single" w:sz="4" w:space="0" w:color="auto"/>
+        <w:bottom w:val="single" w:sz="4" w:space="0" w:color="auto"/>
+        <w:right w:val="single" w:sz="4" w:space="0" w:color="auto"/>
+        <w:insideH w:val="single" w:sz="4" w:space="0" w:color="auto"/>
+        <w:insideV w:val="single" w:sz="4" w:space="0" w:color="auto"/>
+      </w:tblBorders>
+    </w:tblPr>
+  </w:style>
 </w:styles>
 </file>
 

</xml_diff>

<commit_message>
rewrite of lit review
buffed out 2.2.3/4 a bit more and added a couple more references
</commit_message>
<xml_diff>
--- a/COMP3000 Final Document.docx
+++ b/COMP3000 Final Document.docx
@@ -10677,33 +10677,153 @@
         <w:rPr>
           <w:rFonts w:ascii="Arial" w:hAnsi="Arial" w:cs="Arial"/>
         </w:rPr>
-        <w:t xml:space="preserve">The layout of the modern internet contains a wide range of threats that should be considered when determining user safety. </w:t>
-      </w:r>
-      <w:r>
-        <w:rPr>
-          <w:rFonts w:ascii="Arial" w:hAnsi="Arial" w:cs="Arial"/>
-        </w:rPr>
-        <w:t>The 2024 Data Breach Investigation Report by Verizon highlighted that the most common attack vector was exploiting credentials, with the most common access point being web applications. The report also details the involvement of other attack vectors and their effectiveness; this included phishing, denial of service, and exploiting vulnerabilities.</w:t>
-      </w:r>
-    </w:p>
-    <w:p>
-      <w:pPr>
-        <w:spacing w:line="360" w:lineRule="auto"/>
-        <w:rPr>
-          <w:rFonts w:ascii="Arial" w:hAnsi="Arial" w:cs="Arial"/>
-        </w:rPr>
-      </w:pPr>
-      <w:r>
-        <w:rPr>
-          <w:rFonts w:ascii="Arial" w:hAnsi="Arial" w:cs="Arial"/>
-        </w:rPr>
-        <w:t>Malware additionally remains a significant threat to internet users, particularly with compromised websites and unsafe downloads.</w:t>
-      </w:r>
-      <w:r>
-        <w:rPr>
-          <w:rFonts w:ascii="Arial" w:hAnsi="Arial" w:cs="Arial"/>
-        </w:rPr>
-        <w:t xml:space="preserve"> Guidance from the National Cyber Security Centre details steps that can be taken to ensure web browser security; although this relates primarily to organisations, details can still relate to personal users. The guidance mentions have proper malware protection which has influenced Stronghold having a built-in risk score to block malicious sites, and a download checker to block malicious downloads from being performed.</w:t>
+        <w:t xml:space="preserve">The modern internet contains a wide range of threats that should be considered when determining user safety. </w:t>
+      </w:r>
+      <w:r>
+        <w:rPr>
+          <w:rFonts w:ascii="Arial" w:hAnsi="Arial" w:cs="Arial"/>
+        </w:rPr>
+        <w:t xml:space="preserve">The 2024 Data Breach Investigation Report by Verizon highlighted that the most common attack vector was exploiting credentials, with the most common access point being web applications. The report also </w:t>
+      </w:r>
+      <w:r>
+        <w:rPr>
+          <w:rFonts w:ascii="Arial" w:hAnsi="Arial" w:cs="Arial"/>
+        </w:rPr>
+        <w:t>identifies</w:t>
+      </w:r>
+      <w:r>
+        <w:rPr>
+          <w:rFonts w:ascii="Arial" w:hAnsi="Arial" w:cs="Arial"/>
+        </w:rPr>
+        <w:t xml:space="preserve"> </w:t>
+      </w:r>
+      <w:r>
+        <w:rPr>
+          <w:rFonts w:ascii="Arial" w:hAnsi="Arial" w:cs="Arial"/>
+        </w:rPr>
+        <w:t xml:space="preserve">additional </w:t>
+      </w:r>
+      <w:r>
+        <w:rPr>
+          <w:rFonts w:ascii="Arial" w:hAnsi="Arial" w:cs="Arial"/>
+        </w:rPr>
+        <w:t>attack vectors includ</w:t>
+      </w:r>
+      <w:r>
+        <w:rPr>
+          <w:rFonts w:ascii="Arial" w:hAnsi="Arial" w:cs="Arial"/>
+        </w:rPr>
+        <w:t>ing</w:t>
+      </w:r>
+      <w:r>
+        <w:rPr>
+          <w:rFonts w:ascii="Arial" w:hAnsi="Arial" w:cs="Arial"/>
+        </w:rPr>
+        <w:t xml:space="preserve"> phishing, denial of service, and exploiting vulnerabilities</w:t>
+      </w:r>
+      <w:r>
+        <w:rPr>
+          <w:rFonts w:ascii="Arial" w:hAnsi="Arial" w:cs="Arial"/>
+        </w:rPr>
+        <w:t>, demonstrating the vast number of threats that a user may face while online</w:t>
+      </w:r>
+      <w:r>
+        <w:rPr>
+          <w:rFonts w:ascii="Arial" w:hAnsi="Arial" w:cs="Arial"/>
+        </w:rPr>
+        <w:t xml:space="preserve"> and therefore need to be prepared for</w:t>
+      </w:r>
+      <w:r>
+        <w:rPr>
+          <w:rFonts w:ascii="Arial" w:hAnsi="Arial" w:cs="Arial"/>
+        </w:rPr>
+        <w:t>.</w:t>
+      </w:r>
+    </w:p>
+    <w:p>
+      <w:pPr>
+        <w:spacing w:line="360" w:lineRule="auto"/>
+        <w:rPr>
+          <w:rFonts w:ascii="Arial" w:hAnsi="Arial" w:cs="Arial"/>
+        </w:rPr>
+      </w:pPr>
+      <w:r>
+        <w:rPr>
+          <w:rFonts w:ascii="Arial" w:hAnsi="Arial" w:cs="Arial"/>
+        </w:rPr>
+        <w:t xml:space="preserve">Malware remains a significant </w:t>
+      </w:r>
+      <w:r>
+        <w:rPr>
+          <w:rFonts w:ascii="Arial" w:hAnsi="Arial" w:cs="Arial"/>
+        </w:rPr>
+        <w:t>risk</w:t>
+      </w:r>
+      <w:r>
+        <w:rPr>
+          <w:rFonts w:ascii="Arial" w:hAnsi="Arial" w:cs="Arial"/>
+        </w:rPr>
+        <w:t xml:space="preserve"> to internet users, particularly </w:t>
+      </w:r>
+      <w:r>
+        <w:rPr>
+          <w:rFonts w:ascii="Arial" w:hAnsi="Arial" w:cs="Arial"/>
+        </w:rPr>
+        <w:t>through</w:t>
+      </w:r>
+      <w:r>
+        <w:rPr>
+          <w:rFonts w:ascii="Arial" w:hAnsi="Arial" w:cs="Arial"/>
+        </w:rPr>
+        <w:t xml:space="preserve"> compromised websites and unsafe downloads.</w:t>
+      </w:r>
+      <w:r>
+        <w:rPr>
+          <w:rFonts w:ascii="Arial" w:hAnsi="Arial" w:cs="Arial"/>
+        </w:rPr>
+        <w:t xml:space="preserve"> Guidance from the National Cyber Security Centre details steps that can be taken to</w:t>
+      </w:r>
+      <w:r>
+        <w:rPr>
+          <w:rFonts w:ascii="Arial" w:hAnsi="Arial" w:cs="Arial"/>
+        </w:rPr>
+        <w:t xml:space="preserve"> mitigate the risk of a malware infection</w:t>
+      </w:r>
+      <w:r>
+        <w:rPr>
+          <w:rFonts w:ascii="Arial" w:hAnsi="Arial" w:cs="Arial"/>
+        </w:rPr>
+        <w:t xml:space="preserve">; although this relates primarily to organisations, </w:t>
+      </w:r>
+      <w:r>
+        <w:rPr>
+          <w:rFonts w:ascii="Arial" w:hAnsi="Arial" w:cs="Arial"/>
+        </w:rPr>
+        <w:t xml:space="preserve">guidance equally applies </w:t>
+      </w:r>
+      <w:r>
+        <w:rPr>
+          <w:rFonts w:ascii="Arial" w:hAnsi="Arial" w:cs="Arial"/>
+        </w:rPr>
+        <w:t xml:space="preserve">to </w:t>
+      </w:r>
+      <w:r>
+        <w:rPr>
+          <w:rFonts w:ascii="Arial" w:hAnsi="Arial" w:cs="Arial"/>
+        </w:rPr>
+        <w:t xml:space="preserve">individual </w:t>
+      </w:r>
+      <w:r>
+        <w:rPr>
+          <w:rFonts w:ascii="Arial" w:hAnsi="Arial" w:cs="Arial"/>
+        </w:rPr>
+        <w:t xml:space="preserve">users. The guidance </w:t>
+      </w:r>
+      <w:r>
+        <w:rPr>
+          <w:rFonts w:ascii="Arial" w:hAnsi="Arial" w:cs="Arial"/>
+        </w:rPr>
+        <w:t>highlights the importance of having correct malware protection in place to reduce the likelihood of an infection occurring by blocking access to downloads onto the device.</w:t>
       </w:r>
     </w:p>
     <w:p>
@@ -10718,27 +10838,39 @@
           <w:rFonts w:ascii="Arial" w:hAnsi="Arial" w:cs="Arial"/>
         </w:rPr>
         <w:lastRenderedPageBreak/>
-        <w:t xml:space="preserve">A 2024 blog from Zscaler outlined the most common brands impersonated using typosquatting techniques to allow for phishing, credential theft, and malware execution. </w:t>
-      </w:r>
-      <w:r>
-        <w:rPr>
-          <w:rFonts w:ascii="Arial" w:hAnsi="Arial" w:cs="Arial"/>
-        </w:rPr>
-        <w:t>One key takeaway from the blog was that nearly half of phishing domains used free TLS certificates which would allow them to bypass traditional browser warnings. This influenced the risk score within Stronghold by allowing for a typosquatting check to be included which increased the risk score if a domain used typosquatting techniques. Furthermore, the blog revealed that some typosquatted domains initiated automatic downloads containing malware such as trojans. By creating a download blocker within Stronghold, this prevented downloads of files like .</w:t>
-      </w:r>
-      <w:proofErr w:type="spellStart"/>
-      <w:r>
-        <w:rPr>
-          <w:rFonts w:ascii="Arial" w:hAnsi="Arial" w:cs="Arial"/>
-        </w:rPr>
-        <w:t>msi</w:t>
-      </w:r>
-      <w:proofErr w:type="spellEnd"/>
-      <w:r>
-        <w:rPr>
-          <w:rFonts w:ascii="Arial" w:hAnsi="Arial" w:cs="Arial"/>
-        </w:rPr>
-        <w:t xml:space="preserve"> files that are commonly used for downloading trojans and other malware for if the risk score were to fail or become bypassed. </w:t>
+        <w:t xml:space="preserve">Many threats posed rely heavily on manipulation and user deception rather than purely technical methods. Research from </w:t>
+      </w:r>
+      <w:r>
+        <w:rPr>
+          <w:rFonts w:ascii="Arial" w:hAnsi="Arial" w:cs="Arial"/>
+        </w:rPr>
+        <w:t xml:space="preserve">Zscaler </w:t>
+      </w:r>
+      <w:r>
+        <w:rPr>
+          <w:rFonts w:ascii="Arial" w:hAnsi="Arial" w:cs="Arial"/>
+        </w:rPr>
+        <w:t>(2024) highlighted the dangers of typosquatting and brand impersonation to manipulate users into accessing malicious domains. Typosquatting is often combined with other malicious methods such as phishing, credential theft, or malware delivery to increase the likelihood of a successful attack. The research also discovered that over half of phishing domains utilised free TLS certificates which in turn allowed them to bypass traditional browser security. This demonstrates that indic</w:t>
+      </w:r>
+      <w:r>
+        <w:rPr>
+          <w:rFonts w:ascii="Arial" w:hAnsi="Arial" w:cs="Arial"/>
+        </w:rPr>
+        <w:t>ators such as possession of a TLS certificate are not a sufficient way to determine the safety of a website as it can enhance credibility of sites possessing one.</w:t>
+      </w:r>
+    </w:p>
+    <w:p>
+      <w:pPr>
+        <w:spacing w:line="360" w:lineRule="auto"/>
+        <w:rPr>
+          <w:rFonts w:ascii="Arial" w:hAnsi="Arial" w:cs="Arial"/>
+        </w:rPr>
+      </w:pPr>
+      <w:r>
+        <w:rPr>
+          <w:rFonts w:ascii="Arial" w:hAnsi="Arial" w:cs="Arial"/>
+        </w:rPr>
+        <w:t>The research also observed that typosquatting domains could be used to initiate an automatic download of malicious payloads, such as trojans. This highlights the importance of considering file-based threats alongside domain-based threats when deciding security features.</w:t>
       </w:r>
     </w:p>
     <w:p>
@@ -10901,14 +11033,14 @@
         <w:rPr>
           <w:rFonts w:ascii="Arial" w:hAnsi="Arial" w:cs="Arial"/>
         </w:rPr>
-        <w:t xml:space="preserve"> a proportion of users do adhere to warnings, a significant number ignore them or fail to comprehend their meaning. A lack of comprehension influenced user decisions more than habituation, although this played a small role. This suggests that even when warnings are adhered to, user knowledge is not increased and there is no improvement in understanding the risk. </w:t>
+        <w:t xml:space="preserve"> a proportion of users do adhere </w:t>
       </w:r>
       <w:r>
         <w:rPr>
           <w:rFonts w:ascii="Arial" w:hAnsi="Arial" w:cs="Arial"/>
         </w:rPr>
         <w:lastRenderedPageBreak/>
-        <w:t>This is vital for younger users who may lack the knowledge to understand security messages; this is something Stronghold aims to resolve through gamification and specialty quizzes, as well as messages alongside the warnings.</w:t>
+        <w:t>to warnings, a significant number ignore them or fail to comprehend their meaning. A lack of comprehension influenced user decisions more than habituation, although this played a small role. This suggests that even when warnings are adhered to, user knowledge is not increased and there is no improvement in understanding the risk. This is vital for younger users who may lack the knowledge to understand security messages; this is something Stronghold aims to resolve through gamification and specialty quizzes, as well as messages alongside the warnings.</w:t>
       </w:r>
     </w:p>
     <w:p>
@@ -11115,38 +11247,72 @@
         <w:rPr>
           <w:rFonts w:ascii="Arial" w:hAnsi="Arial" w:cs="Arial"/>
         </w:rPr>
-        <w:t xml:space="preserve">a vast majority of children use technological devices, with one of the most common activities performed being finding images online. This opens children up to the risks of the internet and therefore potential exposure to phishing or malware. The study additionally found that parents recognise that the internet is a learning space for their children, and many children use the internet for gaming. By combining the elements identified in </w:t>
+        <w:t xml:space="preserve">a vast majority of children use technological devices, with </w:t>
+      </w:r>
+      <w:r>
+        <w:rPr>
+          <w:rFonts w:ascii="Arial" w:hAnsi="Arial" w:cs="Arial"/>
+        </w:rPr>
+        <w:t xml:space="preserve">finding online images and playing games being some of </w:t>
       </w:r>
       <w:r>
         <w:rPr>
           <w:rFonts w:ascii="Arial" w:hAnsi="Arial" w:cs="Arial"/>
         </w:rPr>
         <w:lastRenderedPageBreak/>
-        <w:t xml:space="preserve">this study, Stronghold </w:t>
-      </w:r>
-      <w:r>
-        <w:rPr>
-          <w:rFonts w:ascii="Arial" w:hAnsi="Arial" w:cs="Arial"/>
-        </w:rPr>
-        <w:t>has</w:t>
-      </w:r>
-      <w:r>
-        <w:rPr>
-          <w:rFonts w:ascii="Arial" w:hAnsi="Arial" w:cs="Arial"/>
-        </w:rPr>
-        <w:t xml:space="preserve"> act</w:t>
-      </w:r>
-      <w:r>
-        <w:rPr>
-          <w:rFonts w:ascii="Arial" w:hAnsi="Arial" w:cs="Arial"/>
-        </w:rPr>
-        <w:t>ed</w:t>
-      </w:r>
-      <w:r>
-        <w:rPr>
-          <w:rFonts w:ascii="Arial" w:hAnsi="Arial" w:cs="Arial"/>
-        </w:rPr>
-        <w:t xml:space="preserve"> as a gamified method of learning whilst also reducing the risks children may face.</w:t>
+        <w:t>the most common activities performed. This reveals that children are getting involved in online environments from a young age and therefore are exposing themselves to potential risks due to their inexperience.</w:t>
+      </w:r>
+    </w:p>
+    <w:p>
+      <w:pPr>
+        <w:spacing w:line="360" w:lineRule="auto"/>
+        <w:rPr>
+          <w:rFonts w:ascii="Arial" w:hAnsi="Arial" w:cs="Arial"/>
+        </w:rPr>
+      </w:pPr>
+      <w:r>
+        <w:rPr>
+          <w:rFonts w:ascii="Arial" w:hAnsi="Arial" w:cs="Arial"/>
+        </w:rPr>
+        <w:t xml:space="preserve">While the study highlights the increase in internet usage among children, it fails to identify that younger users may not have the experience to keep themselves safe while online by verifying domains and avoiding malicious downloads for example. This creates a greater reliance on external systems to allow for online safety while navigating online. </w:t>
+      </w:r>
+    </w:p>
+    <w:p>
+      <w:pPr>
+        <w:spacing w:line="360" w:lineRule="auto"/>
+        <w:rPr>
+          <w:rFonts w:ascii="Arial" w:hAnsi="Arial" w:cs="Arial"/>
+        </w:rPr>
+      </w:pPr>
+      <w:r>
+        <w:rPr>
+          <w:rFonts w:ascii="Arial" w:hAnsi="Arial" w:cs="Arial"/>
+        </w:rPr>
+        <w:t>Furthermore, t</w:t>
+      </w:r>
+      <w:r>
+        <w:rPr>
+          <w:rFonts w:ascii="Arial" w:hAnsi="Arial" w:cs="Arial"/>
+        </w:rPr>
+        <w:t>he study found that parents recognise that the internet is a learning space for their children</w:t>
+      </w:r>
+      <w:r>
+        <w:rPr>
+          <w:rFonts w:ascii="Arial" w:hAnsi="Arial" w:cs="Arial"/>
+        </w:rPr>
+        <w:t>, suggesting that online environments should allow for both safety and education</w:t>
+      </w:r>
+      <w:r>
+        <w:rPr>
+          <w:rFonts w:ascii="Arial" w:hAnsi="Arial" w:cs="Arial"/>
+        </w:rPr>
+        <w:t xml:space="preserve">. </w:t>
+      </w:r>
+      <w:r>
+        <w:rPr>
+          <w:rFonts w:ascii="Arial" w:hAnsi="Arial" w:cs="Arial"/>
+        </w:rPr>
+        <w:t>This reinforces the idea that only blocking unsafe content may not be suitable for developing long-term behaviours, and there is instead a need for systems that encourage learning while developing safer browsing habits.</w:t>
       </w:r>
     </w:p>
     <w:p>
@@ -11170,17 +11336,101 @@
       </w:r>
     </w:p>
     <w:p>
-      <w:r>
-        <w:t>Modern existing products, such as Google Chrome, Microsoft Edge, Mozilla Firefox, and Opera include built-in mechanisms to prevent or restrict access to malicious sites and downloads</w:t>
-      </w:r>
-      <w:r>
-        <w:t xml:space="preserve"> which is detailed in their official documentations</w:t>
-      </w:r>
-      <w:r>
-        <w:t>. However, these systems put their primary focus on safety elements of browsing, without improving user understanding. Stronghold changed that by providing security while encouraging learning.</w:t>
-      </w:r>
-      <w:r>
+      <w:pPr>
+        <w:spacing w:line="360" w:lineRule="auto"/>
+        <w:rPr>
+          <w:rFonts w:ascii="Arial" w:hAnsi="Arial" w:cs="Arial"/>
+        </w:rPr>
+      </w:pPr>
+      <w:r>
+        <w:rPr>
+          <w:rFonts w:ascii="Arial" w:hAnsi="Arial" w:cs="Arial"/>
+        </w:rPr>
+        <w:t xml:space="preserve">Modern existing products such as Google Chrome, Microsoft Edge, Mozilla Firefox, and Opera </w:t>
+      </w:r>
+      <w:r>
+        <w:rPr>
+          <w:rFonts w:ascii="Arial" w:hAnsi="Arial" w:cs="Arial"/>
+        </w:rPr>
+        <w:t xml:space="preserve">often </w:t>
+      </w:r>
+      <w:r>
+        <w:rPr>
+          <w:rFonts w:ascii="Arial" w:hAnsi="Arial" w:cs="Arial"/>
+        </w:rPr>
+        <w:t xml:space="preserve">include built-in </w:t>
+      </w:r>
+      <w:r>
+        <w:rPr>
+          <w:rFonts w:ascii="Arial" w:hAnsi="Arial" w:cs="Arial"/>
+        </w:rPr>
+        <w:t xml:space="preserve">security </w:t>
+      </w:r>
+      <w:r>
+        <w:rPr>
+          <w:rFonts w:ascii="Arial" w:hAnsi="Arial" w:cs="Arial"/>
+        </w:rPr>
+        <w:t>mechanisms to prevent or restrict access to malicious sites and downloads</w:t>
+      </w:r>
+      <w:r>
+        <w:rPr>
+          <w:rFonts w:ascii="Arial" w:hAnsi="Arial" w:cs="Arial"/>
+        </w:rPr>
         <w:t xml:space="preserve"> </w:t>
+      </w:r>
+      <w:r>
+        <w:rPr>
+          <w:rFonts w:ascii="Arial" w:hAnsi="Arial" w:cs="Arial"/>
+        </w:rPr>
+        <w:t>by utilising phishing protection, malware protection, and blacklisting sites flagged as dangerous. Tools such as Google Safe Browsing and Microsoft Defender SmartScreen are used to perform these tasks, reducing the likelihood of a user accessing threatening content.</w:t>
+      </w:r>
+    </w:p>
+    <w:p>
+      <w:pPr>
+        <w:spacing w:line="360" w:lineRule="auto"/>
+        <w:rPr>
+          <w:rFonts w:ascii="Arial" w:hAnsi="Arial" w:cs="Arial"/>
+        </w:rPr>
+      </w:pPr>
+      <w:r>
+        <w:rPr>
+          <w:rFonts w:ascii="Arial" w:hAnsi="Arial" w:cs="Arial"/>
+        </w:rPr>
+        <w:t>While protection provided by these systems is known to be effective, they do not assist in improving understanding of threats faced. Users are typically blocked from accessing their content but receive a limited explanation as to why, causing a reliance on blocking without understanding how to improve browsing behaviours.</w:t>
+      </w:r>
+    </w:p>
+    <w:p>
+      <w:pPr>
+        <w:spacing w:line="360" w:lineRule="auto"/>
+        <w:rPr>
+          <w:rFonts w:ascii="Arial" w:hAnsi="Arial" w:cs="Arial"/>
+        </w:rPr>
+      </w:pPr>
+      <w:r>
+        <w:rPr>
+          <w:rFonts w:ascii="Arial" w:hAnsi="Arial" w:cs="Arial"/>
+        </w:rPr>
+        <w:t>Furthermore, these systems are reactive, utilising databases of known threats instead of being proactive and analysing a domain’s characteristics when the user attempts to access it. This may limit their ability to block new threats or more complicated techniques such as typosquatting.</w:t>
+      </w:r>
+    </w:p>
+    <w:p>
+      <w:pPr>
+        <w:spacing w:line="360" w:lineRule="auto"/>
+        <w:rPr>
+          <w:rFonts w:ascii="Arial" w:hAnsi="Arial" w:cs="Arial"/>
+        </w:rPr>
+      </w:pPr>
+      <w:r>
+        <w:rPr>
+          <w:rFonts w:ascii="Arial" w:hAnsi="Arial" w:cs="Arial"/>
+        </w:rPr>
+        <w:t xml:space="preserve">This highlights a gap in the market where a solution is required to enforce learning techniques while providing a safe system. </w:t>
+      </w:r>
+      <w:r>
+        <w:rPr>
+          <w:rFonts w:ascii="Arial" w:hAnsi="Arial" w:cs="Arial"/>
+        </w:rPr>
+        <w:t>Combining education with security allows users to remain safe while understanding what they are being kept safe from.</w:t>
       </w:r>
     </w:p>
     <w:p>
@@ -11207,6 +11457,7 @@
           <w:iCs/>
           <w:highlight w:val="red"/>
         </w:rPr>
+        <w:lastRenderedPageBreak/>
         <w:t xml:space="preserve">SMART </w:t>
       </w:r>
       <w:r>
@@ -11229,6 +11480,7 @@
           <w:rFonts w:ascii="Arial" w:hAnsi="Arial" w:cs="Arial"/>
         </w:rPr>
       </w:pPr>
+      <w:bookmarkStart w:id="14" w:name="OLE_LINK9"/>
       <w:r>
         <w:rPr>
           <w:rFonts w:ascii="Arial" w:hAnsi="Arial" w:cs="Arial"/>
@@ -11380,7 +11632,8 @@
           <w:iCs/>
         </w:rPr>
       </w:pPr>
-      <w:bookmarkStart w:id="14" w:name="_Toc228752846"/>
+      <w:bookmarkStart w:id="15" w:name="_Toc228752846"/>
+      <w:bookmarkEnd w:id="14"/>
       <w:r>
         <w:rPr>
           <w:rFonts w:ascii="Arial" w:hAnsi="Arial" w:cs="Arial"/>
@@ -11391,7 +11644,7 @@
         </w:rPr>
         <w:t>Deliverables</w:t>
       </w:r>
-      <w:bookmarkEnd w:id="14"/>
+      <w:bookmarkEnd w:id="15"/>
     </w:p>
     <w:p>
       <w:pPr>
@@ -11533,7 +11786,7 @@
           <w:szCs w:val="36"/>
         </w:rPr>
       </w:pPr>
-      <w:bookmarkStart w:id="15" w:name="_Toc228752847"/>
+      <w:bookmarkStart w:id="16" w:name="_Toc228752847"/>
       <w:r>
         <w:rPr>
           <w:rFonts w:ascii="Arial" w:hAnsi="Arial" w:cs="Arial"/>
@@ -11544,10 +11797,9 @@
           <w:sz w:val="36"/>
           <w:szCs w:val="36"/>
         </w:rPr>
-        <w:lastRenderedPageBreak/>
         <w:t>Design</w:t>
       </w:r>
-      <w:bookmarkEnd w:id="15"/>
+      <w:bookmarkEnd w:id="16"/>
     </w:p>
     <w:p>
       <w:pPr>
@@ -11617,7 +11869,7 @@
           <w:iCs/>
         </w:rPr>
       </w:pPr>
-      <w:bookmarkStart w:id="16" w:name="_Toc228752848"/>
+      <w:bookmarkStart w:id="17" w:name="_Toc228752848"/>
       <w:r>
         <w:rPr>
           <w:rFonts w:ascii="Arial" w:hAnsi="Arial" w:cs="Arial"/>
@@ -11626,9 +11878,10 @@
           <w:i/>
           <w:iCs/>
         </w:rPr>
+        <w:lastRenderedPageBreak/>
         <w:t>Wireframes</w:t>
       </w:r>
-      <w:bookmarkEnd w:id="16"/>
+      <w:bookmarkEnd w:id="17"/>
     </w:p>
     <w:p>
       <w:pPr>
@@ -11658,7 +11911,7 @@
           <w:szCs w:val="24"/>
         </w:rPr>
       </w:pPr>
-      <w:bookmarkStart w:id="17" w:name="_Toc228752849"/>
+      <w:bookmarkStart w:id="18" w:name="_Toc228752849"/>
       <w:r>
         <w:rPr>
           <w:rFonts w:ascii="Arial" w:hAnsi="Arial" w:cs="Arial"/>
@@ -11666,7 +11919,6 @@
           <w:sz w:val="32"/>
           <w:szCs w:val="32"/>
         </w:rPr>
-        <w:lastRenderedPageBreak/>
         <mc:AlternateContent>
           <mc:Choice Requires="wps">
             <w:drawing>
@@ -11803,7 +12055,7 @@
         </w:rPr>
         <w:t>Startup Page</w:t>
       </w:r>
-      <w:bookmarkEnd w:id="17"/>
+      <w:bookmarkEnd w:id="18"/>
     </w:p>
     <w:p>
       <w:pPr>
@@ -11964,7 +12216,7 @@
           <w:szCs w:val="24"/>
         </w:rPr>
       </w:pPr>
-      <w:bookmarkStart w:id="18" w:name="_Toc228752850"/>
+      <w:bookmarkStart w:id="19" w:name="_Toc228752850"/>
       <w:r>
         <w:rPr>
           <w:rFonts w:ascii="Arial" w:hAnsi="Arial" w:cs="Arial"/>
@@ -12012,7 +12264,7 @@
                             <w:pPr>
                               <w:pStyle w:val="Caption"/>
                             </w:pPr>
-                            <w:bookmarkStart w:id="19" w:name="_Toc227855392"/>
+                            <w:bookmarkStart w:id="20" w:name="_Toc227855392"/>
                             <w:r>
                               <w:t xml:space="preserve">Figure </w:t>
                             </w:r>
@@ -12040,7 +12292,7 @@
                             <w:r>
                               <w:t xml:space="preserve"> – Wireframe for Stronghold home page</w:t>
                             </w:r>
-                            <w:bookmarkEnd w:id="19"/>
+                            <w:bookmarkEnd w:id="20"/>
                           </w:p>
                         </w:txbxContent>
                       </wps:txbx>
@@ -12065,7 +12317,7 @@
                       <w:pPr>
                         <w:pStyle w:val="Caption"/>
                       </w:pPr>
-                      <w:bookmarkStart w:id="20" w:name="_Toc227855392"/>
+                      <w:bookmarkStart w:id="21" w:name="_Toc227855392"/>
                       <w:r>
                         <w:t xml:space="preserve">Figure </w:t>
                       </w:r>
@@ -12093,7 +12345,7 @@
                       <w:r>
                         <w:t xml:space="preserve"> – Wireframe for Stronghold home page</w:t>
                       </w:r>
-                      <w:bookmarkEnd w:id="20"/>
+                      <w:bookmarkEnd w:id="21"/>
                     </w:p>
                   </w:txbxContent>
                 </v:textbox>
@@ -12174,7 +12426,7 @@
           </wp:anchor>
         </w:drawing>
       </w:r>
-      <w:bookmarkEnd w:id="18"/>
+      <w:bookmarkEnd w:id="19"/>
       <w:r>
         <w:rPr>
           <w:rFonts w:ascii="Arial" w:hAnsi="Arial" w:cs="Arial"/>
@@ -12260,7 +12512,7 @@
           <w:szCs w:val="24"/>
         </w:rPr>
       </w:pPr>
-      <w:bookmarkStart w:id="21" w:name="_Toc228752851"/>
+      <w:bookmarkStart w:id="22" w:name="_Toc228752851"/>
       <w:r>
         <w:rPr>
           <w:rFonts w:ascii="Arial" w:hAnsi="Arial" w:cs="Arial"/>
@@ -12310,7 +12562,7 @@
                             <w:pPr>
                               <w:pStyle w:val="Caption"/>
                             </w:pPr>
-                            <w:bookmarkStart w:id="22" w:name="_Toc227855393"/>
+                            <w:bookmarkStart w:id="23" w:name="_Toc227855393"/>
                             <w:r>
                               <w:t xml:space="preserve">Figure </w:t>
                             </w:r>
@@ -12329,7 +12581,7 @@
                               </w:rPr>
                               <w:t>3</w:t>
                             </w:r>
-                            <w:bookmarkEnd w:id="22"/>
+                            <w:bookmarkEnd w:id="23"/>
                             <w:r>
                               <w:rPr>
                                 <w:noProof/>
@@ -12363,7 +12615,7 @@
                       <w:pPr>
                         <w:pStyle w:val="Caption"/>
                       </w:pPr>
-                      <w:bookmarkStart w:id="23" w:name="_Toc227855393"/>
+                      <w:bookmarkStart w:id="24" w:name="_Toc227855393"/>
                       <w:r>
                         <w:t xml:space="preserve">Figure </w:t>
                       </w:r>
@@ -12382,7 +12634,7 @@
                         </w:rPr>
                         <w:t>3</w:t>
                       </w:r>
-                      <w:bookmarkEnd w:id="23"/>
+                      <w:bookmarkEnd w:id="24"/>
                       <w:r>
                         <w:rPr>
                           <w:noProof/>
@@ -12411,7 +12663,7 @@
         </w:rPr>
         <w:t>Dashboard</w:t>
       </w:r>
-      <w:bookmarkEnd w:id="21"/>
+      <w:bookmarkEnd w:id="22"/>
     </w:p>
     <w:p>
       <w:pPr>
@@ -12536,7 +12788,7 @@
           <w:szCs w:val="24"/>
         </w:rPr>
       </w:pPr>
-      <w:bookmarkStart w:id="24" w:name="_Toc228752852"/>
+      <w:bookmarkStart w:id="25" w:name="_Toc228752852"/>
       <w:r>
         <w:rPr>
           <w:rFonts w:ascii="Arial" w:hAnsi="Arial" w:cs="Arial"/>
@@ -12693,7 +12945,7 @@
         </w:rPr>
         <w:t>Taskbar</w:t>
       </w:r>
-      <w:bookmarkEnd w:id="24"/>
+      <w:bookmarkEnd w:id="25"/>
     </w:p>
     <w:p>
       <w:pPr>
@@ -12831,7 +13083,7 @@
           <w:szCs w:val="24"/>
         </w:rPr>
       </w:pPr>
-      <w:bookmarkStart w:id="25" w:name="_Toc228752853"/>
+      <w:bookmarkStart w:id="26" w:name="_Toc228752853"/>
       <w:r>
         <w:rPr>
           <w:rFonts w:ascii="Arial" w:hAnsi="Arial" w:cs="Arial"/>
@@ -12985,7 +13237,7 @@
         </w:rPr>
         <w:t>Settings Page</w:t>
       </w:r>
-      <w:bookmarkEnd w:id="25"/>
+      <w:bookmarkEnd w:id="26"/>
     </w:p>
     <w:p>
       <w:pPr>
@@ -13134,7 +13386,7 @@
           <w:szCs w:val="24"/>
         </w:rPr>
       </w:pPr>
-      <w:bookmarkStart w:id="26" w:name="_Toc228752854"/>
+      <w:bookmarkStart w:id="27" w:name="_Toc228752854"/>
       <w:r>
         <w:rPr>
           <w:rFonts w:ascii="Arial" w:hAnsi="Arial" w:cs="Arial"/>
@@ -13281,7 +13533,7 @@
         </w:rPr>
         <w:t>Blocking Page</w:t>
       </w:r>
-      <w:bookmarkEnd w:id="26"/>
+      <w:bookmarkEnd w:id="27"/>
     </w:p>
     <w:p>
       <w:pPr>
@@ -13387,7 +13639,7 @@
           <w:szCs w:val="24"/>
         </w:rPr>
       </w:pPr>
-      <w:bookmarkStart w:id="27" w:name="_Toc228752855"/>
+      <w:bookmarkStart w:id="28" w:name="_Toc228752855"/>
       <w:r>
         <w:rPr>
           <w:rFonts w:ascii="Arial" w:hAnsi="Arial" w:cs="Arial"/>
@@ -13528,7 +13780,7 @@
         </w:rPr>
         <w:t>Warning Page</w:t>
       </w:r>
-      <w:bookmarkEnd w:id="27"/>
+      <w:bookmarkEnd w:id="28"/>
     </w:p>
     <w:p>
       <w:pPr>
@@ -13690,7 +13942,7 @@
           <w:highlight w:val="red"/>
         </w:rPr>
       </w:pPr>
-      <w:bookmarkStart w:id="28" w:name="_Toc228752856"/>
+      <w:bookmarkStart w:id="29" w:name="_Toc228752856"/>
       <w:r>
         <w:rPr>
           <w:rFonts w:ascii="Arial" w:hAnsi="Arial" w:cs="Arial"/>
@@ -13702,7 +13954,7 @@
         </w:rPr>
         <w:t>Flowcharts</w:t>
       </w:r>
-      <w:bookmarkEnd w:id="28"/>
+      <w:bookmarkEnd w:id="29"/>
     </w:p>
     <w:p>
       <w:pPr>
@@ -13718,7 +13970,7 @@
           <w:szCs w:val="24"/>
         </w:rPr>
       </w:pPr>
-      <w:bookmarkStart w:id="29" w:name="_Toc228752857"/>
+      <w:bookmarkStart w:id="30" w:name="_Toc228752857"/>
       <w:r>
         <w:rPr>
           <w:rFonts w:ascii="Arial" w:hAnsi="Arial" w:cs="Arial"/>
@@ -13731,7 +13983,7 @@
         </w:rPr>
         <w:t>Risk Score Calculation</w:t>
       </w:r>
-      <w:bookmarkEnd w:id="29"/>
+      <w:bookmarkEnd w:id="30"/>
     </w:p>
     <w:p>
       <w:pPr>
@@ -13755,7 +14007,7 @@
           <w:szCs w:val="24"/>
         </w:rPr>
       </w:pPr>
-      <w:bookmarkStart w:id="30" w:name="_Toc228752858"/>
+      <w:bookmarkStart w:id="31" w:name="_Toc228752858"/>
       <w:r>
         <w:rPr>
           <w:rFonts w:ascii="Arial" w:hAnsi="Arial" w:cs="Arial"/>
@@ -13768,7 +14020,7 @@
         </w:rPr>
         <w:t>Download Blocking Process</w:t>
       </w:r>
-      <w:bookmarkEnd w:id="30"/>
+      <w:bookmarkEnd w:id="31"/>
     </w:p>
     <w:p>
       <w:pPr>
@@ -13792,7 +14044,7 @@
           <w:szCs w:val="24"/>
         </w:rPr>
       </w:pPr>
-      <w:bookmarkStart w:id="31" w:name="_Toc228752859"/>
+      <w:bookmarkStart w:id="32" w:name="_Toc228752859"/>
       <w:r>
         <w:rPr>
           <w:rFonts w:ascii="Arial" w:hAnsi="Arial" w:cs="Arial"/>
@@ -13805,7 +14057,7 @@
         </w:rPr>
         <w:t>Navigation Flow</w:t>
       </w:r>
-      <w:bookmarkEnd w:id="31"/>
+      <w:bookmarkEnd w:id="32"/>
     </w:p>
     <w:p>
       <w:pPr>
@@ -13829,7 +14081,7 @@
           <w:szCs w:val="24"/>
         </w:rPr>
       </w:pPr>
-      <w:bookmarkStart w:id="32" w:name="_Toc228752860"/>
+      <w:bookmarkStart w:id="33" w:name="_Toc228752860"/>
       <w:r>
         <w:rPr>
           <w:rFonts w:ascii="Arial" w:hAnsi="Arial" w:cs="Arial"/>
@@ -13842,7 +14094,7 @@
         </w:rPr>
         <w:t>Quiz Process</w:t>
       </w:r>
-      <w:bookmarkEnd w:id="32"/>
+      <w:bookmarkEnd w:id="33"/>
     </w:p>
     <w:p>
       <w:pPr>
@@ -13872,7 +14124,7 @@
           <w:iCs/>
         </w:rPr>
       </w:pPr>
-      <w:bookmarkStart w:id="33" w:name="_Toc228752861"/>
+      <w:bookmarkStart w:id="34" w:name="_Toc228752861"/>
       <w:r>
         <w:rPr>
           <w:rFonts w:ascii="Arial" w:hAnsi="Arial" w:cs="Arial"/>
@@ -13884,7 +14136,7 @@
         <w:lastRenderedPageBreak/>
         <w:t>Use Cases</w:t>
       </w:r>
-      <w:bookmarkEnd w:id="33"/>
+      <w:bookmarkEnd w:id="34"/>
     </w:p>
     <w:p>
       <w:pPr>
@@ -13900,7 +14152,7 @@
           <w:szCs w:val="22"/>
         </w:rPr>
       </w:pPr>
-      <w:bookmarkStart w:id="34" w:name="_Toc228752862"/>
+      <w:bookmarkStart w:id="35" w:name="_Toc228752862"/>
       <w:r>
         <w:rPr>
           <w:rFonts w:ascii="Arial" w:hAnsi="Arial" w:cs="Arial"/>
@@ -13913,7 +14165,7 @@
         </w:rPr>
         <w:t>Load Website</w:t>
       </w:r>
-      <w:bookmarkEnd w:id="34"/>
+      <w:bookmarkEnd w:id="35"/>
     </w:p>
     <w:p>
       <w:pPr>
@@ -14085,7 +14337,7 @@
           <w:szCs w:val="24"/>
         </w:rPr>
       </w:pPr>
-      <w:bookmarkStart w:id="35" w:name="_Toc228752863"/>
+      <w:bookmarkStart w:id="36" w:name="_Toc228752863"/>
       <w:r>
         <w:rPr>
           <w:rFonts w:ascii="Arial" w:hAnsi="Arial" w:cs="Arial"/>
@@ -14098,7 +14350,7 @@
         </w:rPr>
         <w:t>Download File</w:t>
       </w:r>
-      <w:bookmarkEnd w:id="35"/>
+      <w:bookmarkEnd w:id="36"/>
     </w:p>
     <w:p>
       <w:pPr>
@@ -14320,7 +14572,7 @@
           <w:szCs w:val="22"/>
         </w:rPr>
       </w:pPr>
-      <w:bookmarkStart w:id="36" w:name="_Toc228752864"/>
+      <w:bookmarkStart w:id="37" w:name="_Toc228752864"/>
       <w:r>
         <w:rPr>
           <w:rFonts w:ascii="Arial" w:hAnsi="Arial" w:cs="Arial"/>
@@ -14333,7 +14585,7 @@
         </w:rPr>
         <w:t>Guest User Browsing</w:t>
       </w:r>
-      <w:bookmarkEnd w:id="36"/>
+      <w:bookmarkEnd w:id="37"/>
     </w:p>
     <w:p>
       <w:pPr>
@@ -14449,7 +14701,7 @@
           <w:szCs w:val="24"/>
         </w:rPr>
       </w:pPr>
-      <w:bookmarkStart w:id="37" w:name="_Toc228752865"/>
+      <w:bookmarkStart w:id="38" w:name="_Toc228752865"/>
       <w:r>
         <w:rPr>
           <w:rFonts w:ascii="Arial" w:hAnsi="Arial" w:cs="Arial"/>
@@ -14463,7 +14715,7 @@
         <w:lastRenderedPageBreak/>
         <w:t>View Feedback</w:t>
       </w:r>
-      <w:bookmarkEnd w:id="37"/>
+      <w:bookmarkEnd w:id="38"/>
     </w:p>
     <w:p>
       <w:pPr>
@@ -14591,7 +14843,7 @@
           <w:szCs w:val="24"/>
         </w:rPr>
       </w:pPr>
-      <w:bookmarkStart w:id="38" w:name="_Toc228752866"/>
+      <w:bookmarkStart w:id="39" w:name="_Toc228752866"/>
       <w:r>
         <w:rPr>
           <w:rFonts w:ascii="Arial" w:hAnsi="Arial" w:cs="Arial"/>
@@ -14604,7 +14856,7 @@
         </w:rPr>
         <w:t>Typosquatting Detection</w:t>
       </w:r>
-      <w:bookmarkEnd w:id="38"/>
+      <w:bookmarkEnd w:id="39"/>
     </w:p>
     <w:p>
       <w:pPr>
@@ -14733,7 +14985,7 @@
           <w:szCs w:val="24"/>
         </w:rPr>
       </w:pPr>
-      <w:bookmarkStart w:id="39" w:name="_Toc228752867"/>
+      <w:bookmarkStart w:id="40" w:name="_Toc228752867"/>
       <w:r>
         <w:rPr>
           <w:rFonts w:ascii="Arial" w:hAnsi="Arial" w:cs="Arial"/>
@@ -14746,7 +14998,7 @@
         </w:rPr>
         <w:t>Phishing Detection</w:t>
       </w:r>
-      <w:bookmarkEnd w:id="39"/>
+      <w:bookmarkEnd w:id="40"/>
     </w:p>
     <w:p>
       <w:pPr>
@@ -14819,7 +15071,7 @@
           <w:szCs w:val="24"/>
         </w:rPr>
       </w:pPr>
-      <w:bookmarkStart w:id="40" w:name="_Toc228752868"/>
+      <w:bookmarkStart w:id="41" w:name="_Toc228752868"/>
       <w:r>
         <w:rPr>
           <w:rFonts w:ascii="Arial" w:hAnsi="Arial" w:cs="Arial"/>
@@ -14832,7 +15084,7 @@
         </w:rPr>
         <w:t>TLS Certificate Validation</w:t>
       </w:r>
-      <w:bookmarkEnd w:id="40"/>
+      <w:bookmarkEnd w:id="41"/>
     </w:p>
     <w:p>
       <w:pPr>
@@ -14906,7 +15158,7 @@
           <w:szCs w:val="28"/>
         </w:rPr>
       </w:pPr>
-      <w:bookmarkStart w:id="41" w:name="_Toc228752869"/>
+      <w:bookmarkStart w:id="42" w:name="_Toc228752869"/>
       <w:r>
         <w:rPr>
           <w:rFonts w:ascii="Arial" w:hAnsi="Arial" w:cs="Arial"/>
@@ -14920,7 +15172,7 @@
         </w:rPr>
         <w:t>Unique Selling Points</w:t>
       </w:r>
-      <w:bookmarkEnd w:id="41"/>
+      <w:bookmarkEnd w:id="42"/>
     </w:p>
     <w:p>
       <w:pPr>
@@ -14976,7 +15228,7 @@
           <w:szCs w:val="36"/>
         </w:rPr>
       </w:pPr>
-      <w:bookmarkStart w:id="42" w:name="_Toc228752870"/>
+      <w:bookmarkStart w:id="43" w:name="_Toc228752870"/>
       <w:r>
         <w:rPr>
           <w:rFonts w:ascii="Arial" w:hAnsi="Arial" w:cs="Arial"/>
@@ -14989,7 +15241,7 @@
         </w:rPr>
         <w:t>Method of Approach</w:t>
       </w:r>
-      <w:bookmarkEnd w:id="42"/>
+      <w:bookmarkEnd w:id="43"/>
     </w:p>
     <w:p>
       <w:pPr>
@@ -15018,7 +15270,7 @@
           <w:highlight w:val="red"/>
         </w:rPr>
       </w:pPr>
-      <w:bookmarkStart w:id="43" w:name="_Toc228752871"/>
+      <w:bookmarkStart w:id="44" w:name="_Toc228752871"/>
       <w:r>
         <w:rPr>
           <w:rFonts w:ascii="Arial" w:hAnsi="Arial" w:cs="Arial"/>
@@ -15030,7 +15282,7 @@
         </w:rPr>
         <w:t>Risk Assessment</w:t>
       </w:r>
-      <w:bookmarkEnd w:id="43"/>
+      <w:bookmarkEnd w:id="44"/>
     </w:p>
     <w:p>
       <w:pPr>
@@ -15045,7 +15297,7 @@
           <w:highlight w:val="red"/>
         </w:rPr>
       </w:pPr>
-      <w:bookmarkStart w:id="44" w:name="_Toc228752872"/>
+      <w:bookmarkStart w:id="45" w:name="_Toc228752872"/>
       <w:r>
         <w:rPr>
           <w:rFonts w:ascii="Arial" w:hAnsi="Arial" w:cs="Arial"/>
@@ -15057,7 +15309,7 @@
         </w:rPr>
         <w:t>Agile Method</w:t>
       </w:r>
-      <w:bookmarkEnd w:id="44"/>
+      <w:bookmarkEnd w:id="45"/>
     </w:p>
     <w:p>
       <w:pPr>
@@ -15071,7 +15323,7 @@
           <w:iCs/>
         </w:rPr>
       </w:pPr>
-      <w:bookmarkStart w:id="45" w:name="_Toc228752873"/>
+      <w:bookmarkStart w:id="46" w:name="_Toc228752873"/>
       <w:r>
         <w:rPr>
           <w:rFonts w:ascii="Arial" w:hAnsi="Arial" w:cs="Arial"/>
@@ -15082,7 +15334,7 @@
         </w:rPr>
         <w:t>Tools and Technologies</w:t>
       </w:r>
-      <w:bookmarkEnd w:id="45"/>
+      <w:bookmarkEnd w:id="46"/>
     </w:p>
     <w:p>
       <w:pPr>
@@ -15096,7 +15348,7 @@
           <w:iCs/>
         </w:rPr>
       </w:pPr>
-      <w:bookmarkStart w:id="46" w:name="_Toc228752874"/>
+      <w:bookmarkStart w:id="47" w:name="_Toc228752874"/>
       <w:r>
         <w:rPr>
           <w:rFonts w:ascii="Arial" w:hAnsi="Arial" w:cs="Arial"/>
@@ -15107,7 +15359,7 @@
         </w:rPr>
         <w:t>JavaScript</w:t>
       </w:r>
-      <w:bookmarkEnd w:id="46"/>
+      <w:bookmarkEnd w:id="47"/>
     </w:p>
     <w:p>
       <w:pPr>
@@ -15135,7 +15387,7 @@
           <w:iCs/>
         </w:rPr>
       </w:pPr>
-      <w:bookmarkStart w:id="47" w:name="_Toc228752875"/>
+      <w:bookmarkStart w:id="48" w:name="_Toc228752875"/>
       <w:r>
         <w:rPr>
           <w:rFonts w:ascii="Arial" w:hAnsi="Arial" w:cs="Arial"/>
@@ -15146,7 +15398,7 @@
         </w:rPr>
         <w:t>Electron</w:t>
       </w:r>
-      <w:bookmarkEnd w:id="47"/>
+      <w:bookmarkEnd w:id="48"/>
     </w:p>
     <w:p>
       <w:pPr>
@@ -15174,7 +15426,7 @@
           <w:iCs/>
         </w:rPr>
       </w:pPr>
-      <w:bookmarkStart w:id="48" w:name="_Toc228752876"/>
+      <w:bookmarkStart w:id="49" w:name="_Toc228752876"/>
       <w:r>
         <w:rPr>
           <w:rFonts w:ascii="Arial" w:hAnsi="Arial" w:cs="Arial"/>
@@ -15186,7 +15438,7 @@
         <w:lastRenderedPageBreak/>
         <w:t>Visual Studio Code</w:t>
       </w:r>
-      <w:bookmarkEnd w:id="48"/>
+      <w:bookmarkEnd w:id="49"/>
     </w:p>
     <w:p>
       <w:pPr>
@@ -15220,7 +15472,7 @@
           <w:iCs/>
         </w:rPr>
       </w:pPr>
-      <w:bookmarkStart w:id="49" w:name="_Toc228752877"/>
+      <w:bookmarkStart w:id="50" w:name="_Toc228752877"/>
       <w:r>
         <w:rPr>
           <w:rFonts w:ascii="Arial" w:hAnsi="Arial" w:cs="Arial"/>
@@ -15231,7 +15483,7 @@
         </w:rPr>
         <w:t>Firebase</w:t>
       </w:r>
-      <w:bookmarkEnd w:id="49"/>
+      <w:bookmarkEnd w:id="50"/>
     </w:p>
     <w:p>
       <w:pPr>
@@ -15259,7 +15511,7 @@
           <w:iCs/>
         </w:rPr>
       </w:pPr>
-      <w:bookmarkStart w:id="50" w:name="_Toc228752878"/>
+      <w:bookmarkStart w:id="51" w:name="_Toc228752878"/>
       <w:r>
         <w:rPr>
           <w:rFonts w:ascii="Arial" w:hAnsi="Arial" w:cs="Arial"/>
@@ -15270,7 +15522,7 @@
         </w:rPr>
         <w:t>Devices</w:t>
       </w:r>
-      <w:bookmarkEnd w:id="50"/>
+      <w:bookmarkEnd w:id="51"/>
     </w:p>
     <w:p>
       <w:pPr>
@@ -15298,7 +15550,7 @@
           <w:iCs/>
         </w:rPr>
       </w:pPr>
-      <w:bookmarkStart w:id="51" w:name="_Toc228752879"/>
+      <w:bookmarkStart w:id="52" w:name="_Toc228752879"/>
       <w:r>
         <w:rPr>
           <w:rFonts w:ascii="Arial" w:hAnsi="Arial" w:cs="Arial"/>
@@ -15319,7 +15571,7 @@
         </w:rPr>
         <w:t xml:space="preserve"> and CSS</w:t>
       </w:r>
-      <w:bookmarkEnd w:id="51"/>
+      <w:bookmarkEnd w:id="52"/>
     </w:p>
     <w:p>
       <w:pPr>
@@ -15383,7 +15635,7 @@
           <w:iCs/>
         </w:rPr>
       </w:pPr>
-      <w:bookmarkStart w:id="52" w:name="_Toc228752880"/>
+      <w:bookmarkStart w:id="53" w:name="_Toc228752880"/>
       <w:r>
         <w:rPr>
           <w:rFonts w:ascii="Arial" w:hAnsi="Arial" w:cs="Arial"/>
@@ -15394,7 +15646,7 @@
         </w:rPr>
         <w:t>Figma</w:t>
       </w:r>
-      <w:bookmarkEnd w:id="52"/>
+      <w:bookmarkEnd w:id="53"/>
     </w:p>
     <w:p>
       <w:pPr>
@@ -15422,7 +15674,7 @@
           <w:iCs/>
         </w:rPr>
       </w:pPr>
-      <w:bookmarkStart w:id="53" w:name="_Toc228752881"/>
+      <w:bookmarkStart w:id="54" w:name="_Toc228752881"/>
       <w:r>
         <w:rPr>
           <w:rFonts w:ascii="Arial" w:hAnsi="Arial" w:cs="Arial"/>
@@ -15433,7 +15685,7 @@
         </w:rPr>
         <w:t>Risk Score Calculation</w:t>
       </w:r>
-      <w:bookmarkEnd w:id="53"/>
+      <w:bookmarkEnd w:id="54"/>
     </w:p>
     <w:p>
       <w:pPr>
@@ -15758,7 +16010,7 @@
           <w:iCs/>
         </w:rPr>
       </w:pPr>
-      <w:bookmarkStart w:id="54" w:name="_Toc228752882"/>
+      <w:bookmarkStart w:id="55" w:name="_Toc228752882"/>
       <w:r>
         <w:rPr>
           <w:rFonts w:ascii="Arial" w:hAnsi="Arial" w:cs="Arial"/>
@@ -15769,7 +16021,7 @@
         </w:rPr>
         <w:t>HTTP Check</w:t>
       </w:r>
-      <w:bookmarkEnd w:id="54"/>
+      <w:bookmarkEnd w:id="55"/>
     </w:p>
     <w:p>
       <w:pPr>
@@ -16105,7 +16357,7 @@
           <w:iCs/>
         </w:rPr>
       </w:pPr>
-      <w:bookmarkStart w:id="55" w:name="_Toc228752883"/>
+      <w:bookmarkStart w:id="56" w:name="_Toc228752883"/>
       <w:r>
         <w:rPr>
           <w:rFonts w:ascii="Arial" w:hAnsi="Arial" w:cs="Arial"/>
@@ -16116,7 +16368,7 @@
         </w:rPr>
         <w:t>Domain Name Check</w:t>
       </w:r>
-      <w:bookmarkEnd w:id="55"/>
+      <w:bookmarkEnd w:id="56"/>
     </w:p>
     <w:p>
       <w:pPr>
@@ -17583,7 +17835,7 @@
           <w:iCs/>
         </w:rPr>
       </w:pPr>
-      <w:bookmarkStart w:id="56" w:name="_Toc228752884"/>
+      <w:bookmarkStart w:id="57" w:name="_Toc228752884"/>
       <w:r>
         <w:rPr>
           <w:rFonts w:ascii="Arial" w:hAnsi="Arial" w:cs="Arial"/>
@@ -17595,7 +17847,7 @@
         <w:lastRenderedPageBreak/>
         <w:t>Domain Age Check</w:t>
       </w:r>
-      <w:bookmarkEnd w:id="56"/>
+      <w:bookmarkEnd w:id="57"/>
     </w:p>
     <w:p>
       <w:pPr>
@@ -17873,7 +18125,7 @@
           <w:iCs/>
         </w:rPr>
       </w:pPr>
-      <w:bookmarkStart w:id="57" w:name="_Toc228752885"/>
+      <w:bookmarkStart w:id="58" w:name="_Toc228752885"/>
       <w:r>
         <w:rPr>
           <w:b/>
@@ -18120,7 +18372,7 @@
         </w:rPr>
         <w:t>Security Header Check</w:t>
       </w:r>
-      <w:bookmarkEnd w:id="57"/>
+      <w:bookmarkEnd w:id="58"/>
     </w:p>
     <w:p>
       <w:pPr>
@@ -19374,7 +19626,7 @@
           <w:iCs/>
         </w:rPr>
       </w:pPr>
-      <w:bookmarkStart w:id="58" w:name="_Toc228752886"/>
+      <w:bookmarkStart w:id="59" w:name="_Toc228752886"/>
       <w:r>
         <w:rPr>
           <w:rFonts w:ascii="Arial" w:hAnsi="Arial" w:cs="Arial"/>
@@ -19386,7 +19638,7 @@
         <w:lastRenderedPageBreak/>
         <w:t>Typosquatting Check</w:t>
       </w:r>
-      <w:bookmarkEnd w:id="58"/>
+      <w:bookmarkEnd w:id="59"/>
     </w:p>
     <w:p>
       <w:pPr>
@@ -20001,7 +20253,7 @@
           <w:szCs w:val="36"/>
         </w:rPr>
       </w:pPr>
-      <w:bookmarkStart w:id="59" w:name="_Toc228752887"/>
+      <w:bookmarkStart w:id="60" w:name="_Toc228752887"/>
       <w:r>
         <w:rPr>
           <w:rFonts w:ascii="Arial" w:hAnsi="Arial" w:cs="Arial"/>
@@ -20015,7 +20267,7 @@
         <w:lastRenderedPageBreak/>
         <w:t>Implementation</w:t>
       </w:r>
-      <w:bookmarkEnd w:id="59"/>
+      <w:bookmarkEnd w:id="60"/>
     </w:p>
     <w:p>
       <w:pPr>
@@ -20029,7 +20281,7 @@
           <w:iCs/>
         </w:rPr>
       </w:pPr>
-      <w:bookmarkStart w:id="60" w:name="_Toc228752888"/>
+      <w:bookmarkStart w:id="61" w:name="_Toc228752888"/>
       <w:r>
         <w:rPr>
           <w:rFonts w:ascii="Arial" w:hAnsi="Arial" w:cs="Arial"/>
@@ -20040,7 +20292,7 @@
         </w:rPr>
         <w:t>Features</w:t>
       </w:r>
-      <w:bookmarkEnd w:id="60"/>
+      <w:bookmarkEnd w:id="61"/>
     </w:p>
     <w:p>
       <w:pPr>
@@ -20098,7 +20350,7 @@
           <w:iCs/>
         </w:rPr>
       </w:pPr>
-      <w:bookmarkStart w:id="61" w:name="_Toc228752889"/>
+      <w:bookmarkStart w:id="62" w:name="_Toc228752889"/>
       <w:r>
         <w:rPr>
           <w:rFonts w:ascii="Arial" w:hAnsi="Arial" w:cs="Arial"/>
@@ -20109,7 +20361,7 @@
         </w:rPr>
         <w:t>Session Only Cookies</w:t>
       </w:r>
-      <w:bookmarkEnd w:id="61"/>
+      <w:bookmarkEnd w:id="62"/>
     </w:p>
     <w:p>
       <w:pPr>
@@ -20151,7 +20403,7 @@
           <w:iCs/>
         </w:rPr>
       </w:pPr>
-      <w:bookmarkStart w:id="62" w:name="_Toc228752890"/>
+      <w:bookmarkStart w:id="63" w:name="_Toc228752890"/>
       <w:r>
         <w:rPr>
           <w:rFonts w:ascii="Arial" w:hAnsi="Arial" w:cs="Arial"/>
@@ -20162,7 +20414,7 @@
         </w:rPr>
         <w:t>Cookie Export Authentication</w:t>
       </w:r>
-      <w:bookmarkEnd w:id="62"/>
+      <w:bookmarkEnd w:id="63"/>
     </w:p>
     <w:p>
       <w:pPr>
@@ -20204,7 +20456,7 @@
           <w:iCs/>
         </w:rPr>
       </w:pPr>
-      <w:bookmarkStart w:id="63" w:name="_Toc228752891"/>
+      <w:bookmarkStart w:id="64" w:name="_Toc228752891"/>
       <w:r>
         <w:rPr>
           <w:rFonts w:ascii="Arial" w:hAnsi="Arial" w:cs="Arial"/>
@@ -20216,7 +20468,7 @@
         <w:lastRenderedPageBreak/>
         <w:t>Blocking of Non-HTTPS Sites</w:t>
       </w:r>
-      <w:bookmarkEnd w:id="63"/>
+      <w:bookmarkEnd w:id="64"/>
     </w:p>
     <w:p>
       <w:pPr>
@@ -20258,7 +20510,7 @@
           <w:iCs/>
         </w:rPr>
       </w:pPr>
-      <w:bookmarkStart w:id="64" w:name="_Toc228752892"/>
+      <w:bookmarkStart w:id="65" w:name="_Toc228752892"/>
       <w:r>
         <w:rPr>
           <w:rFonts w:ascii="Arial" w:hAnsi="Arial" w:cs="Arial"/>
@@ -20269,7 +20521,7 @@
         </w:rPr>
         <w:t>Blocking Downloads</w:t>
       </w:r>
-      <w:bookmarkEnd w:id="64"/>
+      <w:bookmarkEnd w:id="65"/>
     </w:p>
     <w:p>
       <w:pPr>
@@ -20395,7 +20647,7 @@
           <w:iCs/>
         </w:rPr>
       </w:pPr>
-      <w:bookmarkStart w:id="65" w:name="_Toc228752893"/>
+      <w:bookmarkStart w:id="66" w:name="_Toc228752893"/>
       <w:r>
         <w:rPr>
           <w:rFonts w:ascii="Arial" w:hAnsi="Arial" w:cs="Arial"/>
@@ -20407,7 +20659,7 @@
         <w:lastRenderedPageBreak/>
         <w:t>TLS Certificate Checking</w:t>
       </w:r>
-      <w:bookmarkEnd w:id="65"/>
+      <w:bookmarkEnd w:id="66"/>
     </w:p>
     <w:p>
       <w:pPr>
@@ -20435,7 +20687,7 @@
           <w:iCs/>
         </w:rPr>
       </w:pPr>
-      <w:bookmarkStart w:id="66" w:name="_Toc228752894"/>
+      <w:bookmarkStart w:id="67" w:name="_Toc228752894"/>
       <w:r>
         <w:rPr>
           <w:rFonts w:ascii="Arial" w:hAnsi="Arial" w:cs="Arial"/>
@@ -20446,7 +20698,7 @@
         </w:rPr>
         <w:t>Security Based Hints</w:t>
       </w:r>
-      <w:bookmarkEnd w:id="66"/>
+      <w:bookmarkEnd w:id="67"/>
       <w:r>
         <w:rPr>
           <w:rFonts w:ascii="Arial" w:hAnsi="Arial" w:cs="Arial"/>
@@ -20496,7 +20748,7 @@
           <w:iCs/>
         </w:rPr>
       </w:pPr>
-      <w:bookmarkStart w:id="67" w:name="_Toc228752895"/>
+      <w:bookmarkStart w:id="68" w:name="_Toc228752895"/>
       <w:r>
         <w:rPr>
           <w:rFonts w:ascii="Arial" w:hAnsi="Arial" w:cs="Arial"/>
@@ -20507,7 +20759,7 @@
         </w:rPr>
         <w:t>Override Methods</w:t>
       </w:r>
-      <w:bookmarkEnd w:id="67"/>
+      <w:bookmarkEnd w:id="68"/>
     </w:p>
     <w:p>
       <w:pPr>
@@ -20549,7 +20801,7 @@
           <w:iCs/>
         </w:rPr>
       </w:pPr>
-      <w:bookmarkStart w:id="68" w:name="_Toc228752896"/>
+      <w:bookmarkStart w:id="69" w:name="_Toc228752896"/>
       <w:r>
         <w:rPr>
           <w:rFonts w:ascii="Arial" w:hAnsi="Arial" w:cs="Arial"/>
@@ -20561,7 +20813,7 @@
         <w:lastRenderedPageBreak/>
         <w:t>Quiz System</w:t>
       </w:r>
-      <w:bookmarkEnd w:id="68"/>
+      <w:bookmarkEnd w:id="69"/>
     </w:p>
     <w:p>
       <w:pPr>
@@ -20695,7 +20947,7 @@
           <w:iCs/>
         </w:rPr>
       </w:pPr>
-      <w:bookmarkStart w:id="69" w:name="_Toc228752897"/>
+      <w:bookmarkStart w:id="70" w:name="_Toc228752897"/>
       <w:r>
         <w:rPr>
           <w:rFonts w:ascii="Arial" w:hAnsi="Arial" w:cs="Arial"/>
@@ -20706,7 +20958,7 @@
         </w:rPr>
         <w:t>Guest Browsing</w:t>
       </w:r>
-      <w:bookmarkEnd w:id="69"/>
+      <w:bookmarkEnd w:id="70"/>
     </w:p>
     <w:p>
       <w:pPr>
@@ -20735,7 +20987,7 @@
           <w:highlight w:val="red"/>
         </w:rPr>
       </w:pPr>
-      <w:bookmarkStart w:id="70" w:name="_Toc228752898"/>
+      <w:bookmarkStart w:id="71" w:name="_Toc228752898"/>
       <w:r>
         <w:rPr>
           <w:rFonts w:ascii="Arial" w:hAnsi="Arial" w:cs="Arial"/>
@@ -20747,7 +20999,7 @@
         </w:rPr>
         <w:t>Security Dashboard</w:t>
       </w:r>
-      <w:bookmarkEnd w:id="70"/>
+      <w:bookmarkEnd w:id="71"/>
     </w:p>
     <w:p>
       <w:pPr>
@@ -20799,7 +21051,7 @@
           <w:highlight w:val="red"/>
         </w:rPr>
       </w:pPr>
-      <w:bookmarkStart w:id="71" w:name="_Toc228752899"/>
+      <w:bookmarkStart w:id="72" w:name="_Toc228752899"/>
       <w:r>
         <w:rPr>
           <w:rFonts w:ascii="Arial" w:hAnsi="Arial" w:cs="Arial"/>
@@ -20812,7 +21064,7 @@
         <w:lastRenderedPageBreak/>
         <w:t>Gamification</w:t>
       </w:r>
-      <w:bookmarkEnd w:id="71"/>
+      <w:bookmarkEnd w:id="72"/>
     </w:p>
     <w:p>
       <w:pPr>
@@ -20848,7 +21100,7 @@
           <w:highlight w:val="red"/>
         </w:rPr>
       </w:pPr>
-      <w:bookmarkStart w:id="72" w:name="_Toc228752900"/>
+      <w:bookmarkStart w:id="73" w:name="_Toc228752900"/>
       <w:r>
         <w:rPr>
           <w:rFonts w:ascii="Arial" w:hAnsi="Arial" w:cs="Arial"/>
@@ -20860,7 +21112,7 @@
         </w:rPr>
         <w:t>Firebase</w:t>
       </w:r>
-      <w:bookmarkEnd w:id="72"/>
+      <w:bookmarkEnd w:id="73"/>
     </w:p>
     <w:p>
       <w:pPr>
@@ -20916,7 +21168,7 @@
           <w:rFonts w:ascii="Arial" w:hAnsi="Arial" w:cs="Arial"/>
         </w:rPr>
       </w:pPr>
-      <w:bookmarkStart w:id="73" w:name="OLE_LINK1"/>
+      <w:bookmarkStart w:id="74" w:name="OLE_LINK1"/>
       <w:r>
         <w:rPr>
           <w:rFonts w:ascii="Arial" w:hAnsi="Arial" w:cs="Arial"/>
@@ -21491,7 +21743,7 @@
         </w:rPr>
         <w:t>Challenges</w:t>
       </w:r>
-      <w:bookmarkEnd w:id="73"/>
+      <w:bookmarkEnd w:id="74"/>
       <w:r>
         <w:rPr>
           <w:rFonts w:ascii="Arial" w:hAnsi="Arial" w:cs="Arial"/>
@@ -21702,7 +21954,7 @@
           <w:szCs w:val="36"/>
         </w:rPr>
       </w:pPr>
-      <w:bookmarkStart w:id="74" w:name="_Toc228752901"/>
+      <w:bookmarkStart w:id="75" w:name="_Toc228752901"/>
       <w:r>
         <w:rPr>
           <w:rFonts w:ascii="Arial" w:hAnsi="Arial" w:cs="Arial"/>
@@ -21715,7 +21967,7 @@
         </w:rPr>
         <w:t>LSEP Considerations</w:t>
       </w:r>
-      <w:bookmarkEnd w:id="74"/>
+      <w:bookmarkEnd w:id="75"/>
     </w:p>
     <w:p>
       <w:pPr>
@@ -21785,7 +22037,7 @@
           <w:iCs/>
         </w:rPr>
       </w:pPr>
-      <w:bookmarkStart w:id="75" w:name="_Toc228752902"/>
+      <w:bookmarkStart w:id="76" w:name="_Toc228752902"/>
       <w:r>
         <w:rPr>
           <w:rFonts w:ascii="Arial" w:hAnsi="Arial" w:cs="Arial"/>
@@ -21796,7 +22048,7 @@
         </w:rPr>
         <w:t>Legal Issues</w:t>
       </w:r>
-      <w:bookmarkEnd w:id="75"/>
+      <w:bookmarkEnd w:id="76"/>
     </w:p>
     <w:p>
       <w:pPr>
@@ -21892,7 +22144,7 @@
           <w:iCs/>
         </w:rPr>
       </w:pPr>
-      <w:bookmarkStart w:id="76" w:name="_Toc228752903"/>
+      <w:bookmarkStart w:id="77" w:name="_Toc228752903"/>
       <w:r>
         <w:rPr>
           <w:rFonts w:ascii="Arial" w:hAnsi="Arial" w:cs="Arial"/>
@@ -21903,7 +22155,7 @@
         </w:rPr>
         <w:t>Social Issues</w:t>
       </w:r>
-      <w:bookmarkEnd w:id="76"/>
+      <w:bookmarkEnd w:id="77"/>
     </w:p>
     <w:p>
       <w:pPr>
@@ -22030,7 +22282,7 @@
           <w:iCs/>
         </w:rPr>
       </w:pPr>
-      <w:bookmarkStart w:id="77" w:name="_Toc228752904"/>
+      <w:bookmarkStart w:id="78" w:name="_Toc228752904"/>
       <w:r>
         <w:rPr>
           <w:rFonts w:ascii="Arial" w:hAnsi="Arial" w:cs="Arial"/>
@@ -22041,7 +22293,7 @@
         </w:rPr>
         <w:t>Ethical Issues</w:t>
       </w:r>
-      <w:bookmarkEnd w:id="77"/>
+      <w:bookmarkEnd w:id="78"/>
     </w:p>
     <w:p>
       <w:pPr>
@@ -22083,7 +22335,7 @@
           <w:iCs/>
         </w:rPr>
       </w:pPr>
-      <w:bookmarkStart w:id="78" w:name="_Toc228752905"/>
+      <w:bookmarkStart w:id="79" w:name="_Toc228752905"/>
       <w:r>
         <w:rPr>
           <w:rFonts w:ascii="Arial" w:hAnsi="Arial" w:cs="Arial"/>
@@ -22094,7 +22346,7 @@
         </w:rPr>
         <w:t>Professional Issues</w:t>
       </w:r>
-      <w:bookmarkEnd w:id="78"/>
+      <w:bookmarkEnd w:id="79"/>
     </w:p>
     <w:p>
       <w:pPr>
@@ -22143,7 +22395,7 @@
           <w:szCs w:val="36"/>
         </w:rPr>
       </w:pPr>
-      <w:bookmarkStart w:id="79" w:name="_Toc228752906"/>
+      <w:bookmarkStart w:id="80" w:name="_Toc228752906"/>
       <w:r>
         <w:rPr>
           <w:rFonts w:ascii="Arial" w:hAnsi="Arial" w:cs="Arial"/>
@@ -22156,7 +22408,7 @@
         </w:rPr>
         <w:t>Project Management</w:t>
       </w:r>
-      <w:bookmarkEnd w:id="79"/>
+      <w:bookmarkEnd w:id="80"/>
     </w:p>
     <w:p>
       <w:pPr>
@@ -22171,7 +22423,7 @@
           <w:highlight w:val="red"/>
         </w:rPr>
       </w:pPr>
-      <w:bookmarkStart w:id="80" w:name="_Toc228752907"/>
+      <w:bookmarkStart w:id="81" w:name="_Toc228752907"/>
       <w:r>
         <w:rPr>
           <w:rFonts w:ascii="Arial" w:hAnsi="Arial" w:cs="Arial"/>
@@ -22183,7 +22435,7 @@
         </w:rPr>
         <w:t>Sprints</w:t>
       </w:r>
-      <w:bookmarkEnd w:id="80"/>
+      <w:bookmarkEnd w:id="81"/>
     </w:p>
     <w:p>
       <w:pPr>
@@ -22211,7 +22463,7 @@
           <w:iCs/>
         </w:rPr>
       </w:pPr>
-      <w:bookmarkStart w:id="81" w:name="_Toc228752908"/>
+      <w:bookmarkStart w:id="82" w:name="_Toc228752908"/>
       <w:r>
         <w:rPr>
           <w:rFonts w:ascii="Arial" w:hAnsi="Arial" w:cs="Arial"/>
@@ -22222,7 +22474,7 @@
         </w:rPr>
         <w:t>Sprint 1</w:t>
       </w:r>
-      <w:bookmarkEnd w:id="81"/>
+      <w:bookmarkEnd w:id="82"/>
     </w:p>
     <w:p>
       <w:pPr>
@@ -22256,7 +22508,7 @@
           <w:iCs/>
         </w:rPr>
       </w:pPr>
-      <w:bookmarkStart w:id="82" w:name="_Toc228752909"/>
+      <w:bookmarkStart w:id="83" w:name="_Toc228752909"/>
       <w:r>
         <w:rPr>
           <w:rFonts w:ascii="Arial" w:hAnsi="Arial" w:cs="Arial"/>
@@ -22267,7 +22519,7 @@
         </w:rPr>
         <w:t>Sprint 2</w:t>
       </w:r>
-      <w:bookmarkEnd w:id="82"/>
+      <w:bookmarkEnd w:id="83"/>
     </w:p>
     <w:p>
       <w:pPr>
@@ -22289,7 +22541,7 @@
           <w:iCs/>
         </w:rPr>
       </w:pPr>
-      <w:bookmarkStart w:id="83" w:name="_Toc228752910"/>
+      <w:bookmarkStart w:id="84" w:name="_Toc228752910"/>
       <w:r>
         <w:rPr>
           <w:rFonts w:ascii="Arial" w:hAnsi="Arial" w:cs="Arial"/>
@@ -22300,7 +22552,7 @@
         </w:rPr>
         <w:t>Sprint 3</w:t>
       </w:r>
-      <w:bookmarkEnd w:id="83"/>
+      <w:bookmarkEnd w:id="84"/>
     </w:p>
     <w:p>
       <w:pPr>
@@ -22322,7 +22574,7 @@
           <w:iCs/>
         </w:rPr>
       </w:pPr>
-      <w:bookmarkStart w:id="84" w:name="_Toc228752911"/>
+      <w:bookmarkStart w:id="85" w:name="_Toc228752911"/>
       <w:r>
         <w:rPr>
           <w:rFonts w:ascii="Arial" w:hAnsi="Arial" w:cs="Arial"/>
@@ -22343,7 +22595,7 @@
         </w:rPr>
         <w:t>print 4</w:t>
       </w:r>
-      <w:bookmarkEnd w:id="84"/>
+      <w:bookmarkEnd w:id="85"/>
     </w:p>
     <w:p>
       <w:pPr>
@@ -22365,7 +22617,7 @@
           <w:iCs/>
         </w:rPr>
       </w:pPr>
-      <w:bookmarkStart w:id="85" w:name="_Toc228752912"/>
+      <w:bookmarkStart w:id="86" w:name="_Toc228752912"/>
       <w:r>
         <w:rPr>
           <w:rFonts w:ascii="Arial" w:hAnsi="Arial" w:cs="Arial"/>
@@ -22376,7 +22628,7 @@
         </w:rPr>
         <w:t>Sprint 5</w:t>
       </w:r>
-      <w:bookmarkEnd w:id="85"/>
+      <w:bookmarkEnd w:id="86"/>
     </w:p>
     <w:p>
       <w:pPr>
@@ -22398,7 +22650,7 @@
           <w:iCs/>
         </w:rPr>
       </w:pPr>
-      <w:bookmarkStart w:id="86" w:name="_Toc228752913"/>
+      <w:bookmarkStart w:id="87" w:name="_Toc228752913"/>
       <w:r>
         <w:rPr>
           <w:rFonts w:ascii="Arial" w:hAnsi="Arial" w:cs="Arial"/>
@@ -22409,7 +22661,7 @@
         </w:rPr>
         <w:t>Sprint 6</w:t>
       </w:r>
-      <w:bookmarkEnd w:id="86"/>
+      <w:bookmarkEnd w:id="87"/>
     </w:p>
     <w:p>
       <w:pPr>
@@ -22431,7 +22683,7 @@
           <w:iCs/>
         </w:rPr>
       </w:pPr>
-      <w:bookmarkStart w:id="87" w:name="_Toc228752914"/>
+      <w:bookmarkStart w:id="88" w:name="_Toc228752914"/>
       <w:r>
         <w:rPr>
           <w:rFonts w:ascii="Arial" w:hAnsi="Arial" w:cs="Arial"/>
@@ -22443,7 +22695,7 @@
         <w:lastRenderedPageBreak/>
         <w:t>Sprint 7</w:t>
       </w:r>
-      <w:bookmarkEnd w:id="87"/>
+      <w:bookmarkEnd w:id="88"/>
     </w:p>
     <w:p/>
     <w:p>
@@ -22458,7 +22710,7 @@
           <w:iCs/>
         </w:rPr>
       </w:pPr>
-      <w:bookmarkStart w:id="88" w:name="_Toc228752915"/>
+      <w:bookmarkStart w:id="89" w:name="_Toc228752915"/>
       <w:r>
         <w:rPr>
           <w:rFonts w:ascii="Arial" w:hAnsi="Arial" w:cs="Arial"/>
@@ -22469,7 +22721,7 @@
         </w:rPr>
         <w:t>Trello</w:t>
       </w:r>
-      <w:bookmarkEnd w:id="88"/>
+      <w:bookmarkEnd w:id="89"/>
     </w:p>
     <w:p>
       <w:pPr>
@@ -22521,7 +22773,7 @@
           <w:iCs/>
         </w:rPr>
       </w:pPr>
-      <w:bookmarkStart w:id="89" w:name="_Toc228752916"/>
+      <w:bookmarkStart w:id="90" w:name="_Toc228752916"/>
       <w:r>
         <w:rPr>
           <w:rFonts w:ascii="Arial" w:hAnsi="Arial" w:cs="Arial"/>
@@ -22532,7 +22784,7 @@
         </w:rPr>
         <w:t>GitHub Desktop</w:t>
       </w:r>
-      <w:bookmarkEnd w:id="89"/>
+      <w:bookmarkEnd w:id="90"/>
     </w:p>
     <w:p>
       <w:pPr>
@@ -22582,7 +22834,7 @@
           <w:szCs w:val="36"/>
         </w:rPr>
       </w:pPr>
-      <w:bookmarkStart w:id="90" w:name="_Toc228752917"/>
+      <w:bookmarkStart w:id="91" w:name="_Toc228752917"/>
       <w:r>
         <w:rPr>
           <w:rFonts w:ascii="Arial" w:hAnsi="Arial" w:cs="Arial"/>
@@ -22607,7 +22859,7 @@
         </w:rPr>
         <w:t xml:space="preserve"> and Evaluation</w:t>
       </w:r>
-      <w:bookmarkEnd w:id="90"/>
+      <w:bookmarkEnd w:id="91"/>
     </w:p>
     <w:p>
       <w:pPr>
@@ -22713,7 +22965,7 @@
           <w:highlight w:val="red"/>
         </w:rPr>
       </w:pPr>
-      <w:bookmarkStart w:id="91" w:name="_Toc228752918"/>
+      <w:bookmarkStart w:id="92" w:name="_Toc228752918"/>
       <w:r>
         <w:rPr>
           <w:rFonts w:ascii="Arial" w:hAnsi="Arial" w:cs="Arial"/>
@@ -22725,7 +22977,7 @@
         </w:rPr>
         <w:t>Testing Methodology</w:t>
       </w:r>
-      <w:bookmarkEnd w:id="91"/>
+      <w:bookmarkEnd w:id="92"/>
     </w:p>
     <w:p>
       <w:pPr>
@@ -22747,7 +22999,7 @@
           <w:iCs/>
         </w:rPr>
       </w:pPr>
-      <w:bookmarkStart w:id="92" w:name="_Toc228752919"/>
+      <w:bookmarkStart w:id="93" w:name="_Toc228752919"/>
       <w:r>
         <w:rPr>
           <w:rFonts w:ascii="Arial" w:hAnsi="Arial" w:cs="Arial"/>
@@ -22758,7 +23010,7 @@
         </w:rPr>
         <w:t>Functional Testing</w:t>
       </w:r>
-      <w:bookmarkEnd w:id="92"/>
+      <w:bookmarkEnd w:id="93"/>
     </w:p>
     <w:p>
       <w:pPr>
@@ -24193,7 +24445,7 @@
           <w:highlight w:val="red"/>
         </w:rPr>
       </w:pPr>
-      <w:bookmarkStart w:id="93" w:name="_Toc228752920"/>
+      <w:bookmarkStart w:id="94" w:name="_Toc228752920"/>
       <w:r>
         <w:rPr>
           <w:rFonts w:ascii="Arial" w:hAnsi="Arial" w:cs="Arial"/>
@@ -24205,7 +24457,7 @@
         </w:rPr>
         <w:t>User Testing</w:t>
       </w:r>
-      <w:bookmarkEnd w:id="93"/>
+      <w:bookmarkEnd w:id="94"/>
     </w:p>
     <w:p>
       <w:pPr>
@@ -24228,7 +24480,7 @@
           <w:highlight w:val="red"/>
         </w:rPr>
       </w:pPr>
-      <w:bookmarkStart w:id="94" w:name="_Toc228752921"/>
+      <w:bookmarkStart w:id="95" w:name="_Toc228752921"/>
       <w:r>
         <w:rPr>
           <w:rFonts w:ascii="Arial" w:hAnsi="Arial" w:cs="Arial"/>
@@ -24240,7 +24492,7 @@
         </w:rPr>
         <w:t>Evaluation</w:t>
       </w:r>
-      <w:bookmarkEnd w:id="94"/>
+      <w:bookmarkEnd w:id="95"/>
     </w:p>
     <w:p>
       <w:pPr>
@@ -24264,7 +24516,7 @@
           <w:szCs w:val="36"/>
         </w:rPr>
       </w:pPr>
-      <w:bookmarkStart w:id="95" w:name="_Toc228752922"/>
+      <w:bookmarkStart w:id="96" w:name="_Toc228752922"/>
       <w:r>
         <w:rPr>
           <w:rFonts w:ascii="Arial" w:hAnsi="Arial" w:cs="Arial"/>
@@ -24278,7 +24530,7 @@
         <w:lastRenderedPageBreak/>
         <w:t>Future Implementations</w:t>
       </w:r>
-      <w:bookmarkEnd w:id="95"/>
+      <w:bookmarkEnd w:id="96"/>
     </w:p>
     <w:p>
       <w:pPr>
@@ -24292,7 +24544,7 @@
           <w:iCs/>
         </w:rPr>
       </w:pPr>
-      <w:bookmarkStart w:id="96" w:name="_Toc228752923"/>
+      <w:bookmarkStart w:id="97" w:name="_Toc228752923"/>
       <w:r>
         <w:rPr>
           <w:rFonts w:ascii="Arial" w:hAnsi="Arial" w:cs="Arial"/>
@@ -24303,7 +24555,7 @@
         </w:rPr>
         <w:t>DNS Check</w:t>
       </w:r>
-      <w:bookmarkEnd w:id="96"/>
+      <w:bookmarkEnd w:id="97"/>
     </w:p>
     <w:p>
       <w:pPr>
@@ -24343,7 +24595,7 @@
           <w:iCs/>
         </w:rPr>
       </w:pPr>
-      <w:bookmarkStart w:id="97" w:name="_Toc228752924"/>
+      <w:bookmarkStart w:id="98" w:name="_Toc228752924"/>
       <w:r>
         <w:rPr>
           <w:rFonts w:ascii="Arial" w:hAnsi="Arial" w:cs="Arial"/>
@@ -24354,7 +24606,7 @@
         </w:rPr>
         <w:t>Redirect Analysis</w:t>
       </w:r>
-      <w:bookmarkEnd w:id="97"/>
+      <w:bookmarkEnd w:id="98"/>
     </w:p>
     <w:p>
       <w:pPr>
@@ -24384,7 +24636,7 @@
           <w:szCs w:val="24"/>
         </w:rPr>
       </w:pPr>
-      <w:bookmarkStart w:id="98" w:name="_Toc228752925"/>
+      <w:bookmarkStart w:id="99" w:name="_Toc228752925"/>
       <w:r>
         <w:rPr>
           <w:rFonts w:ascii="Arial" w:hAnsi="Arial" w:cs="Arial"/>
@@ -24397,7 +24649,7 @@
         </w:rPr>
         <w:t>Parental Controls</w:t>
       </w:r>
-      <w:bookmarkEnd w:id="98"/>
+      <w:bookmarkEnd w:id="99"/>
     </w:p>
     <w:p>
       <w:pPr>
@@ -24456,7 +24708,7 @@
           <w:szCs w:val="24"/>
         </w:rPr>
       </w:pPr>
-      <w:bookmarkStart w:id="99" w:name="_Toc228752926"/>
+      <w:bookmarkStart w:id="100" w:name="_Toc228752926"/>
       <w:r>
         <w:rPr>
           <w:rFonts w:ascii="Arial" w:hAnsi="Arial" w:cs="Arial"/>
@@ -24469,7 +24721,7 @@
         </w:rPr>
         <w:t>AI Chatbot</w:t>
       </w:r>
-      <w:bookmarkEnd w:id="99"/>
+      <w:bookmarkEnd w:id="100"/>
     </w:p>
     <w:p>
       <w:pPr>
@@ -24517,7 +24769,7 @@
           <w:szCs w:val="24"/>
         </w:rPr>
       </w:pPr>
-      <w:bookmarkStart w:id="100" w:name="_Toc228752927"/>
+      <w:bookmarkStart w:id="101" w:name="_Toc228752927"/>
       <w:r>
         <w:rPr>
           <w:rFonts w:ascii="Arial" w:hAnsi="Arial" w:cs="Arial"/>
@@ -24530,7 +24782,7 @@
         </w:rPr>
         <w:t>Built-in VPN</w:t>
       </w:r>
-      <w:bookmarkEnd w:id="100"/>
+      <w:bookmarkEnd w:id="101"/>
     </w:p>
     <w:p>
       <w:pPr>
@@ -24572,7 +24824,7 @@
         </w:rPr>
         <w:t xml:space="preserve"> </w:t>
       </w:r>
-      <w:bookmarkStart w:id="101" w:name="_Toc228752928"/>
+      <w:bookmarkStart w:id="102" w:name="_Toc228752928"/>
       <w:r>
         <w:rPr>
           <w:rFonts w:ascii="Arial" w:hAnsi="Arial" w:cs="Arial"/>
@@ -24585,7 +24837,7 @@
         </w:rPr>
         <w:t>Conclusion</w:t>
       </w:r>
-      <w:bookmarkEnd w:id="101"/>
+      <w:bookmarkEnd w:id="102"/>
     </w:p>
     <w:p>
       <w:pPr>
@@ -24621,7 +24873,7 @@
         </w:rPr>
         <w:t xml:space="preserve"> </w:t>
       </w:r>
-      <w:bookmarkStart w:id="102" w:name="_Toc228752929"/>
+      <w:bookmarkStart w:id="103" w:name="_Toc228752929"/>
       <w:r>
         <w:rPr>
           <w:rFonts w:ascii="Arial" w:hAnsi="Arial" w:cs="Arial"/>
@@ -24634,7 +24886,7 @@
         </w:rPr>
         <w:t>References</w:t>
       </w:r>
-      <w:bookmarkEnd w:id="102"/>
+      <w:bookmarkEnd w:id="103"/>
     </w:p>
     <w:p>
       <w:pPr>
@@ -25216,7 +25468,7 @@
         </w:rPr>
         <w:t xml:space="preserve"> </w:t>
       </w:r>
-      <w:bookmarkStart w:id="103" w:name="_Toc228752930"/>
+      <w:bookmarkStart w:id="104" w:name="_Toc228752930"/>
       <w:r>
         <w:rPr>
           <w:rFonts w:ascii="Arial" w:hAnsi="Arial" w:cs="Arial"/>
@@ -25229,7 +25481,7 @@
         </w:rPr>
         <w:t>Appendices</w:t>
       </w:r>
-      <w:bookmarkEnd w:id="103"/>
+      <w:bookmarkEnd w:id="104"/>
     </w:p>
     <w:p>
       <w:pPr>
@@ -25243,7 +25495,7 @@
           <w:iCs/>
         </w:rPr>
       </w:pPr>
-      <w:bookmarkStart w:id="104" w:name="_Toc228752931"/>
+      <w:bookmarkStart w:id="105" w:name="_Toc228752931"/>
       <w:r>
         <w:rPr>
           <w:rFonts w:ascii="Arial" w:hAnsi="Arial" w:cs="Arial"/>
@@ -25254,7 +25506,7 @@
         </w:rPr>
         <w:t>Appendix A – Design Screenshots</w:t>
       </w:r>
-      <w:bookmarkEnd w:id="104"/>
+      <w:bookmarkEnd w:id="105"/>
     </w:p>
     <w:p>
       <w:pPr>
@@ -25493,7 +25745,7 @@
   <w:abstractNum w:abstractNumId="0" w15:restartNumberingAfterBreak="0">
     <w:nsid w:val="FFFFFF89"/>
     <w:multiLevelType w:val="singleLevel"/>
-    <w:tmpl w:val="C0644088"/>
+    <w:tmpl w:val="130CF82C"/>
     <w:lvl w:ilvl="0">
       <w:start w:val="1"/>
       <w:numFmt w:val="bullet"/>

</xml_diff>